<commit_message>
7:57pm work doc thing. nothing else
</commit_message>
<xml_diff>
--- a/L3 Web Application Development Log.docx
+++ b/L3 Web Application Development Log.docx
@@ -181,7 +181,7 @@
               <w:spacing w:line="240" w:lineRule="auto"/>
             </w:pPr>
             <w:r>
-              <w:t>Games website</w:t>
+              <w:t>Game website</w:t>
             </w:r>
           </w:p>
         </w:tc>
@@ -264,37 +264,19 @@
             <w:r>
               <w:t xml:space="preserve"> </w:t>
             </w:r>
+            <w:r>
+              <w:t>making</w:t>
+            </w:r>
+            <w:r>
+              <w:t xml:space="preserve"> is about having pages of different type of games from different </w:t>
+            </w:r>
             <w:proofErr w:type="spellStart"/>
             <w:r>
-              <w:t>makinh</w:t>
+              <w:t>gerences</w:t>
             </w:r>
             <w:proofErr w:type="spellEnd"/>
             <w:r>
-              <w:t xml:space="preserve"> is about having pages of different </w:t>
-            </w:r>
-            <w:proofErr w:type="gramStart"/>
-            <w:r>
-              <w:t>type</w:t>
-            </w:r>
-            <w:proofErr w:type="gramEnd"/>
-            <w:r>
-              <w:t xml:space="preserve"> of games from different </w:t>
-            </w:r>
-            <w:proofErr w:type="spellStart"/>
-            <w:r>
-              <w:t>gerences</w:t>
-            </w:r>
-            <w:proofErr w:type="spellEnd"/>
-            <w:r>
-              <w:t xml:space="preserve"> to help people find and show </w:t>
-            </w:r>
-            <w:proofErr w:type="gramStart"/>
-            <w:r>
-              <w:t>games they</w:t>
-            </w:r>
-            <w:proofErr w:type="gramEnd"/>
-            <w:r>
-              <w:t xml:space="preserve"> </w:t>
+              <w:t xml:space="preserve"> to help people find and show games they </w:t>
             </w:r>
             <w:proofErr w:type="spellStart"/>
             <w:r>
@@ -372,31 +354,10 @@
             <w:proofErr w:type="spellEnd"/>
             <w:proofErr w:type="gramEnd"/>
             <w:r>
-              <w:t xml:space="preserve"> feel like this website will be ball. (</w:t>
-            </w:r>
-            <w:proofErr w:type="spellStart"/>
-            <w:r>
-              <w:t>dw</w:t>
-            </w:r>
-            <w:proofErr w:type="spellEnd"/>
-            <w:r>
-              <w:t xml:space="preserve">, </w:t>
-            </w:r>
-            <w:proofErr w:type="spellStart"/>
-            <w:r>
-              <w:t>i</w:t>
-            </w:r>
-            <w:proofErr w:type="spellEnd"/>
-            <w:r>
-              <w:t xml:space="preserve"> </w:t>
-            </w:r>
-            <w:proofErr w:type="spellStart"/>
-            <w:r>
-              <w:t>chnaging</w:t>
-            </w:r>
-            <w:proofErr w:type="spellEnd"/>
-            <w:r>
-              <w:t xml:space="preserve"> this)</w:t>
+              <w:t xml:space="preserve"> feel like this website will </w:t>
+            </w:r>
+            <w:r>
+              <w:t>be help for people who want to start playing games or looking for new games to play.</w:t>
             </w:r>
           </w:p>
           <w:p>
@@ -1216,16 +1177,6 @@
               <w:widowControl w:val="0"/>
               <w:spacing w:line="240" w:lineRule="auto"/>
             </w:pPr>
-            <w:r>
-              <w:t xml:space="preserve">-  </w:t>
-            </w:r>
-          </w:p>
-          <w:p>
-            <w:pPr>
-              <w:pStyle w:val="normal1"/>
-              <w:widowControl w:val="0"/>
-              <w:spacing w:line="240" w:lineRule="auto"/>
-            </w:pPr>
           </w:p>
         </w:tc>
       </w:tr>
@@ -2189,15 +2140,87 @@
             <w:r>
               <w:t>The only thing I did was the navbar and having another page up. Nothing else</w:t>
             </w:r>
-          </w:p>
-          <w:p>
-            <w:pPr>
-              <w:pStyle w:val="normal1"/>
-              <w:widowControl w:val="0"/>
-              <w:spacing w:line="240" w:lineRule="auto"/>
-            </w:pPr>
-            <w:r>
-              <w:t>For other things, I think yeah….</w:t>
+            <w:r>
+              <w:t xml:space="preserve"> for </w:t>
+            </w:r>
+            <w:r>
+              <w:t>other things</w:t>
+            </w:r>
+            <w:r>
+              <w:t>.</w:t>
+            </w:r>
+          </w:p>
+          <w:p>
+            <w:pPr>
+              <w:pStyle w:val="normal1"/>
+              <w:widowControl w:val="0"/>
+              <w:spacing w:line="240" w:lineRule="auto"/>
+            </w:pPr>
+          </w:p>
+          <w:p>
+            <w:pPr>
+              <w:pStyle w:val="normal1"/>
+              <w:widowControl w:val="0"/>
+              <w:spacing w:line="240" w:lineRule="auto"/>
+            </w:pPr>
+            <w:r>
+              <w:t xml:space="preserve">I think </w:t>
+            </w:r>
+            <w:proofErr w:type="gramStart"/>
+            <w:r>
+              <w:t>unable</w:t>
+            </w:r>
+            <w:proofErr w:type="gramEnd"/>
+            <w:r>
+              <w:t xml:space="preserve"> to work on my website is because of my old laptop </w:t>
+            </w:r>
+            <w:proofErr w:type="gramStart"/>
+            <w:r>
+              <w:t>made</w:t>
+            </w:r>
+            <w:proofErr w:type="gramEnd"/>
+            <w:r>
+              <w:t xml:space="preserve"> it unusable to get work on in this class (and others too), and it being </w:t>
+            </w:r>
+            <w:proofErr w:type="gramStart"/>
+            <w:r>
+              <w:t>an</w:t>
+            </w:r>
+            <w:proofErr w:type="gramEnd"/>
+            <w:r>
+              <w:t xml:space="preserve"> </w:t>
+            </w:r>
+            <w:proofErr w:type="gramStart"/>
+            <w:r>
+              <w:t>hassled</w:t>
+            </w:r>
+            <w:proofErr w:type="gramEnd"/>
+            <w:r>
+              <w:t xml:space="preserve"> to </w:t>
+            </w:r>
+            <w:proofErr w:type="gramStart"/>
+            <w:r>
+              <w:t>trying</w:t>
+            </w:r>
+            <w:proofErr w:type="gramEnd"/>
+            <w:r>
+              <w:t xml:space="preserve"> to </w:t>
+            </w:r>
+            <w:proofErr w:type="gramStart"/>
+            <w:r>
+              <w:t>figure it</w:t>
+            </w:r>
+            <w:proofErr w:type="gramEnd"/>
+            <w:r>
+              <w:t xml:space="preserve"> out how to use it. I only got the nav bar to work, but it kind of sucks and looks bad. I was also unable to write and </w:t>
+            </w:r>
+            <w:proofErr w:type="spellStart"/>
+            <w:r>
+              <w:t>docamtion</w:t>
+            </w:r>
+            <w:proofErr w:type="spellEnd"/>
+            <w:r>
+              <w:t xml:space="preserve"> my work (or lack on it) on here because it was slow and I had nothing to show.</w:t>
             </w:r>
           </w:p>
           <w:p>
@@ -2371,8 +2394,53 @@
             <w:pPr>
               <w:pStyle w:val="normal1"/>
               <w:widowControl w:val="0"/>
-              <w:spacing w:line="240" w:lineRule="auto"/>
-            </w:pPr>
+              <w:numPr>
+                <w:ilvl w:val="0"/>
+                <w:numId w:val="4"/>
+              </w:numPr>
+              <w:spacing w:line="240" w:lineRule="auto"/>
+            </w:pPr>
+            <w:r>
+              <w:t xml:space="preserve">At least have </w:t>
+            </w:r>
+            <w:proofErr w:type="spellStart"/>
+            <w:r>
+              <w:t>have</w:t>
+            </w:r>
+            <w:proofErr w:type="spellEnd"/>
+            <w:r>
+              <w:t xml:space="preserve"> something different than before.</w:t>
+            </w:r>
+          </w:p>
+          <w:p>
+            <w:pPr>
+              <w:pStyle w:val="normal1"/>
+              <w:widowControl w:val="0"/>
+              <w:numPr>
+                <w:ilvl w:val="0"/>
+                <w:numId w:val="4"/>
+              </w:numPr>
+              <w:spacing w:line="240" w:lineRule="auto"/>
+            </w:pPr>
+            <w:r>
+              <w:t xml:space="preserve">An </w:t>
+            </w:r>
+            <w:proofErr w:type="spellStart"/>
+            <w:r>
+              <w:t>funcatily</w:t>
+            </w:r>
+            <w:proofErr w:type="spellEnd"/>
+            <w:r>
+              <w:t xml:space="preserve"> Navbar and text box </w:t>
+            </w:r>
+            <w:proofErr w:type="spellStart"/>
+            <w:r>
+              <w:t>imput</w:t>
+            </w:r>
+            <w:proofErr w:type="spellEnd"/>
+            <w:r>
+              <w:t xml:space="preserve"> thing for users to type in for stuff.</w:t>
+            </w:r>
           </w:p>
           <w:p>
             <w:pPr>
@@ -3261,21 +3329,7 @@
               <w:rPr>
                 <w:rFonts w:ascii="Calibri" w:eastAsia="Calibri" w:hAnsi="Calibri" w:cs="Calibri"/>
               </w:rPr>
-              <w:t xml:space="preserve"> </w:t>
-            </w:r>
-            <w:proofErr w:type="spellStart"/>
-            <w:r>
-              <w:rPr>
-                <w:rFonts w:ascii="Calibri" w:eastAsia="Calibri" w:hAnsi="Calibri" w:cs="Calibri"/>
-              </w:rPr>
-              <w:t>anpther</w:t>
-            </w:r>
-            <w:proofErr w:type="spellEnd"/>
-            <w:r>
-              <w:rPr>
-                <w:rFonts w:ascii="Calibri" w:eastAsia="Calibri" w:hAnsi="Calibri" w:cs="Calibri"/>
-              </w:rPr>
-              <w:t xml:space="preserve"> page</w:t>
+              <w:t xml:space="preserve"> anpther page</w:t>
             </w:r>
           </w:p>
         </w:tc>
@@ -10514,6 +10568,118 @@
 <file path=word/numbering.xml><?xml version="1.0" encoding="utf-8"?>
 <w:numbering xmlns:wpc="http://schemas.microsoft.com/office/word/2010/wordprocessingCanvas" xmlns:cx="http://schemas.microsoft.com/office/drawing/2014/chartex" xmlns:cx1="http://schemas.microsoft.com/office/drawing/2015/9/8/chartex" xmlns:cx2="http://schemas.microsoft.com/office/drawing/2015/10/21/chartex" xmlns:cx3="http://schemas.microsoft.com/office/drawing/2016/5/9/chartex" xmlns:cx4="http://schemas.microsoft.com/office/drawing/2016/5/10/chartex" xmlns:cx5="http://schemas.microsoft.com/office/drawing/2016/5/11/chartex" xmlns:cx6="http://schemas.microsoft.com/office/drawing/2016/5/12/chartex" xmlns:cx7="http://schemas.microsoft.com/office/drawing/2016/5/13/chartex" xmlns:cx8="http://schemas.microsoft.com/office/drawing/2016/5/14/chartex" xmlns:mc="http://schemas.openxmlformats.org/markup-compatibility/2006" xmlns:aink="http://schemas.microsoft.com/office/drawing/2016/ink" xmlns:am3d="http://schemas.microsoft.com/office/drawing/2017/model3d" xmlns:o="urn:schemas-microsoft-com:office:office" xmlns:oel="http://schemas.microsoft.com/office/2019/extlst" xmlns:r="http://schemas.openxmlformats.org/officeDocument/2006/relationships" xmlns:m="http://schemas.openxmlformats.org/officeDocument/2006/math" xmlns:v="urn:schemas-microsoft-com:vml" xmlns:wp14="http://schemas.microsoft.com/office/word/2010/wordprocessingDrawing" xmlns:wp="http://schemas.openxmlformats.org/drawingml/2006/wordprocessingDrawing" xmlns:w10="urn:schemas-microsoft-com:office:word" xmlns:w="http://schemas.openxmlformats.org/wordprocessingml/2006/main" xmlns:w14="http://schemas.microsoft.com/office/word/2010/wordml" xmlns:w15="http://schemas.microsoft.com/office/word/2012/wordml" xmlns:w16cex="http://schemas.microsoft.com/office/word/2018/wordml/cex" xmlns:w16cid="http://schemas.microsoft.com/office/word/2016/wordml/cid" xmlns:w16="http://schemas.microsoft.com/office/word/2018/wordml" xmlns:w16du="http://schemas.microsoft.com/office/word/2023/wordml/word16du" xmlns:w16sdtdh="http://schemas.microsoft.com/office/word/2020/wordml/sdtdatahash" xmlns:w16sdtfl="http://schemas.microsoft.com/office/word/2024/wordml/sdtformatlock" xmlns:w16se="http://schemas.microsoft.com/office/word/2015/wordml/symex" xmlns:wpg="http://schemas.microsoft.com/office/word/2010/wordprocessingGroup" xmlns:wpi="http://schemas.microsoft.com/office/word/2010/wordprocessingInk" xmlns:wne="http://schemas.microsoft.com/office/word/2006/wordml" xmlns:wps="http://schemas.microsoft.com/office/word/2010/wordprocessingShape" mc:Ignorable="w14 w15 w16se w16cid w16 w16cex w16sdtdh w16sdtfl w16du wp14">
   <w:abstractNum w:abstractNumId="0" w15:restartNumberingAfterBreak="0">
+    <w:nsid w:val="0BFF6CDD"/>
+    <w:multiLevelType w:val="hybridMultilevel"/>
+    <w:tmpl w:val="4F04CDA8"/>
+    <w:lvl w:ilvl="0" w:tplc="60588AE8">
+      <w:numFmt w:val="bullet"/>
+      <w:lvlText w:val="-"/>
+      <w:lvlJc w:val="left"/>
+      <w:pPr>
+        <w:ind w:left="720" w:hanging="360"/>
+      </w:pPr>
+      <w:rPr>
+        <w:rFonts w:ascii="Arial" w:eastAsia="Arial" w:hAnsi="Arial" w:cs="Arial" w:hint="default"/>
+      </w:rPr>
+    </w:lvl>
+    <w:lvl w:ilvl="1" w:tplc="14090003" w:tentative="1">
+      <w:start w:val="1"/>
+      <w:numFmt w:val="bullet"/>
+      <w:lvlText w:val="o"/>
+      <w:lvlJc w:val="left"/>
+      <w:pPr>
+        <w:ind w:left="1440" w:hanging="360"/>
+      </w:pPr>
+      <w:rPr>
+        <w:rFonts w:ascii="Courier New" w:hAnsi="Courier New" w:cs="Courier New" w:hint="default"/>
+      </w:rPr>
+    </w:lvl>
+    <w:lvl w:ilvl="2" w:tplc="14090005" w:tentative="1">
+      <w:start w:val="1"/>
+      <w:numFmt w:val="bullet"/>
+      <w:lvlText w:val=""/>
+      <w:lvlJc w:val="left"/>
+      <w:pPr>
+        <w:ind w:left="2160" w:hanging="360"/>
+      </w:pPr>
+      <w:rPr>
+        <w:rFonts w:ascii="Wingdings" w:hAnsi="Wingdings" w:hint="default"/>
+      </w:rPr>
+    </w:lvl>
+    <w:lvl w:ilvl="3" w:tplc="14090001" w:tentative="1">
+      <w:start w:val="1"/>
+      <w:numFmt w:val="bullet"/>
+      <w:lvlText w:val=""/>
+      <w:lvlJc w:val="left"/>
+      <w:pPr>
+        <w:ind w:left="2880" w:hanging="360"/>
+      </w:pPr>
+      <w:rPr>
+        <w:rFonts w:ascii="Symbol" w:hAnsi="Symbol" w:hint="default"/>
+      </w:rPr>
+    </w:lvl>
+    <w:lvl w:ilvl="4" w:tplc="14090003" w:tentative="1">
+      <w:start w:val="1"/>
+      <w:numFmt w:val="bullet"/>
+      <w:lvlText w:val="o"/>
+      <w:lvlJc w:val="left"/>
+      <w:pPr>
+        <w:ind w:left="3600" w:hanging="360"/>
+      </w:pPr>
+      <w:rPr>
+        <w:rFonts w:ascii="Courier New" w:hAnsi="Courier New" w:cs="Courier New" w:hint="default"/>
+      </w:rPr>
+    </w:lvl>
+    <w:lvl w:ilvl="5" w:tplc="14090005" w:tentative="1">
+      <w:start w:val="1"/>
+      <w:numFmt w:val="bullet"/>
+      <w:lvlText w:val=""/>
+      <w:lvlJc w:val="left"/>
+      <w:pPr>
+        <w:ind w:left="4320" w:hanging="360"/>
+      </w:pPr>
+      <w:rPr>
+        <w:rFonts w:ascii="Wingdings" w:hAnsi="Wingdings" w:hint="default"/>
+      </w:rPr>
+    </w:lvl>
+    <w:lvl w:ilvl="6" w:tplc="14090001" w:tentative="1">
+      <w:start w:val="1"/>
+      <w:numFmt w:val="bullet"/>
+      <w:lvlText w:val=""/>
+      <w:lvlJc w:val="left"/>
+      <w:pPr>
+        <w:ind w:left="5040" w:hanging="360"/>
+      </w:pPr>
+      <w:rPr>
+        <w:rFonts w:ascii="Symbol" w:hAnsi="Symbol" w:hint="default"/>
+      </w:rPr>
+    </w:lvl>
+    <w:lvl w:ilvl="7" w:tplc="14090003" w:tentative="1">
+      <w:start w:val="1"/>
+      <w:numFmt w:val="bullet"/>
+      <w:lvlText w:val="o"/>
+      <w:lvlJc w:val="left"/>
+      <w:pPr>
+        <w:ind w:left="5760" w:hanging="360"/>
+      </w:pPr>
+      <w:rPr>
+        <w:rFonts w:ascii="Courier New" w:hAnsi="Courier New" w:cs="Courier New" w:hint="default"/>
+      </w:rPr>
+    </w:lvl>
+    <w:lvl w:ilvl="8" w:tplc="14090005" w:tentative="1">
+      <w:start w:val="1"/>
+      <w:numFmt w:val="bullet"/>
+      <w:lvlText w:val=""/>
+      <w:lvlJc w:val="left"/>
+      <w:pPr>
+        <w:ind w:left="6480" w:hanging="360"/>
+      </w:pPr>
+      <w:rPr>
+        <w:rFonts w:ascii="Wingdings" w:hAnsi="Wingdings" w:hint="default"/>
+      </w:rPr>
+    </w:lvl>
+  </w:abstractNum>
+  <w:abstractNum w:abstractNumId="1" w15:restartNumberingAfterBreak="0">
     <w:nsid w:val="0E0638C9"/>
     <w:multiLevelType w:val="multilevel"/>
     <w:tmpl w:val="5A8AE034"/>
@@ -10635,7 +10801,7 @@
       </w:pPr>
     </w:lvl>
   </w:abstractNum>
-  <w:abstractNum w:abstractNumId="1" w15:restartNumberingAfterBreak="0">
+  <w:abstractNum w:abstractNumId="2" w15:restartNumberingAfterBreak="0">
     <w:nsid w:val="355834C7"/>
     <w:multiLevelType w:val="hybridMultilevel"/>
     <w:tmpl w:val="531A62D8"/>
@@ -10747,7 +10913,7 @@
       </w:rPr>
     </w:lvl>
   </w:abstractNum>
-  <w:abstractNum w:abstractNumId="2" w15:restartNumberingAfterBreak="0">
+  <w:abstractNum w:abstractNumId="3" w15:restartNumberingAfterBreak="0">
     <w:nsid w:val="379173D0"/>
     <w:multiLevelType w:val="multilevel"/>
     <w:tmpl w:val="A7AC05AE"/>
@@ -10897,13 +11063,16 @@
     </w:lvl>
   </w:abstractNum>
   <w:num w:numId="1" w16cid:durableId="1897541564">
+    <w:abstractNumId w:val="3"/>
+  </w:num>
+  <w:num w:numId="2" w16cid:durableId="1001394606">
+    <w:abstractNumId w:val="1"/>
+  </w:num>
+  <w:num w:numId="3" w16cid:durableId="1755280486">
     <w:abstractNumId w:val="2"/>
   </w:num>
-  <w:num w:numId="2" w16cid:durableId="1001394606">
+  <w:num w:numId="4" w16cid:durableId="1983807050">
     <w:abstractNumId w:val="0"/>
-  </w:num>
-  <w:num w:numId="3" w16cid:durableId="1755280486">
-    <w:abstractNumId w:val="1"/>
   </w:num>
 </w:numbering>
 </file>

</xml_diff>

<commit_message>
sprint 2 - i done wriiting. Just proof seplling and photos
</commit_message>
<xml_diff>
--- a/L3 Web Application Development Log.docx
+++ b/L3 Web Application Development Log.docx
@@ -775,34 +775,6 @@
               <w:spacing w:line="240" w:lineRule="auto"/>
             </w:pPr>
           </w:p>
-          <w:p>
-            <w:pPr>
-              <w:pStyle w:val="normal1"/>
-              <w:widowControl w:val="0"/>
-              <w:spacing w:line="240" w:lineRule="auto"/>
-            </w:pPr>
-          </w:p>
-          <w:p>
-            <w:pPr>
-              <w:pStyle w:val="normal1"/>
-              <w:widowControl w:val="0"/>
-              <w:spacing w:line="240" w:lineRule="auto"/>
-            </w:pPr>
-          </w:p>
-          <w:p>
-            <w:pPr>
-              <w:pStyle w:val="normal1"/>
-              <w:widowControl w:val="0"/>
-              <w:spacing w:line="240" w:lineRule="auto"/>
-            </w:pPr>
-          </w:p>
-          <w:p>
-            <w:pPr>
-              <w:pStyle w:val="normal1"/>
-              <w:widowControl w:val="0"/>
-              <w:spacing w:line="240" w:lineRule="auto"/>
-            </w:pPr>
-          </w:p>
         </w:tc>
       </w:tr>
     </w:tbl>
@@ -883,7 +855,519 @@
               <w:rPr>
                 <w:rFonts w:ascii="Calibri" w:eastAsia="Calibri" w:hAnsi="Calibri" w:cs="Calibri"/>
               </w:rPr>
-              <w:t xml:space="preserve">- </w:t>
+              <w:t xml:space="preserve">Intellectual Property – </w:t>
+            </w:r>
+          </w:p>
+          <w:p>
+            <w:pPr>
+              <w:pStyle w:val="normal1"/>
+              <w:widowControl w:val="0"/>
+              <w:spacing w:line="240" w:lineRule="auto"/>
+              <w:rPr>
+                <w:rFonts w:ascii="Calibri" w:eastAsia="Calibri" w:hAnsi="Calibri" w:cs="Calibri"/>
+              </w:rPr>
+            </w:pPr>
+            <w:r>
+              <w:rPr>
+                <w:rFonts w:ascii="Calibri" w:eastAsia="Calibri" w:hAnsi="Calibri" w:cs="Calibri"/>
+              </w:rPr>
+              <w:t xml:space="preserve">My website is </w:t>
+            </w:r>
+            <w:proofErr w:type="spellStart"/>
+            <w:r>
+              <w:rPr>
+                <w:rFonts w:ascii="Calibri" w:eastAsia="Calibri" w:hAnsi="Calibri" w:cs="Calibri"/>
+              </w:rPr>
+              <w:t>fosours</w:t>
+            </w:r>
+            <w:proofErr w:type="spellEnd"/>
+            <w:r>
+              <w:rPr>
+                <w:rFonts w:ascii="Calibri" w:eastAsia="Calibri" w:hAnsi="Calibri" w:cs="Calibri"/>
+              </w:rPr>
+              <w:t xml:space="preserve"> on Games, which could break copyright. Since I want to use </w:t>
+            </w:r>
+            <w:proofErr w:type="spellStart"/>
+            <w:r>
+              <w:rPr>
+                <w:rFonts w:ascii="Calibri" w:eastAsia="Calibri" w:hAnsi="Calibri" w:cs="Calibri"/>
+              </w:rPr>
+              <w:t>imgseas</w:t>
+            </w:r>
+            <w:proofErr w:type="spellEnd"/>
+            <w:r>
+              <w:rPr>
+                <w:rFonts w:ascii="Calibri" w:eastAsia="Calibri" w:hAnsi="Calibri" w:cs="Calibri"/>
+              </w:rPr>
+              <w:t xml:space="preserve"> and </w:t>
+            </w:r>
+            <w:proofErr w:type="spellStart"/>
+            <w:r>
+              <w:rPr>
+                <w:rFonts w:ascii="Calibri" w:eastAsia="Calibri" w:hAnsi="Calibri" w:cs="Calibri"/>
+              </w:rPr>
+              <w:t>maube</w:t>
+            </w:r>
+            <w:proofErr w:type="spellEnd"/>
+            <w:r>
+              <w:rPr>
+                <w:rFonts w:ascii="Calibri" w:eastAsia="Calibri" w:hAnsi="Calibri" w:cs="Calibri"/>
+              </w:rPr>
+              <w:t xml:space="preserve"> </w:t>
+            </w:r>
+            <w:proofErr w:type="spellStart"/>
+            <w:r>
+              <w:rPr>
+                <w:rFonts w:ascii="Calibri" w:eastAsia="Calibri" w:hAnsi="Calibri" w:cs="Calibri"/>
+              </w:rPr>
+              <w:t>viedos</w:t>
+            </w:r>
+            <w:proofErr w:type="spellEnd"/>
+            <w:r>
+              <w:rPr>
+                <w:rFonts w:ascii="Calibri" w:eastAsia="Calibri" w:hAnsi="Calibri" w:cs="Calibri"/>
+              </w:rPr>
+              <w:t xml:space="preserve"> from the games, it could be </w:t>
+            </w:r>
+            <w:proofErr w:type="spellStart"/>
+            <w:r>
+              <w:rPr>
+                <w:rFonts w:ascii="Calibri" w:eastAsia="Calibri" w:hAnsi="Calibri" w:cs="Calibri"/>
+              </w:rPr>
+              <w:t>be</w:t>
+            </w:r>
+            <w:proofErr w:type="spellEnd"/>
+            <w:r>
+              <w:rPr>
+                <w:rFonts w:ascii="Calibri" w:eastAsia="Calibri" w:hAnsi="Calibri" w:cs="Calibri"/>
+              </w:rPr>
+              <w:t xml:space="preserve"> </w:t>
+            </w:r>
+            <w:proofErr w:type="spellStart"/>
+            <w:r>
+              <w:rPr>
+                <w:rFonts w:ascii="Calibri" w:eastAsia="Calibri" w:hAnsi="Calibri" w:cs="Calibri"/>
+              </w:rPr>
+              <w:t>condiser</w:t>
+            </w:r>
+            <w:proofErr w:type="spellEnd"/>
+            <w:r>
+              <w:rPr>
+                <w:rFonts w:ascii="Calibri" w:eastAsia="Calibri" w:hAnsi="Calibri" w:cs="Calibri"/>
+              </w:rPr>
+              <w:t xml:space="preserve"> copyright as the </w:t>
+            </w:r>
+            <w:proofErr w:type="spellStart"/>
+            <w:r>
+              <w:rPr>
+                <w:rFonts w:ascii="Calibri" w:eastAsia="Calibri" w:hAnsi="Calibri" w:cs="Calibri"/>
+              </w:rPr>
+              <w:t>imahes</w:t>
+            </w:r>
+            <w:proofErr w:type="spellEnd"/>
+            <w:r>
+              <w:rPr>
+                <w:rFonts w:ascii="Calibri" w:eastAsia="Calibri" w:hAnsi="Calibri" w:cs="Calibri"/>
+              </w:rPr>
+              <w:t xml:space="preserve"> and </w:t>
+            </w:r>
+            <w:proofErr w:type="gramStart"/>
+            <w:r>
+              <w:rPr>
+                <w:rFonts w:ascii="Calibri" w:eastAsia="Calibri" w:hAnsi="Calibri" w:cs="Calibri"/>
+              </w:rPr>
+              <w:t>vides</w:t>
+            </w:r>
+            <w:proofErr w:type="gramEnd"/>
+            <w:r>
+              <w:rPr>
+                <w:rFonts w:ascii="Calibri" w:eastAsia="Calibri" w:hAnsi="Calibri" w:cs="Calibri"/>
+              </w:rPr>
+              <w:t xml:space="preserve"> are not own my me but someone else. I can </w:t>
+            </w:r>
+            <w:proofErr w:type="spellStart"/>
+            <w:r>
+              <w:rPr>
+                <w:rFonts w:ascii="Calibri" w:eastAsia="Calibri" w:hAnsi="Calibri" w:cs="Calibri"/>
+              </w:rPr>
+              <w:t>propalby</w:t>
+            </w:r>
+            <w:proofErr w:type="spellEnd"/>
+            <w:r>
+              <w:rPr>
+                <w:rFonts w:ascii="Calibri" w:eastAsia="Calibri" w:hAnsi="Calibri" w:cs="Calibri"/>
+              </w:rPr>
+              <w:t xml:space="preserve"> get around this by asking game </w:t>
+            </w:r>
+            <w:proofErr w:type="spellStart"/>
+            <w:r>
+              <w:rPr>
+                <w:rFonts w:ascii="Calibri" w:eastAsia="Calibri" w:hAnsi="Calibri" w:cs="Calibri"/>
+              </w:rPr>
+              <w:t>creoters</w:t>
+            </w:r>
+            <w:proofErr w:type="spellEnd"/>
+            <w:r>
+              <w:rPr>
+                <w:rFonts w:ascii="Calibri" w:eastAsia="Calibri" w:hAnsi="Calibri" w:cs="Calibri"/>
+              </w:rPr>
+              <w:t xml:space="preserve"> or people who own these videos and images if I can use those in my </w:t>
+            </w:r>
+            <w:proofErr w:type="gramStart"/>
+            <w:r>
+              <w:rPr>
+                <w:rFonts w:ascii="Calibri" w:eastAsia="Calibri" w:hAnsi="Calibri" w:cs="Calibri"/>
+              </w:rPr>
+              <w:t>website, and</w:t>
+            </w:r>
+            <w:proofErr w:type="gramEnd"/>
+            <w:r>
+              <w:rPr>
+                <w:rFonts w:ascii="Calibri" w:eastAsia="Calibri" w:hAnsi="Calibri" w:cs="Calibri"/>
+              </w:rPr>
+              <w:t xml:space="preserve"> depending on what they </w:t>
+            </w:r>
+            <w:proofErr w:type="spellStart"/>
+            <w:r>
+              <w:rPr>
+                <w:rFonts w:ascii="Calibri" w:eastAsia="Calibri" w:hAnsi="Calibri" w:cs="Calibri"/>
+              </w:rPr>
+              <w:t>sau</w:t>
+            </w:r>
+            <w:proofErr w:type="spellEnd"/>
+            <w:r>
+              <w:rPr>
+                <w:rFonts w:ascii="Calibri" w:eastAsia="Calibri" w:hAnsi="Calibri" w:cs="Calibri"/>
+              </w:rPr>
+              <w:t xml:space="preserve">. I can use what media I want from them, without </w:t>
+            </w:r>
+            <w:proofErr w:type="gramStart"/>
+            <w:r>
+              <w:rPr>
+                <w:rFonts w:ascii="Calibri" w:eastAsia="Calibri" w:hAnsi="Calibri" w:cs="Calibri"/>
+              </w:rPr>
+              <w:t>fearing for</w:t>
+            </w:r>
+            <w:proofErr w:type="gramEnd"/>
+            <w:r>
+              <w:rPr>
+                <w:rFonts w:ascii="Calibri" w:eastAsia="Calibri" w:hAnsi="Calibri" w:cs="Calibri"/>
+              </w:rPr>
+              <w:t xml:space="preserve"> </w:t>
+            </w:r>
+            <w:r>
+              <w:rPr>
+                <w:rFonts w:ascii="Calibri" w:eastAsia="Calibri" w:hAnsi="Calibri" w:cs="Calibri"/>
+              </w:rPr>
+              <w:t>copyright.</w:t>
+            </w:r>
+          </w:p>
+          <w:p>
+            <w:pPr>
+              <w:pStyle w:val="normal1"/>
+              <w:widowControl w:val="0"/>
+              <w:spacing w:line="240" w:lineRule="auto"/>
+              <w:rPr>
+                <w:rFonts w:ascii="Calibri" w:eastAsia="Calibri" w:hAnsi="Calibri" w:cs="Calibri"/>
+              </w:rPr>
+            </w:pPr>
+          </w:p>
+          <w:p>
+            <w:pPr>
+              <w:pStyle w:val="normal1"/>
+              <w:widowControl w:val="0"/>
+              <w:spacing w:line="240" w:lineRule="auto"/>
+              <w:rPr>
+                <w:rFonts w:ascii="Calibri" w:eastAsia="Calibri" w:hAnsi="Calibri" w:cs="Calibri"/>
+              </w:rPr>
+            </w:pPr>
+            <w:r>
+              <w:rPr>
+                <w:rFonts w:ascii="Calibri" w:eastAsia="Calibri" w:hAnsi="Calibri" w:cs="Calibri"/>
+              </w:rPr>
+              <w:t>Ethics –</w:t>
+            </w:r>
+          </w:p>
+          <w:p>
+            <w:pPr>
+              <w:pStyle w:val="normal1"/>
+              <w:widowControl w:val="0"/>
+              <w:spacing w:line="240" w:lineRule="auto"/>
+              <w:rPr>
+                <w:rFonts w:ascii="Calibri" w:eastAsia="Calibri" w:hAnsi="Calibri" w:cs="Calibri"/>
+              </w:rPr>
+            </w:pPr>
+            <w:r>
+              <w:rPr>
+                <w:rFonts w:ascii="Calibri" w:eastAsia="Calibri" w:hAnsi="Calibri" w:cs="Calibri"/>
+              </w:rPr>
+              <w:t xml:space="preserve">Games have many </w:t>
+            </w:r>
+            <w:proofErr w:type="spellStart"/>
+            <w:r>
+              <w:rPr>
+                <w:rFonts w:ascii="Calibri" w:eastAsia="Calibri" w:hAnsi="Calibri" w:cs="Calibri"/>
+              </w:rPr>
+              <w:t>grerons</w:t>
+            </w:r>
+            <w:proofErr w:type="spellEnd"/>
+            <w:r>
+              <w:rPr>
+                <w:rFonts w:ascii="Calibri" w:eastAsia="Calibri" w:hAnsi="Calibri" w:cs="Calibri"/>
+              </w:rPr>
+              <w:t xml:space="preserve"> and </w:t>
+            </w:r>
+            <w:proofErr w:type="gramStart"/>
+            <w:r>
+              <w:rPr>
+                <w:rFonts w:ascii="Calibri" w:eastAsia="Calibri" w:hAnsi="Calibri" w:cs="Calibri"/>
+              </w:rPr>
+              <w:t>looks</w:t>
+            </w:r>
+            <w:proofErr w:type="gramEnd"/>
+            <w:r>
+              <w:rPr>
+                <w:rFonts w:ascii="Calibri" w:eastAsia="Calibri" w:hAnsi="Calibri" w:cs="Calibri"/>
+              </w:rPr>
+              <w:t xml:space="preserve"> with them. One of the big </w:t>
+            </w:r>
+            <w:proofErr w:type="spellStart"/>
+            <w:r>
+              <w:rPr>
+                <w:rFonts w:ascii="Calibri" w:eastAsia="Calibri" w:hAnsi="Calibri" w:cs="Calibri"/>
+              </w:rPr>
+              <w:t>cornales</w:t>
+            </w:r>
+            <w:proofErr w:type="spellEnd"/>
+            <w:r>
+              <w:rPr>
+                <w:rFonts w:ascii="Calibri" w:eastAsia="Calibri" w:hAnsi="Calibri" w:cs="Calibri"/>
+              </w:rPr>
+              <w:t xml:space="preserve"> are FPS or those </w:t>
+            </w:r>
+            <w:proofErr w:type="gramStart"/>
+            <w:r>
+              <w:rPr>
+                <w:rFonts w:ascii="Calibri" w:eastAsia="Calibri" w:hAnsi="Calibri" w:cs="Calibri"/>
+              </w:rPr>
+              <w:t>whoa</w:t>
+            </w:r>
+            <w:proofErr w:type="gramEnd"/>
+            <w:r>
+              <w:rPr>
+                <w:rFonts w:ascii="Calibri" w:eastAsia="Calibri" w:hAnsi="Calibri" w:cs="Calibri"/>
+              </w:rPr>
+              <w:t xml:space="preserve"> </w:t>
+            </w:r>
+            <w:proofErr w:type="gramStart"/>
+            <w:r>
+              <w:rPr>
+                <w:rFonts w:ascii="Calibri" w:eastAsia="Calibri" w:hAnsi="Calibri" w:cs="Calibri"/>
+              </w:rPr>
+              <w:t>re</w:t>
+            </w:r>
+            <w:proofErr w:type="gramEnd"/>
+            <w:r>
+              <w:rPr>
+                <w:rFonts w:ascii="Calibri" w:eastAsia="Calibri" w:hAnsi="Calibri" w:cs="Calibri"/>
+              </w:rPr>
+              <w:t xml:space="preserve"> rated 16+. I want </w:t>
+            </w:r>
+            <w:proofErr w:type="gramStart"/>
+            <w:r>
+              <w:rPr>
+                <w:rFonts w:ascii="Calibri" w:eastAsia="Calibri" w:hAnsi="Calibri" w:cs="Calibri"/>
+              </w:rPr>
+              <w:t>user</w:t>
+            </w:r>
+            <w:proofErr w:type="gramEnd"/>
+            <w:r>
+              <w:rPr>
+                <w:rFonts w:ascii="Calibri" w:eastAsia="Calibri" w:hAnsi="Calibri" w:cs="Calibri"/>
+              </w:rPr>
+              <w:t xml:space="preserve"> for all ages who love games and I </w:t>
+            </w:r>
+            <w:proofErr w:type="gramStart"/>
+            <w:r>
+              <w:rPr>
+                <w:rFonts w:ascii="Calibri" w:eastAsia="Calibri" w:hAnsi="Calibri" w:cs="Calibri"/>
+              </w:rPr>
+              <w:t>cant</w:t>
+            </w:r>
+            <w:proofErr w:type="gramEnd"/>
+            <w:r>
+              <w:rPr>
+                <w:rFonts w:ascii="Calibri" w:eastAsia="Calibri" w:hAnsi="Calibri" w:cs="Calibri"/>
+              </w:rPr>
+              <w:t xml:space="preserve"> limited who loves playing games just because </w:t>
+            </w:r>
+            <w:proofErr w:type="spellStart"/>
+            <w:r>
+              <w:rPr>
+                <w:rFonts w:ascii="Calibri" w:eastAsia="Calibri" w:hAnsi="Calibri" w:cs="Calibri"/>
+              </w:rPr>
+              <w:t>centeesons</w:t>
+            </w:r>
+            <w:proofErr w:type="spellEnd"/>
+            <w:r>
+              <w:rPr>
+                <w:rFonts w:ascii="Calibri" w:eastAsia="Calibri" w:hAnsi="Calibri" w:cs="Calibri"/>
+              </w:rPr>
+              <w:t xml:space="preserve"> games are not rated PG. To get around this would be putting a </w:t>
+            </w:r>
+            <w:proofErr w:type="gramStart"/>
+            <w:r>
+              <w:rPr>
+                <w:rFonts w:ascii="Calibri" w:eastAsia="Calibri" w:hAnsi="Calibri" w:cs="Calibri"/>
+              </w:rPr>
+              <w:t>warning  before</w:t>
+            </w:r>
+            <w:proofErr w:type="gramEnd"/>
+            <w:r>
+              <w:rPr>
+                <w:rFonts w:ascii="Calibri" w:eastAsia="Calibri" w:hAnsi="Calibri" w:cs="Calibri"/>
+              </w:rPr>
+              <w:t xml:space="preserve"> entering a game page or a way to tell user </w:t>
+            </w:r>
+            <w:proofErr w:type="gramStart"/>
+            <w:r>
+              <w:rPr>
+                <w:rFonts w:ascii="Calibri" w:eastAsia="Calibri" w:hAnsi="Calibri" w:cs="Calibri"/>
+              </w:rPr>
+              <w:t>“hey</w:t>
+            </w:r>
+            <w:proofErr w:type="gramEnd"/>
+            <w:r>
+              <w:rPr>
+                <w:rFonts w:ascii="Calibri" w:eastAsia="Calibri" w:hAnsi="Calibri" w:cs="Calibri"/>
+              </w:rPr>
+              <w:t xml:space="preserve">! This page </w:t>
+            </w:r>
+            <w:proofErr w:type="spellStart"/>
+            <w:r>
+              <w:rPr>
+                <w:rFonts w:ascii="Calibri" w:eastAsia="Calibri" w:hAnsi="Calibri" w:cs="Calibri"/>
+              </w:rPr>
+              <w:t>contions</w:t>
+            </w:r>
+            <w:proofErr w:type="spellEnd"/>
+            <w:r>
+              <w:rPr>
+                <w:rFonts w:ascii="Calibri" w:eastAsia="Calibri" w:hAnsi="Calibri" w:cs="Calibri"/>
+              </w:rPr>
+              <w:t xml:space="preserve"> </w:t>
+            </w:r>
+            <w:proofErr w:type="spellStart"/>
+            <w:r>
+              <w:rPr>
+                <w:rFonts w:ascii="Calibri" w:eastAsia="Calibri" w:hAnsi="Calibri" w:cs="Calibri"/>
+              </w:rPr>
+              <w:t>gorey</w:t>
+            </w:r>
+            <w:proofErr w:type="spellEnd"/>
+            <w:r>
+              <w:rPr>
+                <w:rFonts w:ascii="Calibri" w:eastAsia="Calibri" w:hAnsi="Calibri" w:cs="Calibri"/>
+              </w:rPr>
+              <w:t xml:space="preserve"> or </w:t>
+            </w:r>
+            <w:proofErr w:type="spellStart"/>
+            <w:r>
+              <w:rPr>
+                <w:rFonts w:ascii="Calibri" w:eastAsia="Calibri" w:hAnsi="Calibri" w:cs="Calibri"/>
+              </w:rPr>
+              <w:t>dispurting</w:t>
+            </w:r>
+            <w:proofErr w:type="spellEnd"/>
+            <w:r>
+              <w:rPr>
+                <w:rFonts w:ascii="Calibri" w:eastAsia="Calibri" w:hAnsi="Calibri" w:cs="Calibri"/>
+              </w:rPr>
+              <w:t xml:space="preserve"> </w:t>
+            </w:r>
+            <w:proofErr w:type="spellStart"/>
+            <w:r>
+              <w:rPr>
+                <w:rFonts w:ascii="Calibri" w:eastAsia="Calibri" w:hAnsi="Calibri" w:cs="Calibri"/>
+              </w:rPr>
+              <w:t>imgs</w:t>
+            </w:r>
+            <w:proofErr w:type="spellEnd"/>
+            <w:r>
+              <w:rPr>
+                <w:rFonts w:ascii="Calibri" w:eastAsia="Calibri" w:hAnsi="Calibri" w:cs="Calibri"/>
+              </w:rPr>
+              <w:t xml:space="preserve">!”, without feeling </w:t>
+            </w:r>
+            <w:proofErr w:type="spellStart"/>
+            <w:r>
+              <w:rPr>
+                <w:rFonts w:ascii="Calibri" w:eastAsia="Calibri" w:hAnsi="Calibri" w:cs="Calibri"/>
+              </w:rPr>
+              <w:t>uncomable</w:t>
+            </w:r>
+            <w:proofErr w:type="spellEnd"/>
+            <w:r>
+              <w:rPr>
+                <w:rFonts w:ascii="Calibri" w:eastAsia="Calibri" w:hAnsi="Calibri" w:cs="Calibri"/>
+              </w:rPr>
+              <w:t xml:space="preserve"> or </w:t>
+            </w:r>
+            <w:proofErr w:type="spellStart"/>
+            <w:r>
+              <w:rPr>
+                <w:rFonts w:ascii="Calibri" w:eastAsia="Calibri" w:hAnsi="Calibri" w:cs="Calibri"/>
+              </w:rPr>
+              <w:t>tramuaizes</w:t>
+            </w:r>
+            <w:proofErr w:type="spellEnd"/>
+            <w:r>
+              <w:rPr>
+                <w:rFonts w:ascii="Calibri" w:eastAsia="Calibri" w:hAnsi="Calibri" w:cs="Calibri"/>
+              </w:rPr>
+              <w:t xml:space="preserve"> when on the page. </w:t>
+            </w:r>
+            <w:proofErr w:type="gramStart"/>
+            <w:r>
+              <w:rPr>
+                <w:rFonts w:ascii="Calibri" w:eastAsia="Calibri" w:hAnsi="Calibri" w:cs="Calibri"/>
+              </w:rPr>
+              <w:t>Or,</w:t>
+            </w:r>
+            <w:proofErr w:type="gramEnd"/>
+            <w:r>
+              <w:rPr>
+                <w:rFonts w:ascii="Calibri" w:eastAsia="Calibri" w:hAnsi="Calibri" w:cs="Calibri"/>
+              </w:rPr>
+              <w:t xml:space="preserve"> make it that </w:t>
+            </w:r>
+            <w:proofErr w:type="spellStart"/>
+            <w:r>
+              <w:rPr>
+                <w:rFonts w:ascii="Calibri" w:eastAsia="Calibri" w:hAnsi="Calibri" w:cs="Calibri"/>
+              </w:rPr>
+              <w:t>centes</w:t>
+            </w:r>
+            <w:proofErr w:type="spellEnd"/>
+            <w:r>
+              <w:rPr>
+                <w:rFonts w:ascii="Calibri" w:eastAsia="Calibri" w:hAnsi="Calibri" w:cs="Calibri"/>
+              </w:rPr>
+              <w:t xml:space="preserve"> pages can show in </w:t>
+            </w:r>
+            <w:proofErr w:type="spellStart"/>
+            <w:r>
+              <w:rPr>
+                <w:rFonts w:ascii="Calibri" w:eastAsia="Calibri" w:hAnsi="Calibri" w:cs="Calibri"/>
+              </w:rPr>
+              <w:t>centes</w:t>
+            </w:r>
+            <w:proofErr w:type="spellEnd"/>
+            <w:r>
+              <w:rPr>
+                <w:rFonts w:ascii="Calibri" w:eastAsia="Calibri" w:hAnsi="Calibri" w:cs="Calibri"/>
+              </w:rPr>
+              <w:t xml:space="preserve"> age </w:t>
             </w:r>
             <w:proofErr w:type="spellStart"/>
             <w:proofErr w:type="gramStart"/>
@@ -891,74 +1375,316 @@
               <w:rPr>
                 <w:rFonts w:ascii="Calibri" w:eastAsia="Calibri" w:hAnsi="Calibri" w:cs="Calibri"/>
               </w:rPr>
-              <w:t>Accessiblity</w:t>
+              <w:t>rang</w:t>
             </w:r>
             <w:proofErr w:type="spellEnd"/>
-            <w:r>
-              <w:rPr>
-                <w:rFonts w:ascii="Calibri" w:eastAsia="Calibri" w:hAnsi="Calibri" w:cs="Calibri"/>
-              </w:rPr>
-              <w:t xml:space="preserve"> ?</w:t>
-            </w:r>
             <w:proofErr w:type="gramEnd"/>
-          </w:p>
-          <w:p>
-            <w:pPr>
-              <w:pStyle w:val="normal1"/>
-              <w:widowControl w:val="0"/>
-              <w:spacing w:line="240" w:lineRule="auto"/>
-              <w:rPr>
-                <w:rFonts w:ascii="Calibri" w:eastAsia="Calibri" w:hAnsi="Calibri" w:cs="Calibri"/>
-              </w:rPr>
-            </w:pPr>
-          </w:p>
-          <w:p>
-            <w:pPr>
-              <w:pStyle w:val="normal1"/>
-              <w:widowControl w:val="0"/>
-              <w:spacing w:line="240" w:lineRule="auto"/>
-              <w:rPr>
-                <w:rFonts w:ascii="Calibri" w:eastAsia="Calibri" w:hAnsi="Calibri" w:cs="Calibri"/>
-              </w:rPr>
-            </w:pPr>
+            <w:r>
+              <w:rPr>
+                <w:rFonts w:ascii="Calibri" w:eastAsia="Calibri" w:hAnsi="Calibri" w:cs="Calibri"/>
+              </w:rPr>
+              <w:t xml:space="preserve">, but that would be too hard for me to </w:t>
+            </w:r>
+            <w:proofErr w:type="gramStart"/>
+            <w:r>
+              <w:rPr>
+                <w:rFonts w:ascii="Calibri" w:eastAsia="Calibri" w:hAnsi="Calibri" w:cs="Calibri"/>
+              </w:rPr>
+              <w:t>do :</w:t>
+            </w:r>
+            <w:proofErr w:type="gramEnd"/>
+            <w:r>
+              <w:rPr>
+                <w:rFonts w:ascii="Calibri" w:eastAsia="Calibri" w:hAnsi="Calibri" w:cs="Calibri"/>
+              </w:rPr>
+              <w:t>,)</w:t>
+            </w:r>
+          </w:p>
+          <w:p>
+            <w:pPr>
+              <w:pStyle w:val="normal1"/>
+              <w:widowControl w:val="0"/>
+              <w:spacing w:line="240" w:lineRule="auto"/>
+              <w:rPr>
+                <w:rFonts w:ascii="Calibri" w:eastAsia="Calibri" w:hAnsi="Calibri" w:cs="Calibri"/>
+              </w:rPr>
+            </w:pPr>
+            <w:r>
+              <w:rPr>
+                <w:rFonts w:ascii="Calibri" w:eastAsia="Calibri" w:hAnsi="Calibri" w:cs="Calibri"/>
+              </w:rPr>
+              <w:t xml:space="preserve">This </w:t>
+            </w:r>
+            <w:proofErr w:type="gramStart"/>
+            <w:r>
+              <w:rPr>
+                <w:rFonts w:ascii="Calibri" w:eastAsia="Calibri" w:hAnsi="Calibri" w:cs="Calibri"/>
+              </w:rPr>
+              <w:t>allow</w:t>
+            </w:r>
+            <w:proofErr w:type="gramEnd"/>
+            <w:r>
+              <w:rPr>
+                <w:rFonts w:ascii="Calibri" w:eastAsia="Calibri" w:hAnsi="Calibri" w:cs="Calibri"/>
+              </w:rPr>
+              <w:t xml:space="preserve"> people to roam around the </w:t>
+            </w:r>
             <w:proofErr w:type="spellStart"/>
             <w:r>
               <w:rPr>
                 <w:rFonts w:ascii="Calibri" w:eastAsia="Calibri" w:hAnsi="Calibri" w:cs="Calibri"/>
               </w:rPr>
-              <w:t>Functionity</w:t>
+              <w:t>webite</w:t>
             </w:r>
             <w:proofErr w:type="spellEnd"/>
-          </w:p>
-          <w:p>
-            <w:pPr>
-              <w:pStyle w:val="normal1"/>
-              <w:widowControl w:val="0"/>
-              <w:spacing w:line="240" w:lineRule="auto"/>
-              <w:rPr>
-                <w:rFonts w:ascii="Calibri" w:eastAsia="Calibri" w:hAnsi="Calibri" w:cs="Calibri"/>
-              </w:rPr>
-            </w:pPr>
-          </w:p>
-          <w:p>
-            <w:pPr>
-              <w:pStyle w:val="normal1"/>
-              <w:widowControl w:val="0"/>
-              <w:spacing w:line="240" w:lineRule="auto"/>
-              <w:rPr>
-                <w:rFonts w:ascii="Calibri" w:eastAsia="Calibri" w:hAnsi="Calibri" w:cs="Calibri"/>
-              </w:rPr>
-            </w:pPr>
-          </w:p>
-          <w:p>
-            <w:pPr>
-              <w:pStyle w:val="normal1"/>
-              <w:widowControl w:val="0"/>
-              <w:spacing w:line="240" w:lineRule="auto"/>
-              <w:rPr>
-                <w:rFonts w:ascii="Calibri" w:eastAsia="Calibri" w:hAnsi="Calibri" w:cs="Calibri"/>
-              </w:rPr>
-            </w:pPr>
+            <w:r>
+              <w:rPr>
+                <w:rFonts w:ascii="Calibri" w:eastAsia="Calibri" w:hAnsi="Calibri" w:cs="Calibri"/>
+              </w:rPr>
+              <w:t xml:space="preserve"> without feeling they </w:t>
+            </w:r>
+            <w:proofErr w:type="gramStart"/>
+            <w:r>
+              <w:rPr>
+                <w:rFonts w:ascii="Calibri" w:eastAsia="Calibri" w:hAnsi="Calibri" w:cs="Calibri"/>
+              </w:rPr>
+              <w:t>going</w:t>
+            </w:r>
+            <w:proofErr w:type="gramEnd"/>
+            <w:r>
+              <w:rPr>
+                <w:rFonts w:ascii="Calibri" w:eastAsia="Calibri" w:hAnsi="Calibri" w:cs="Calibri"/>
+              </w:rPr>
+              <w:t xml:space="preserve"> to be </w:t>
+            </w:r>
+            <w:proofErr w:type="spellStart"/>
+            <w:r>
+              <w:rPr>
+                <w:rFonts w:ascii="Calibri" w:eastAsia="Calibri" w:hAnsi="Calibri" w:cs="Calibri"/>
+              </w:rPr>
+              <w:t>jumpsared</w:t>
+            </w:r>
+            <w:proofErr w:type="spellEnd"/>
+            <w:r>
+              <w:rPr>
+                <w:rFonts w:ascii="Calibri" w:eastAsia="Calibri" w:hAnsi="Calibri" w:cs="Calibri"/>
+              </w:rPr>
+              <w:t xml:space="preserve"> by 16+ </w:t>
+            </w:r>
+            <w:proofErr w:type="spellStart"/>
+            <w:r>
+              <w:rPr>
+                <w:rFonts w:ascii="Calibri" w:eastAsia="Calibri" w:hAnsi="Calibri" w:cs="Calibri"/>
+              </w:rPr>
+              <w:t>sfuff</w:t>
+            </w:r>
+            <w:proofErr w:type="spellEnd"/>
+            <w:r>
+              <w:rPr>
+                <w:rFonts w:ascii="Calibri" w:eastAsia="Calibri" w:hAnsi="Calibri" w:cs="Calibri"/>
+              </w:rPr>
+              <w:t xml:space="preserve"> when opening a page.</w:t>
+            </w:r>
+          </w:p>
+          <w:p>
+            <w:pPr>
+              <w:pStyle w:val="normal1"/>
+              <w:widowControl w:val="0"/>
+              <w:spacing w:line="240" w:lineRule="auto"/>
+              <w:rPr>
+                <w:rFonts w:ascii="Calibri" w:eastAsia="Calibri" w:hAnsi="Calibri" w:cs="Calibri"/>
+              </w:rPr>
+            </w:pPr>
+          </w:p>
+          <w:p>
+            <w:pPr>
+              <w:pStyle w:val="normal1"/>
+              <w:widowControl w:val="0"/>
+              <w:spacing w:line="240" w:lineRule="auto"/>
+              <w:rPr>
+                <w:rFonts w:ascii="Calibri" w:eastAsia="Calibri" w:hAnsi="Calibri" w:cs="Calibri"/>
+              </w:rPr>
+            </w:pPr>
+            <w:proofErr w:type="spellStart"/>
+            <w:r>
+              <w:rPr>
+                <w:rFonts w:ascii="Calibri" w:eastAsia="Calibri" w:hAnsi="Calibri" w:cs="Calibri"/>
+              </w:rPr>
+              <w:t>Accessiablity</w:t>
+            </w:r>
+            <w:proofErr w:type="spellEnd"/>
+            <w:r>
+              <w:rPr>
+                <w:rFonts w:ascii="Calibri" w:eastAsia="Calibri" w:hAnsi="Calibri" w:cs="Calibri"/>
+              </w:rPr>
+              <w:t>-</w:t>
+            </w:r>
+          </w:p>
+          <w:p>
+            <w:pPr>
+              <w:pStyle w:val="normal1"/>
+              <w:widowControl w:val="0"/>
+              <w:spacing w:line="240" w:lineRule="auto"/>
+              <w:rPr>
+                <w:rFonts w:ascii="Calibri" w:eastAsia="Calibri" w:hAnsi="Calibri" w:cs="Calibri"/>
+              </w:rPr>
+            </w:pPr>
+            <w:r>
+              <w:rPr>
+                <w:rFonts w:ascii="Calibri" w:eastAsia="Calibri" w:hAnsi="Calibri" w:cs="Calibri"/>
+              </w:rPr>
+              <w:t xml:space="preserve">Anyone can be a cool gamer. Having people who have </w:t>
+            </w:r>
+            <w:proofErr w:type="spellStart"/>
+            <w:r>
+              <w:rPr>
+                <w:rFonts w:ascii="Calibri" w:eastAsia="Calibri" w:hAnsi="Calibri" w:cs="Calibri"/>
+              </w:rPr>
+              <w:t>disabliltyt</w:t>
+            </w:r>
+            <w:proofErr w:type="spellEnd"/>
+            <w:r>
+              <w:rPr>
+                <w:rFonts w:ascii="Calibri" w:eastAsia="Calibri" w:hAnsi="Calibri" w:cs="Calibri"/>
+              </w:rPr>
+              <w:t xml:space="preserve"> unable to access this website is very bad cause people with </w:t>
+            </w:r>
+            <w:proofErr w:type="spellStart"/>
+            <w:proofErr w:type="gramStart"/>
+            <w:r>
+              <w:rPr>
+                <w:rFonts w:ascii="Calibri" w:eastAsia="Calibri" w:hAnsi="Calibri" w:cs="Calibri"/>
+              </w:rPr>
+              <w:t>siapablity</w:t>
+            </w:r>
+            <w:proofErr w:type="spellEnd"/>
+            <w:r>
+              <w:rPr>
+                <w:rFonts w:ascii="Calibri" w:eastAsia="Calibri" w:hAnsi="Calibri" w:cs="Calibri"/>
+              </w:rPr>
+              <w:t xml:space="preserve">  can</w:t>
+            </w:r>
+            <w:proofErr w:type="gramEnd"/>
+            <w:r>
+              <w:rPr>
+                <w:rFonts w:ascii="Calibri" w:eastAsia="Calibri" w:hAnsi="Calibri" w:cs="Calibri"/>
+              </w:rPr>
+              <w:t xml:space="preserve"> be gamers. </w:t>
+            </w:r>
+            <w:proofErr w:type="gramStart"/>
+            <w:r>
+              <w:rPr>
+                <w:rFonts w:ascii="Calibri" w:eastAsia="Calibri" w:hAnsi="Calibri" w:cs="Calibri"/>
+              </w:rPr>
+              <w:t>Ill</w:t>
+            </w:r>
+            <w:proofErr w:type="gramEnd"/>
+            <w:r>
+              <w:rPr>
+                <w:rFonts w:ascii="Calibri" w:eastAsia="Calibri" w:hAnsi="Calibri" w:cs="Calibri"/>
+              </w:rPr>
+              <w:t xml:space="preserve"> change this</w:t>
+            </w:r>
+          </w:p>
+          <w:p>
+            <w:pPr>
+              <w:pStyle w:val="normal1"/>
+              <w:widowControl w:val="0"/>
+              <w:spacing w:line="240" w:lineRule="auto"/>
+              <w:rPr>
+                <w:rFonts w:ascii="Calibri" w:eastAsia="Calibri" w:hAnsi="Calibri" w:cs="Calibri"/>
+              </w:rPr>
+            </w:pPr>
+            <w:r>
+              <w:rPr>
+                <w:rFonts w:ascii="Calibri" w:eastAsia="Calibri" w:hAnsi="Calibri" w:cs="Calibri"/>
+              </w:rPr>
+              <w:t xml:space="preserve">I want to have </w:t>
+            </w:r>
+            <w:proofErr w:type="spellStart"/>
+            <w:r>
+              <w:rPr>
+                <w:rFonts w:ascii="Calibri" w:eastAsia="Calibri" w:hAnsi="Calibri" w:cs="Calibri"/>
+              </w:rPr>
+              <w:t>opeiton</w:t>
+            </w:r>
+            <w:proofErr w:type="spellEnd"/>
+            <w:r>
+              <w:rPr>
+                <w:rFonts w:ascii="Calibri" w:eastAsia="Calibri" w:hAnsi="Calibri" w:cs="Calibri"/>
+              </w:rPr>
+              <w:t xml:space="preserve"> of font, </w:t>
+            </w:r>
+            <w:proofErr w:type="spellStart"/>
+            <w:r>
+              <w:rPr>
+                <w:rFonts w:ascii="Calibri" w:eastAsia="Calibri" w:hAnsi="Calibri" w:cs="Calibri"/>
+              </w:rPr>
+              <w:t>colours</w:t>
+            </w:r>
+            <w:proofErr w:type="spellEnd"/>
+            <w:r>
+              <w:rPr>
+                <w:rFonts w:ascii="Calibri" w:eastAsia="Calibri" w:hAnsi="Calibri" w:cs="Calibri"/>
+              </w:rPr>
+              <w:t xml:space="preserve"> </w:t>
+            </w:r>
+            <w:proofErr w:type="spellStart"/>
+            <w:r>
+              <w:rPr>
+                <w:rFonts w:ascii="Calibri" w:eastAsia="Calibri" w:hAnsi="Calibri" w:cs="Calibri"/>
+              </w:rPr>
+              <w:t>pattion</w:t>
+            </w:r>
+            <w:proofErr w:type="spellEnd"/>
+            <w:r>
+              <w:rPr>
+                <w:rFonts w:ascii="Calibri" w:eastAsia="Calibri" w:hAnsi="Calibri" w:cs="Calibri"/>
+              </w:rPr>
+              <w:t xml:space="preserve">, and other things for people to change and use for their </w:t>
+            </w:r>
+            <w:proofErr w:type="spellStart"/>
+            <w:r>
+              <w:rPr>
+                <w:rFonts w:ascii="Calibri" w:eastAsia="Calibri" w:hAnsi="Calibri" w:cs="Calibri"/>
+              </w:rPr>
+              <w:t>conmfortr</w:t>
+            </w:r>
+            <w:proofErr w:type="spellEnd"/>
+            <w:r>
+              <w:rPr>
+                <w:rFonts w:ascii="Calibri" w:eastAsia="Calibri" w:hAnsi="Calibri" w:cs="Calibri"/>
+              </w:rPr>
+              <w:t xml:space="preserve">. They can </w:t>
+            </w:r>
+            <w:proofErr w:type="spellStart"/>
+            <w:r>
+              <w:rPr>
+                <w:rFonts w:ascii="Calibri" w:eastAsia="Calibri" w:hAnsi="Calibri" w:cs="Calibri"/>
+              </w:rPr>
+              <w:t>e</w:t>
+            </w:r>
+            <w:proofErr w:type="spellEnd"/>
+            <w:r>
+              <w:rPr>
+                <w:rFonts w:ascii="Calibri" w:eastAsia="Calibri" w:hAnsi="Calibri" w:cs="Calibri"/>
+              </w:rPr>
+              <w:t xml:space="preserve"> able to change fonts size and looks to give an </w:t>
+            </w:r>
+            <w:proofErr w:type="spellStart"/>
+            <w:r>
+              <w:rPr>
+                <w:rFonts w:ascii="Calibri" w:eastAsia="Calibri" w:hAnsi="Calibri" w:cs="Calibri"/>
+              </w:rPr>
+              <w:t>expmael</w:t>
+            </w:r>
+            <w:proofErr w:type="spellEnd"/>
+            <w:r>
+              <w:rPr>
+                <w:rFonts w:ascii="Calibri" w:eastAsia="Calibri" w:hAnsi="Calibri" w:cs="Calibri"/>
+              </w:rPr>
+              <w:t>. That all I got.</w:t>
+            </w:r>
           </w:p>
           <w:p>
             <w:pPr>
@@ -991,87 +1717,12 @@
     </w:p>
     <w:p>
       <w:pPr>
-        <w:pStyle w:val="normal1"/>
-        <w:rPr>
-          <w:rFonts w:ascii="Calibri" w:eastAsia="Calibri" w:hAnsi="Calibri" w:cs="Calibri"/>
-        </w:rPr>
-      </w:pPr>
-      <w:r>
-        <w:rPr>
-          <w:noProof/>
-        </w:rPr>
-        <mc:AlternateContent>
-          <mc:Choice Requires="wps">
-            <w:drawing>
-              <wp:inline distT="0" distB="0" distL="0" distR="0" wp14:anchorId="6B24D525" wp14:editId="7F11E3A6">
-                <wp:extent cx="6645910" cy="19050"/>
-                <wp:effectExtent l="0" t="0" r="0" b="0"/>
-                <wp:docPr id="2" name="Shape1"/>
-                <wp:cNvGraphicFramePr/>
-                <a:graphic xmlns:a="http://schemas.openxmlformats.org/drawingml/2006/main">
-                  <a:graphicData uri="http://schemas.microsoft.com/office/word/2010/wordprocessingShape">
-                    <wps:wsp>
-                      <wps:cNvSpPr/>
-                      <wps:spPr>
-                        <a:xfrm>
-                          <a:off x="0" y="0"/>
-                          <a:ext cx="6645960" cy="19080"/>
-                        </a:xfrm>
-                        <a:prstGeom prst="rect">
-                          <a:avLst/>
-                        </a:prstGeom>
-                        <a:solidFill>
-                          <a:srgbClr val="A0A0A0"/>
-                        </a:solidFill>
-                        <a:ln w="0">
-                          <a:noFill/>
-                        </a:ln>
-                      </wps:spPr>
-                      <wps:style>
-                        <a:lnRef idx="0">
-                          <a:scrgbClr r="0" g="0" b="0"/>
-                        </a:lnRef>
-                        <a:fillRef idx="0">
-                          <a:scrgbClr r="0" g="0" b="0"/>
-                        </a:fillRef>
-                        <a:effectRef idx="0">
-                          <a:scrgbClr r="0" g="0" b="0"/>
-                        </a:effectRef>
-                        <a:fontRef idx="minor"/>
-                      </wps:style>
-                      <wps:bodyPr/>
-                    </wps:wsp>
-                  </a:graphicData>
-                </a:graphic>
-              </wp:inline>
-            </w:drawing>
-          </mc:Choice>
-          <mc:Fallback xmlns:pic="http://schemas.openxmlformats.org/drawingml/2006/picture">
-            <w:pict>
-              <v:rect id="shape_0" fillcolor="#a0a0a0" stroked="f" o:allowincell="f" style="position:absolute;margin-left:0pt;margin-top:-1.55pt;width:523.25pt;height:1.45pt;mso-wrap-style:none;v-text-anchor:middle;mso-position-vertical:top">
-                <v:fill o:detectmouseclick="t" type="solid" color2="#5f5f5f"/>
-                <v:stroke color="#3465a4" joinstyle="round" endcap="flat"/>
-                <w10:wrap type="square"/>
-              </v:rect>
-            </w:pict>
-          </mc:Fallback>
-        </mc:AlternateContent>
-      </w:r>
-      <w:bookmarkStart w:id="6" w:name="_6yao6dtxiwyx"/>
-      <w:bookmarkEnd w:id="6"/>
-      <w:r>
-        <w:br w:type="page"/>
-      </w:r>
-    </w:p>
-    <w:p>
-      <w:pPr>
         <w:pStyle w:val="Heading2"/>
         <w:spacing w:before="0"/>
       </w:pPr>
-      <w:bookmarkStart w:id="7" w:name="_1fob9te"/>
-      <w:bookmarkEnd w:id="7"/>
+      <w:bookmarkStart w:id="6" w:name="_1fob9te"/>
+      <w:bookmarkEnd w:id="6"/>
       <w:r>
-        <w:lastRenderedPageBreak/>
         <w:t>Sprint #1</w:t>
       </w:r>
     </w:p>
@@ -1103,8 +1754,8 @@
               <w:pStyle w:val="Heading4"/>
               <w:spacing w:line="276" w:lineRule="auto"/>
             </w:pPr>
-            <w:bookmarkStart w:id="8" w:name="_m0rflwcs16jz"/>
-            <w:bookmarkEnd w:id="8"/>
+            <w:bookmarkStart w:id="7" w:name="_m0rflwcs16jz"/>
+            <w:bookmarkEnd w:id="7"/>
             <w:r>
               <w:t>Sprint #</w:t>
             </w:r>
@@ -1191,8 +1842,8 @@
         <w:pStyle w:val="Heading4"/>
         <w:spacing w:line="276" w:lineRule="auto"/>
       </w:pPr>
-      <w:bookmarkStart w:id="9" w:name="_1u65d5dep14r"/>
-      <w:bookmarkEnd w:id="9"/>
+      <w:bookmarkStart w:id="8" w:name="_1u65d5dep14r"/>
+      <w:bookmarkEnd w:id="8"/>
       <w:r>
         <w:t>Sprint #1 Testing</w:t>
       </w:r>
@@ -1504,28 +2155,18 @@
               </w:rPr>
               <w:t xml:space="preserve">Press </w:t>
             </w:r>
-            <w:proofErr w:type="spellStart"/>
-            <w:r>
-              <w:rPr>
-                <w:rFonts w:ascii="Calibri" w:eastAsia="Calibri" w:hAnsi="Calibri" w:cs="Calibri"/>
-              </w:rPr>
-              <w:t>buttom</w:t>
-            </w:r>
-            <w:proofErr w:type="spellEnd"/>
+            <w:r>
+              <w:rPr>
+                <w:rFonts w:ascii="Calibri" w:eastAsia="Calibri" w:hAnsi="Calibri" w:cs="Calibri"/>
+              </w:rPr>
+              <w:t>button</w:t>
+            </w:r>
             <w:r>
               <w:rPr>
                 <w:rFonts w:ascii="Calibri" w:eastAsia="Calibri" w:hAnsi="Calibri" w:cs="Calibri"/>
               </w:rPr>
               <w:t xml:space="preserve"> and go to site </w:t>
             </w:r>
-            <w:proofErr w:type="spellStart"/>
-            <w:r>
-              <w:rPr>
-                <w:rFonts w:ascii="Calibri" w:eastAsia="Calibri" w:hAnsi="Calibri" w:cs="Calibri"/>
-              </w:rPr>
-              <w:t>LOl</w:t>
-            </w:r>
-            <w:proofErr w:type="spellEnd"/>
           </w:p>
         </w:tc>
         <w:tc>
@@ -1678,264 +2319,6 @@
               </w:rPr>
               <w:t xml:space="preserve">Pass </w:t>
             </w:r>
-          </w:p>
-        </w:tc>
-      </w:tr>
-      <w:tr>
-        <w:tc>
-          <w:tcPr>
-            <w:tcW w:w="3480" w:type="dxa"/>
-            <w:tcBorders>
-              <w:top w:val="single" w:sz="8" w:space="0" w:color="000000"/>
-              <w:left w:val="single" w:sz="8" w:space="0" w:color="000000"/>
-              <w:bottom w:val="single" w:sz="8" w:space="0" w:color="000000"/>
-              <w:right w:val="single" w:sz="8" w:space="0" w:color="000000"/>
-            </w:tcBorders>
-          </w:tcPr>
-          <w:p>
-            <w:pPr>
-              <w:pStyle w:val="normal1"/>
-              <w:widowControl w:val="0"/>
-              <w:spacing w:line="240" w:lineRule="auto"/>
-              <w:rPr>
-                <w:rFonts w:ascii="Calibri" w:eastAsia="Calibri" w:hAnsi="Calibri" w:cs="Calibri"/>
-              </w:rPr>
-            </w:pPr>
-          </w:p>
-        </w:tc>
-        <w:tc>
-          <w:tcPr>
-            <w:tcW w:w="2820" w:type="dxa"/>
-            <w:tcBorders>
-              <w:top w:val="single" w:sz="8" w:space="0" w:color="000000"/>
-              <w:left w:val="single" w:sz="8" w:space="0" w:color="000000"/>
-              <w:bottom w:val="single" w:sz="8" w:space="0" w:color="000000"/>
-              <w:right w:val="single" w:sz="8" w:space="0" w:color="000000"/>
-            </w:tcBorders>
-          </w:tcPr>
-          <w:p>
-            <w:pPr>
-              <w:pStyle w:val="normal1"/>
-              <w:widowControl w:val="0"/>
-              <w:spacing w:line="240" w:lineRule="auto"/>
-              <w:rPr>
-                <w:rFonts w:ascii="Calibri" w:eastAsia="Calibri" w:hAnsi="Calibri" w:cs="Calibri"/>
-              </w:rPr>
-            </w:pPr>
-          </w:p>
-        </w:tc>
-        <w:tc>
-          <w:tcPr>
-            <w:tcW w:w="3088" w:type="dxa"/>
-            <w:tcBorders>
-              <w:top w:val="single" w:sz="8" w:space="0" w:color="000000"/>
-              <w:left w:val="single" w:sz="8" w:space="0" w:color="000000"/>
-              <w:bottom w:val="single" w:sz="8" w:space="0" w:color="000000"/>
-              <w:right w:val="single" w:sz="8" w:space="0" w:color="000000"/>
-            </w:tcBorders>
-          </w:tcPr>
-          <w:p>
-            <w:pPr>
-              <w:pStyle w:val="normal1"/>
-              <w:widowControl w:val="0"/>
-              <w:spacing w:line="240" w:lineRule="auto"/>
-              <w:rPr>
-                <w:rFonts w:ascii="Calibri" w:eastAsia="Calibri" w:hAnsi="Calibri" w:cs="Calibri"/>
-              </w:rPr>
-            </w:pPr>
-          </w:p>
-        </w:tc>
-        <w:tc>
-          <w:tcPr>
-            <w:tcW w:w="1067" w:type="dxa"/>
-            <w:tcBorders>
-              <w:top w:val="single" w:sz="8" w:space="0" w:color="000000"/>
-              <w:left w:val="single" w:sz="8" w:space="0" w:color="000000"/>
-              <w:bottom w:val="single" w:sz="8" w:space="0" w:color="000000"/>
-              <w:right w:val="single" w:sz="8" w:space="0" w:color="000000"/>
-            </w:tcBorders>
-          </w:tcPr>
-          <w:p>
-            <w:pPr>
-              <w:pStyle w:val="normal1"/>
-              <w:widowControl w:val="0"/>
-              <w:spacing w:line="240" w:lineRule="auto"/>
-              <w:rPr>
-                <w:rFonts w:ascii="Calibri" w:eastAsia="Calibri" w:hAnsi="Calibri" w:cs="Calibri"/>
-              </w:rPr>
-            </w:pPr>
-          </w:p>
-        </w:tc>
-      </w:tr>
-      <w:tr>
-        <w:tc>
-          <w:tcPr>
-            <w:tcW w:w="3480" w:type="dxa"/>
-            <w:tcBorders>
-              <w:top w:val="single" w:sz="8" w:space="0" w:color="000000"/>
-              <w:left w:val="single" w:sz="8" w:space="0" w:color="000000"/>
-              <w:bottom w:val="single" w:sz="8" w:space="0" w:color="000000"/>
-              <w:right w:val="single" w:sz="8" w:space="0" w:color="000000"/>
-            </w:tcBorders>
-          </w:tcPr>
-          <w:p>
-            <w:pPr>
-              <w:pStyle w:val="normal1"/>
-              <w:widowControl w:val="0"/>
-              <w:spacing w:line="240" w:lineRule="auto"/>
-              <w:rPr>
-                <w:rFonts w:ascii="Calibri" w:eastAsia="Calibri" w:hAnsi="Calibri" w:cs="Calibri"/>
-              </w:rPr>
-            </w:pPr>
-          </w:p>
-        </w:tc>
-        <w:tc>
-          <w:tcPr>
-            <w:tcW w:w="2820" w:type="dxa"/>
-            <w:tcBorders>
-              <w:top w:val="single" w:sz="8" w:space="0" w:color="000000"/>
-              <w:left w:val="single" w:sz="8" w:space="0" w:color="000000"/>
-              <w:bottom w:val="single" w:sz="8" w:space="0" w:color="000000"/>
-              <w:right w:val="single" w:sz="8" w:space="0" w:color="000000"/>
-            </w:tcBorders>
-          </w:tcPr>
-          <w:p>
-            <w:pPr>
-              <w:pStyle w:val="normal1"/>
-              <w:widowControl w:val="0"/>
-              <w:spacing w:line="240" w:lineRule="auto"/>
-              <w:rPr>
-                <w:rFonts w:ascii="Calibri" w:eastAsia="Calibri" w:hAnsi="Calibri" w:cs="Calibri"/>
-              </w:rPr>
-            </w:pPr>
-          </w:p>
-        </w:tc>
-        <w:tc>
-          <w:tcPr>
-            <w:tcW w:w="3088" w:type="dxa"/>
-            <w:tcBorders>
-              <w:top w:val="single" w:sz="8" w:space="0" w:color="000000"/>
-              <w:left w:val="single" w:sz="8" w:space="0" w:color="000000"/>
-              <w:bottom w:val="single" w:sz="8" w:space="0" w:color="000000"/>
-              <w:right w:val="single" w:sz="8" w:space="0" w:color="000000"/>
-            </w:tcBorders>
-          </w:tcPr>
-          <w:p>
-            <w:pPr>
-              <w:pStyle w:val="normal1"/>
-              <w:widowControl w:val="0"/>
-              <w:spacing w:line="240" w:lineRule="auto"/>
-              <w:rPr>
-                <w:rFonts w:ascii="Calibri" w:eastAsia="Calibri" w:hAnsi="Calibri" w:cs="Calibri"/>
-              </w:rPr>
-            </w:pPr>
-          </w:p>
-        </w:tc>
-        <w:tc>
-          <w:tcPr>
-            <w:tcW w:w="1067" w:type="dxa"/>
-            <w:tcBorders>
-              <w:top w:val="single" w:sz="8" w:space="0" w:color="000000"/>
-              <w:left w:val="single" w:sz="8" w:space="0" w:color="000000"/>
-              <w:bottom w:val="single" w:sz="8" w:space="0" w:color="000000"/>
-              <w:right w:val="single" w:sz="8" w:space="0" w:color="000000"/>
-            </w:tcBorders>
-          </w:tcPr>
-          <w:p>
-            <w:pPr>
-              <w:pStyle w:val="normal1"/>
-              <w:widowControl w:val="0"/>
-              <w:spacing w:line="240" w:lineRule="auto"/>
-              <w:rPr>
-                <w:rFonts w:ascii="Calibri" w:eastAsia="Calibri" w:hAnsi="Calibri" w:cs="Calibri"/>
-              </w:rPr>
-            </w:pPr>
-          </w:p>
-        </w:tc>
-      </w:tr>
-      <w:tr>
-        <w:tc>
-          <w:tcPr>
-            <w:tcW w:w="3480" w:type="dxa"/>
-            <w:tcBorders>
-              <w:top w:val="single" w:sz="8" w:space="0" w:color="000000"/>
-              <w:left w:val="single" w:sz="8" w:space="0" w:color="000000"/>
-              <w:bottom w:val="single" w:sz="8" w:space="0" w:color="000000"/>
-              <w:right w:val="single" w:sz="8" w:space="0" w:color="000000"/>
-            </w:tcBorders>
-          </w:tcPr>
-          <w:p>
-            <w:pPr>
-              <w:pStyle w:val="normal1"/>
-              <w:widowControl w:val="0"/>
-              <w:spacing w:line="240" w:lineRule="auto"/>
-              <w:rPr>
-                <w:rFonts w:ascii="Calibri" w:eastAsia="Calibri" w:hAnsi="Calibri" w:cs="Calibri"/>
-              </w:rPr>
-            </w:pPr>
-          </w:p>
-        </w:tc>
-        <w:tc>
-          <w:tcPr>
-            <w:tcW w:w="2820" w:type="dxa"/>
-            <w:tcBorders>
-              <w:top w:val="single" w:sz="8" w:space="0" w:color="000000"/>
-              <w:left w:val="single" w:sz="8" w:space="0" w:color="000000"/>
-              <w:bottom w:val="single" w:sz="8" w:space="0" w:color="000000"/>
-              <w:right w:val="single" w:sz="8" w:space="0" w:color="000000"/>
-            </w:tcBorders>
-          </w:tcPr>
-          <w:p>
-            <w:pPr>
-              <w:pStyle w:val="normal1"/>
-              <w:widowControl w:val="0"/>
-              <w:spacing w:line="240" w:lineRule="auto"/>
-              <w:rPr>
-                <w:rFonts w:ascii="Calibri" w:eastAsia="Calibri" w:hAnsi="Calibri" w:cs="Calibri"/>
-              </w:rPr>
-            </w:pPr>
-          </w:p>
-        </w:tc>
-        <w:tc>
-          <w:tcPr>
-            <w:tcW w:w="3088" w:type="dxa"/>
-            <w:tcBorders>
-              <w:top w:val="single" w:sz="8" w:space="0" w:color="000000"/>
-              <w:left w:val="single" w:sz="8" w:space="0" w:color="000000"/>
-              <w:bottom w:val="single" w:sz="8" w:space="0" w:color="000000"/>
-              <w:right w:val="single" w:sz="8" w:space="0" w:color="000000"/>
-            </w:tcBorders>
-          </w:tcPr>
-          <w:p>
-            <w:pPr>
-              <w:pStyle w:val="normal1"/>
-              <w:widowControl w:val="0"/>
-              <w:spacing w:line="240" w:lineRule="auto"/>
-              <w:rPr>
-                <w:rFonts w:ascii="Calibri" w:eastAsia="Calibri" w:hAnsi="Calibri" w:cs="Calibri"/>
-              </w:rPr>
-            </w:pPr>
-          </w:p>
-        </w:tc>
-        <w:tc>
-          <w:tcPr>
-            <w:tcW w:w="1067" w:type="dxa"/>
-            <w:tcBorders>
-              <w:top w:val="single" w:sz="8" w:space="0" w:color="000000"/>
-              <w:left w:val="single" w:sz="8" w:space="0" w:color="000000"/>
-              <w:bottom w:val="single" w:sz="8" w:space="0" w:color="000000"/>
-              <w:right w:val="single" w:sz="8" w:space="0" w:color="000000"/>
-            </w:tcBorders>
-          </w:tcPr>
-          <w:p>
-            <w:pPr>
-              <w:pStyle w:val="normal1"/>
-              <w:widowControl w:val="0"/>
-              <w:spacing w:line="240" w:lineRule="auto"/>
-              <w:rPr>
-                <w:rFonts w:ascii="Calibri" w:eastAsia="Calibri" w:hAnsi="Calibri" w:cs="Calibri"/>
-              </w:rPr>
-            </w:pPr>
           </w:p>
         </w:tc>
       </w:tr>
@@ -2039,8 +2422,8 @@
         <w:pStyle w:val="Heading4"/>
         <w:spacing w:line="276" w:lineRule="auto"/>
       </w:pPr>
-      <w:bookmarkStart w:id="10" w:name="_rrl0k1xbjono"/>
-      <w:bookmarkEnd w:id="10"/>
+      <w:bookmarkStart w:id="9" w:name="_rrl0k1xbjono"/>
+      <w:bookmarkEnd w:id="9"/>
       <w:r>
         <w:t>Sprint #1 Review</w:t>
       </w:r>
@@ -2164,23 +2547,33 @@
               <w:spacing w:line="240" w:lineRule="auto"/>
             </w:pPr>
             <w:r>
-              <w:t xml:space="preserve">I think </w:t>
+              <w:t>I was unable to work on my website</w:t>
+            </w:r>
+            <w:r>
+              <w:t xml:space="preserve"> </w:t>
+            </w:r>
+            <w:r>
+              <w:t>because</w:t>
+            </w:r>
+            <w:r>
+              <w:t xml:space="preserve"> </w:t>
+            </w:r>
+            <w:r>
+              <w:t>the</w:t>
+            </w:r>
+            <w:r>
+              <w:t xml:space="preserve"> laptop</w:t>
+            </w:r>
+            <w:r>
+              <w:t xml:space="preserve"> I was </w:t>
             </w:r>
             <w:proofErr w:type="gramStart"/>
             <w:r>
-              <w:t>unable</w:t>
+              <w:t>use</w:t>
             </w:r>
             <w:proofErr w:type="gramEnd"/>
             <w:r>
-              <w:t xml:space="preserve"> to work on my website is because of my old laptop </w:t>
-            </w:r>
-            <w:proofErr w:type="gramStart"/>
-            <w:r>
-              <w:t>made</w:t>
-            </w:r>
-            <w:proofErr w:type="gramEnd"/>
-            <w:r>
-              <w:t xml:space="preserve"> it unusable to get work on in this class (and others too), and it being </w:t>
+              <w:t xml:space="preserve"> made it unusable to get work on in this class (and others too), and it being </w:t>
             </w:r>
             <w:proofErr w:type="gramStart"/>
             <w:r>
@@ -2233,11 +2626,6 @@
         </w:tc>
       </w:tr>
     </w:tbl>
-    <w:p>
-      <w:pPr>
-        <w:pStyle w:val="normal1"/>
-      </w:pPr>
-    </w:p>
     <w:p>
       <w:pPr>
         <w:pStyle w:val="normal1"/>
@@ -2245,67 +2633,6 @@
           <w:rFonts w:ascii="Calibri" w:eastAsia="Calibri" w:hAnsi="Calibri" w:cs="Calibri"/>
         </w:rPr>
       </w:pPr>
-      <w:r>
-        <w:rPr>
-          <w:noProof/>
-        </w:rPr>
-        <mc:AlternateContent>
-          <mc:Choice Requires="wps">
-            <w:drawing>
-              <wp:inline distT="0" distB="0" distL="0" distR="0" wp14:anchorId="6C575734" wp14:editId="6DB9687D">
-                <wp:extent cx="6645910" cy="19050"/>
-                <wp:effectExtent l="0" t="0" r="0" b="0"/>
-                <wp:docPr id="3" name="Shape2"/>
-                <wp:cNvGraphicFramePr/>
-                <a:graphic xmlns:a="http://schemas.openxmlformats.org/drawingml/2006/main">
-                  <a:graphicData uri="http://schemas.microsoft.com/office/word/2010/wordprocessingShape">
-                    <wps:wsp>
-                      <wps:cNvSpPr/>
-                      <wps:spPr>
-                        <a:xfrm>
-                          <a:off x="0" y="0"/>
-                          <a:ext cx="6645960" cy="19080"/>
-                        </a:xfrm>
-                        <a:prstGeom prst="rect">
-                          <a:avLst/>
-                        </a:prstGeom>
-                        <a:solidFill>
-                          <a:srgbClr val="A0A0A0"/>
-                        </a:solidFill>
-                        <a:ln w="0">
-                          <a:noFill/>
-                        </a:ln>
-                      </wps:spPr>
-                      <wps:style>
-                        <a:lnRef idx="0">
-                          <a:scrgbClr r="0" g="0" b="0"/>
-                        </a:lnRef>
-                        <a:fillRef idx="0">
-                          <a:scrgbClr r="0" g="0" b="0"/>
-                        </a:fillRef>
-                        <a:effectRef idx="0">
-                          <a:scrgbClr r="0" g="0" b="0"/>
-                        </a:effectRef>
-                        <a:fontRef idx="minor"/>
-                      </wps:style>
-                      <wps:bodyPr/>
-                    </wps:wsp>
-                  </a:graphicData>
-                </a:graphic>
-              </wp:inline>
-            </w:drawing>
-          </mc:Choice>
-          <mc:Fallback xmlns:pic="http://schemas.openxmlformats.org/drawingml/2006/picture">
-            <w:pict>
-              <v:rect id="shape_0" fillcolor="#a0a0a0" stroked="f" o:allowincell="f" style="position:absolute;margin-left:0pt;margin-top:-1.55pt;width:523.25pt;height:1.45pt;mso-wrap-style:none;v-text-anchor:middle;mso-position-vertical:top">
-                <v:fill o:detectmouseclick="t" type="solid" color2="#5f5f5f"/>
-                <v:stroke color="#3465a4" joinstyle="round" endcap="flat"/>
-                <w10:wrap type="square"/>
-              </v:rect>
-            </w:pict>
-          </mc:Fallback>
-        </mc:AlternateContent>
-      </w:r>
       <w:r>
         <w:br w:type="page"/>
       </w:r>
@@ -2315,8 +2642,8 @@
         <w:pStyle w:val="Heading2"/>
         <w:spacing w:before="0"/>
       </w:pPr>
-      <w:bookmarkStart w:id="11" w:name="_glqkyccsy55h"/>
-      <w:bookmarkEnd w:id="11"/>
+      <w:bookmarkStart w:id="10" w:name="_glqkyccsy55h"/>
+      <w:bookmarkEnd w:id="10"/>
       <w:r>
         <w:lastRenderedPageBreak/>
         <w:t>Sprint #2</w:t>
@@ -2350,8 +2677,8 @@
               <w:pStyle w:val="Heading4"/>
               <w:spacing w:line="276" w:lineRule="auto"/>
             </w:pPr>
-            <w:bookmarkStart w:id="12" w:name="_54dx6as8tvnm"/>
-            <w:bookmarkEnd w:id="12"/>
+            <w:bookmarkStart w:id="11" w:name="_54dx6as8tvnm"/>
+            <w:bookmarkEnd w:id="11"/>
             <w:r>
               <w:t>Sprint #</w:t>
             </w:r>
@@ -2439,22 +2766,16 @@
             </w:r>
             <w:proofErr w:type="spellEnd"/>
             <w:r>
-              <w:t xml:space="preserve"> thing for users to type in for stuff.</w:t>
-            </w:r>
-          </w:p>
-          <w:p>
-            <w:pPr>
-              <w:pStyle w:val="normal1"/>
-              <w:widowControl w:val="0"/>
-              <w:spacing w:line="240" w:lineRule="auto"/>
-            </w:pPr>
-          </w:p>
-          <w:p>
-            <w:pPr>
-              <w:pStyle w:val="normal1"/>
-              <w:widowControl w:val="0"/>
-              <w:spacing w:line="240" w:lineRule="auto"/>
-            </w:pPr>
+              <w:t xml:space="preserve"> </w:t>
+            </w:r>
+            <w:proofErr w:type="gramStart"/>
+            <w:r>
+              <w:t>thing</w:t>
+            </w:r>
+            <w:proofErr w:type="gramEnd"/>
+            <w:r>
+              <w:t xml:space="preserve"> for users to type in for stuff.</w:t>
+            </w:r>
           </w:p>
         </w:tc>
       </w:tr>
@@ -2472,8 +2793,8 @@
         <w:pStyle w:val="Heading4"/>
         <w:spacing w:line="276" w:lineRule="auto"/>
       </w:pPr>
-      <w:bookmarkStart w:id="13" w:name="_tzl39wtdu3rs"/>
-      <w:bookmarkEnd w:id="13"/>
+      <w:bookmarkStart w:id="12" w:name="_tzl39wtdu3rs"/>
+      <w:bookmarkEnd w:id="12"/>
       <w:r>
         <w:t>Database improvements (if any)</w:t>
       </w:r>
@@ -2529,202 +2850,58 @@
                 <w:rFonts w:ascii="Calibri" w:eastAsia="Calibri" w:hAnsi="Calibri" w:cs="Calibri"/>
               </w:rPr>
             </w:pPr>
-          </w:p>
-          <w:p>
-            <w:pPr>
-              <w:pStyle w:val="normal1"/>
-              <w:widowControl w:val="0"/>
-              <w:spacing w:line="240" w:lineRule="auto"/>
-              <w:rPr>
-                <w:rFonts w:ascii="Calibri" w:eastAsia="Calibri" w:hAnsi="Calibri" w:cs="Calibri"/>
-              </w:rPr>
-            </w:pPr>
-            <w:r>
-              <w:rPr>
-                <w:rFonts w:ascii="Calibri" w:eastAsia="Calibri" w:hAnsi="Calibri" w:cs="Calibri"/>
-              </w:rPr>
-              <w:t>--</w:t>
-            </w:r>
-          </w:p>
-          <w:p>
-            <w:pPr>
-              <w:pStyle w:val="normal1"/>
-              <w:widowControl w:val="0"/>
-              <w:spacing w:line="240" w:lineRule="auto"/>
-              <w:rPr>
-                <w:rFonts w:ascii="Calibri" w:eastAsia="Calibri" w:hAnsi="Calibri" w:cs="Calibri"/>
-              </w:rPr>
-            </w:pPr>
-          </w:p>
-          <w:p>
-            <w:pPr>
-              <w:pStyle w:val="normal1"/>
-              <w:widowControl w:val="0"/>
-              <w:spacing w:line="240" w:lineRule="auto"/>
-              <w:rPr>
-                <w:rFonts w:ascii="Calibri" w:eastAsia="Calibri" w:hAnsi="Calibri" w:cs="Calibri"/>
-              </w:rPr>
-            </w:pPr>
-          </w:p>
-          <w:p>
-            <w:pPr>
-              <w:pStyle w:val="normal1"/>
-              <w:widowControl w:val="0"/>
-              <w:spacing w:line="240" w:lineRule="auto"/>
-              <w:rPr>
-                <w:rFonts w:ascii="Calibri" w:eastAsia="Calibri" w:hAnsi="Calibri" w:cs="Calibri"/>
-              </w:rPr>
-            </w:pPr>
-          </w:p>
-          <w:p>
-            <w:pPr>
-              <w:pStyle w:val="normal1"/>
-              <w:widowControl w:val="0"/>
-              <w:spacing w:line="240" w:lineRule="auto"/>
-              <w:rPr>
-                <w:rFonts w:ascii="Calibri" w:eastAsia="Calibri" w:hAnsi="Calibri" w:cs="Calibri"/>
-              </w:rPr>
-            </w:pPr>
-          </w:p>
-          <w:p>
-            <w:pPr>
-              <w:pStyle w:val="normal1"/>
-              <w:widowControl w:val="0"/>
-              <w:spacing w:line="240" w:lineRule="auto"/>
-              <w:rPr>
-                <w:rFonts w:ascii="Calibri" w:eastAsia="Calibri" w:hAnsi="Calibri" w:cs="Calibri"/>
-              </w:rPr>
-            </w:pPr>
-          </w:p>
-          <w:p>
-            <w:pPr>
-              <w:pStyle w:val="normal1"/>
-              <w:widowControl w:val="0"/>
-              <w:spacing w:line="240" w:lineRule="auto"/>
-              <w:rPr>
-                <w:rFonts w:ascii="Calibri" w:eastAsia="Calibri" w:hAnsi="Calibri" w:cs="Calibri"/>
-              </w:rPr>
-            </w:pPr>
-          </w:p>
-          <w:p>
-            <w:pPr>
-              <w:pStyle w:val="normal1"/>
-              <w:widowControl w:val="0"/>
-              <w:spacing w:line="240" w:lineRule="auto"/>
-              <w:rPr>
-                <w:rFonts w:ascii="Calibri" w:eastAsia="Calibri" w:hAnsi="Calibri" w:cs="Calibri"/>
-              </w:rPr>
-            </w:pPr>
-          </w:p>
-          <w:p>
-            <w:pPr>
-              <w:pStyle w:val="normal1"/>
-              <w:widowControl w:val="0"/>
-              <w:spacing w:line="240" w:lineRule="auto"/>
-              <w:rPr>
-                <w:rFonts w:ascii="Calibri" w:eastAsia="Calibri" w:hAnsi="Calibri" w:cs="Calibri"/>
-              </w:rPr>
-            </w:pPr>
-          </w:p>
-          <w:p>
-            <w:pPr>
-              <w:pStyle w:val="normal1"/>
-              <w:widowControl w:val="0"/>
-              <w:spacing w:line="240" w:lineRule="auto"/>
-              <w:rPr>
-                <w:rFonts w:ascii="Calibri" w:eastAsia="Calibri" w:hAnsi="Calibri" w:cs="Calibri"/>
-              </w:rPr>
-            </w:pPr>
-          </w:p>
-          <w:p>
-            <w:pPr>
-              <w:pStyle w:val="normal1"/>
-              <w:widowControl w:val="0"/>
-              <w:spacing w:line="240" w:lineRule="auto"/>
-              <w:rPr>
-                <w:rFonts w:ascii="Calibri" w:eastAsia="Calibri" w:hAnsi="Calibri" w:cs="Calibri"/>
-              </w:rPr>
-            </w:pPr>
-          </w:p>
-          <w:p>
-            <w:pPr>
-              <w:pStyle w:val="normal1"/>
-              <w:widowControl w:val="0"/>
-              <w:spacing w:line="240" w:lineRule="auto"/>
-              <w:rPr>
-                <w:rFonts w:ascii="Calibri" w:eastAsia="Calibri" w:hAnsi="Calibri" w:cs="Calibri"/>
-              </w:rPr>
-            </w:pPr>
-          </w:p>
-          <w:p>
-            <w:pPr>
-              <w:pStyle w:val="normal1"/>
-              <w:widowControl w:val="0"/>
-              <w:spacing w:line="240" w:lineRule="auto"/>
-              <w:rPr>
-                <w:rFonts w:ascii="Calibri" w:eastAsia="Calibri" w:hAnsi="Calibri" w:cs="Calibri"/>
-              </w:rPr>
-            </w:pPr>
-          </w:p>
-          <w:p>
-            <w:pPr>
-              <w:pStyle w:val="normal1"/>
-              <w:widowControl w:val="0"/>
-              <w:spacing w:line="240" w:lineRule="auto"/>
-              <w:rPr>
-                <w:rFonts w:ascii="Calibri" w:eastAsia="Calibri" w:hAnsi="Calibri" w:cs="Calibri"/>
-              </w:rPr>
-            </w:pPr>
-          </w:p>
-          <w:p>
-            <w:pPr>
-              <w:pStyle w:val="normal1"/>
-              <w:widowControl w:val="0"/>
-              <w:spacing w:line="240" w:lineRule="auto"/>
-              <w:rPr>
-                <w:rFonts w:ascii="Calibri" w:eastAsia="Calibri" w:hAnsi="Calibri" w:cs="Calibri"/>
-              </w:rPr>
-            </w:pPr>
-          </w:p>
-          <w:p>
-            <w:pPr>
-              <w:pStyle w:val="normal1"/>
-              <w:widowControl w:val="0"/>
-              <w:spacing w:line="240" w:lineRule="auto"/>
-              <w:rPr>
-                <w:rFonts w:ascii="Calibri" w:eastAsia="Calibri" w:hAnsi="Calibri" w:cs="Calibri"/>
-              </w:rPr>
-            </w:pPr>
-          </w:p>
-          <w:p>
-            <w:pPr>
-              <w:pStyle w:val="normal1"/>
-              <w:widowControl w:val="0"/>
-              <w:spacing w:line="240" w:lineRule="auto"/>
-              <w:rPr>
-                <w:rFonts w:ascii="Calibri" w:eastAsia="Calibri" w:hAnsi="Calibri" w:cs="Calibri"/>
-              </w:rPr>
-            </w:pPr>
-          </w:p>
-          <w:p>
-            <w:pPr>
-              <w:pStyle w:val="normal1"/>
-              <w:widowControl w:val="0"/>
-              <w:spacing w:line="240" w:lineRule="auto"/>
-              <w:rPr>
-                <w:rFonts w:ascii="Calibri" w:eastAsia="Calibri" w:hAnsi="Calibri" w:cs="Calibri"/>
-              </w:rPr>
-            </w:pPr>
-          </w:p>
-          <w:p>
-            <w:pPr>
-              <w:pStyle w:val="normal1"/>
-              <w:widowControl w:val="0"/>
-              <w:spacing w:line="240" w:lineRule="auto"/>
-              <w:rPr>
-                <w:rFonts w:ascii="Calibri" w:eastAsia="Calibri" w:hAnsi="Calibri" w:cs="Calibri"/>
-              </w:rPr>
-            </w:pPr>
+            <w:r>
+              <w:rPr>
+                <w:rFonts w:ascii="Calibri" w:eastAsia="Calibri" w:hAnsi="Calibri" w:cs="Calibri"/>
+                <w:noProof/>
+              </w:rPr>
+              <w:drawing>
+                <wp:anchor distT="0" distB="0" distL="0" distR="0" simplePos="0" relativeHeight="251659264" behindDoc="0" locked="0" layoutInCell="0" allowOverlap="1" wp14:anchorId="17F4C1BA" wp14:editId="23B8C2DB">
+                  <wp:simplePos x="0" y="0"/>
+                  <wp:positionH relativeFrom="column">
+                    <wp:posOffset>-5080</wp:posOffset>
+                  </wp:positionH>
+                  <wp:positionV relativeFrom="paragraph">
+                    <wp:posOffset>178435</wp:posOffset>
+                  </wp:positionV>
+                  <wp:extent cx="6518910" cy="1334770"/>
+                  <wp:effectExtent l="0" t="0" r="0" b="0"/>
+                  <wp:wrapSquare wrapText="largest"/>
+                  <wp:docPr id="413524146" name="Image3"/>
+                  <wp:cNvGraphicFramePr>
+                    <a:graphicFrameLocks xmlns:a="http://schemas.openxmlformats.org/drawingml/2006/main" noChangeAspect="1"/>
+                  </wp:cNvGraphicFramePr>
+                  <a:graphic xmlns:a="http://schemas.openxmlformats.org/drawingml/2006/main">
+                    <a:graphicData uri="http://schemas.openxmlformats.org/drawingml/2006/picture">
+                      <pic:pic xmlns:pic="http://schemas.openxmlformats.org/drawingml/2006/picture">
+                        <pic:nvPicPr>
+                          <pic:cNvPr id="1" name="Image3"/>
+                          <pic:cNvPicPr>
+                            <a:picLocks noChangeAspect="1" noChangeArrowheads="1"/>
+                          </pic:cNvPicPr>
+                        </pic:nvPicPr>
+                        <pic:blipFill>
+                          <a:blip r:embed="rId7"/>
+                          <a:stretch>
+                            <a:fillRect/>
+                          </a:stretch>
+                        </pic:blipFill>
+                        <pic:spPr bwMode="auto">
+                          <a:xfrm>
+                            <a:off x="0" y="0"/>
+                            <a:ext cx="6518910" cy="1334770"/>
+                          </a:xfrm>
+                          <a:prstGeom prst="rect">
+                            <a:avLst/>
+                          </a:prstGeom>
+                          <a:noFill/>
+                        </pic:spPr>
+                      </pic:pic>
+                    </a:graphicData>
+                  </a:graphic>
+                </wp:anchor>
+              </w:drawing>
+            </w:r>
           </w:p>
           <w:p>
             <w:pPr>
@@ -2759,8 +2936,8 @@
         <w:pStyle w:val="Heading4"/>
         <w:spacing w:line="276" w:lineRule="auto"/>
       </w:pPr>
-      <w:bookmarkStart w:id="14" w:name="_qkkrxelvhheh"/>
-      <w:bookmarkEnd w:id="14"/>
+      <w:bookmarkStart w:id="13" w:name="_qkkrxelvhheh"/>
+      <w:bookmarkEnd w:id="13"/>
       <w:proofErr w:type="spellStart"/>
       <w:r>
         <w:t>WebPage</w:t>
@@ -2809,60 +2986,44 @@
             <w:pPr>
               <w:pStyle w:val="normal1"/>
               <w:widowControl w:val="0"/>
-              <w:spacing w:line="240" w:lineRule="auto"/>
-            </w:pPr>
-          </w:p>
-          <w:p>
-            <w:pPr>
-              <w:pStyle w:val="normal1"/>
-              <w:widowControl w:val="0"/>
-              <w:spacing w:line="240" w:lineRule="auto"/>
-            </w:pPr>
-          </w:p>
-          <w:p>
-            <w:pPr>
-              <w:pStyle w:val="normal1"/>
-              <w:widowControl w:val="0"/>
-              <w:spacing w:line="240" w:lineRule="auto"/>
-            </w:pPr>
-            <w:r>
-              <w:t>--</w:t>
-            </w:r>
-          </w:p>
-          <w:p>
-            <w:pPr>
-              <w:pStyle w:val="normal1"/>
-              <w:widowControl w:val="0"/>
-              <w:spacing w:line="240" w:lineRule="auto"/>
-            </w:pPr>
-          </w:p>
-          <w:p>
-            <w:pPr>
-              <w:pStyle w:val="normal1"/>
-              <w:widowControl w:val="0"/>
-              <w:spacing w:line="240" w:lineRule="auto"/>
-            </w:pPr>
-          </w:p>
-          <w:p>
-            <w:pPr>
-              <w:pStyle w:val="normal1"/>
-              <w:widowControl w:val="0"/>
-              <w:spacing w:line="240" w:lineRule="auto"/>
-            </w:pPr>
-          </w:p>
-          <w:p>
-            <w:pPr>
-              <w:pStyle w:val="normal1"/>
-              <w:widowControl w:val="0"/>
-              <w:spacing w:line="240" w:lineRule="auto"/>
-            </w:pPr>
-          </w:p>
-          <w:p>
-            <w:pPr>
-              <w:pStyle w:val="normal1"/>
-              <w:widowControl w:val="0"/>
-              <w:spacing w:line="240" w:lineRule="auto"/>
-            </w:pPr>
+              <w:numPr>
+                <w:ilvl w:val="0"/>
+                <w:numId w:val="4"/>
+              </w:numPr>
+              <w:spacing w:line="240" w:lineRule="auto"/>
+            </w:pPr>
+            <w:r>
+              <w:t xml:space="preserve">I </w:t>
+            </w:r>
+            <w:proofErr w:type="gramStart"/>
+            <w:r>
+              <w:t>add</w:t>
+            </w:r>
+            <w:proofErr w:type="gramEnd"/>
+            <w:r>
+              <w:t xml:space="preserve"> </w:t>
+            </w:r>
+            <w:proofErr w:type="spellStart"/>
+            <w:r>
+              <w:t>colour</w:t>
+            </w:r>
+            <w:proofErr w:type="spellEnd"/>
+            <w:r>
+              <w:t xml:space="preserve"> for </w:t>
+            </w:r>
+            <w:proofErr w:type="spellStart"/>
+            <w:r>
+              <w:t>fillaur</w:t>
+            </w:r>
+            <w:proofErr w:type="spellEnd"/>
+            <w:r>
+              <w:t xml:space="preserve">. Is </w:t>
+            </w:r>
+            <w:proofErr w:type="spellStart"/>
+            <w:r>
+              <w:t>ugle</w:t>
+            </w:r>
+            <w:proofErr w:type="spellEnd"/>
           </w:p>
           <w:p>
             <w:pPr>
@@ -2874,11 +3035,6 @@
         </w:tc>
       </w:tr>
     </w:tbl>
-    <w:p>
-      <w:pPr>
-        <w:pStyle w:val="normal1"/>
-      </w:pPr>
-    </w:p>
     <w:p>
       <w:pPr>
         <w:pStyle w:val="normal1"/>
@@ -2889,8 +3045,8 @@
         <w:pStyle w:val="Heading4"/>
         <w:spacing w:line="276" w:lineRule="auto"/>
       </w:pPr>
-      <w:bookmarkStart w:id="15" w:name="_3syjt5olt100"/>
-      <w:bookmarkEnd w:id="15"/>
+      <w:bookmarkStart w:id="14" w:name="_3syjt5olt100"/>
+      <w:bookmarkEnd w:id="14"/>
       <w:r>
         <w:t>Sprint #2 Testing</w:t>
       </w:r>
@@ -3173,7 +3329,19 @@
               <w:rPr>
                 <w:rFonts w:ascii="Calibri" w:eastAsia="Calibri" w:hAnsi="Calibri" w:cs="Calibri"/>
               </w:rPr>
-              <w:t>textbox</w:t>
+              <w:t>T</w:t>
+            </w:r>
+            <w:r>
+              <w:rPr>
+                <w:rFonts w:ascii="Calibri" w:eastAsia="Calibri" w:hAnsi="Calibri" w:cs="Calibri"/>
+              </w:rPr>
+              <w:t>extbox</w:t>
+            </w:r>
+            <w:r>
+              <w:rPr>
+                <w:rFonts w:ascii="Calibri" w:eastAsia="Calibri" w:hAnsi="Calibri" w:cs="Calibri"/>
+              </w:rPr>
+              <w:t xml:space="preserve"> | gird area</w:t>
             </w:r>
           </w:p>
         </w:tc>
@@ -3381,178 +3549,12 @@
                 <w:rFonts w:ascii="Calibri" w:eastAsia="Calibri" w:hAnsi="Calibri" w:cs="Calibri"/>
               </w:rPr>
             </w:pPr>
-          </w:p>
-        </w:tc>
-        <w:tc>
-          <w:tcPr>
-            <w:tcW w:w="2822" w:type="dxa"/>
-            <w:tcBorders>
-              <w:top w:val="single" w:sz="8" w:space="0" w:color="000000"/>
-              <w:left w:val="single" w:sz="8" w:space="0" w:color="000000"/>
-              <w:bottom w:val="single" w:sz="8" w:space="0" w:color="000000"/>
-              <w:right w:val="single" w:sz="8" w:space="0" w:color="000000"/>
-            </w:tcBorders>
-          </w:tcPr>
-          <w:p>
-            <w:pPr>
-              <w:pStyle w:val="normal1"/>
-              <w:widowControl w:val="0"/>
-              <w:spacing w:line="240" w:lineRule="auto"/>
-              <w:rPr>
-                <w:rFonts w:ascii="Calibri" w:eastAsia="Calibri" w:hAnsi="Calibri" w:cs="Calibri"/>
-              </w:rPr>
-            </w:pPr>
-          </w:p>
-        </w:tc>
-        <w:tc>
-          <w:tcPr>
-            <w:tcW w:w="2983" w:type="dxa"/>
-            <w:tcBorders>
-              <w:top w:val="single" w:sz="8" w:space="0" w:color="000000"/>
-              <w:left w:val="single" w:sz="8" w:space="0" w:color="000000"/>
-              <w:bottom w:val="single" w:sz="8" w:space="0" w:color="000000"/>
-              <w:right w:val="single" w:sz="8" w:space="0" w:color="000000"/>
-            </w:tcBorders>
-          </w:tcPr>
-          <w:p>
-            <w:pPr>
-              <w:pStyle w:val="normal1"/>
-              <w:widowControl w:val="0"/>
-              <w:spacing w:line="240" w:lineRule="auto"/>
-              <w:rPr>
-                <w:rFonts w:ascii="Calibri" w:eastAsia="Calibri" w:hAnsi="Calibri" w:cs="Calibri"/>
-              </w:rPr>
-            </w:pPr>
-          </w:p>
-        </w:tc>
-        <w:tc>
-          <w:tcPr>
-            <w:tcW w:w="1052" w:type="dxa"/>
-            <w:tcBorders>
-              <w:top w:val="single" w:sz="8" w:space="0" w:color="000000"/>
-              <w:left w:val="single" w:sz="8" w:space="0" w:color="000000"/>
-              <w:bottom w:val="single" w:sz="8" w:space="0" w:color="000000"/>
-              <w:right w:val="single" w:sz="8" w:space="0" w:color="000000"/>
-            </w:tcBorders>
-          </w:tcPr>
-          <w:p>
-            <w:pPr>
-              <w:pStyle w:val="normal1"/>
-              <w:widowControl w:val="0"/>
-              <w:spacing w:line="240" w:lineRule="auto"/>
-              <w:rPr>
-                <w:rFonts w:ascii="Calibri" w:eastAsia="Calibri" w:hAnsi="Calibri" w:cs="Calibri"/>
-              </w:rPr>
-            </w:pPr>
-          </w:p>
-        </w:tc>
-      </w:tr>
-      <w:tr>
-        <w:tc>
-          <w:tcPr>
-            <w:tcW w:w="3478" w:type="dxa"/>
-            <w:tcBorders>
-              <w:top w:val="single" w:sz="8" w:space="0" w:color="000000"/>
-              <w:left w:val="single" w:sz="8" w:space="0" w:color="000000"/>
-              <w:bottom w:val="single" w:sz="8" w:space="0" w:color="000000"/>
-              <w:right w:val="single" w:sz="8" w:space="0" w:color="000000"/>
-            </w:tcBorders>
-          </w:tcPr>
-          <w:p>
-            <w:pPr>
-              <w:pStyle w:val="normal1"/>
-              <w:widowControl w:val="0"/>
-              <w:spacing w:line="240" w:lineRule="auto"/>
-              <w:rPr>
-                <w:rFonts w:ascii="Calibri" w:eastAsia="Calibri" w:hAnsi="Calibri" w:cs="Calibri"/>
-              </w:rPr>
-            </w:pPr>
-          </w:p>
-        </w:tc>
-        <w:tc>
-          <w:tcPr>
-            <w:tcW w:w="2822" w:type="dxa"/>
-            <w:tcBorders>
-              <w:top w:val="single" w:sz="8" w:space="0" w:color="000000"/>
-              <w:left w:val="single" w:sz="8" w:space="0" w:color="000000"/>
-              <w:bottom w:val="single" w:sz="8" w:space="0" w:color="000000"/>
-              <w:right w:val="single" w:sz="8" w:space="0" w:color="000000"/>
-            </w:tcBorders>
-          </w:tcPr>
-          <w:p>
-            <w:pPr>
-              <w:pStyle w:val="normal1"/>
-              <w:widowControl w:val="0"/>
-              <w:spacing w:line="240" w:lineRule="auto"/>
-              <w:rPr>
-                <w:rFonts w:ascii="Calibri" w:eastAsia="Calibri" w:hAnsi="Calibri" w:cs="Calibri"/>
-              </w:rPr>
-            </w:pPr>
-          </w:p>
-        </w:tc>
-        <w:tc>
-          <w:tcPr>
-            <w:tcW w:w="2983" w:type="dxa"/>
-            <w:tcBorders>
-              <w:top w:val="single" w:sz="8" w:space="0" w:color="000000"/>
-              <w:left w:val="single" w:sz="8" w:space="0" w:color="000000"/>
-              <w:bottom w:val="single" w:sz="8" w:space="0" w:color="000000"/>
-              <w:right w:val="single" w:sz="8" w:space="0" w:color="000000"/>
-            </w:tcBorders>
-          </w:tcPr>
-          <w:p>
-            <w:pPr>
-              <w:pStyle w:val="normal1"/>
-              <w:widowControl w:val="0"/>
-              <w:spacing w:line="240" w:lineRule="auto"/>
-              <w:rPr>
-                <w:rFonts w:ascii="Calibri" w:eastAsia="Calibri" w:hAnsi="Calibri" w:cs="Calibri"/>
-              </w:rPr>
-            </w:pPr>
-          </w:p>
-        </w:tc>
-        <w:tc>
-          <w:tcPr>
-            <w:tcW w:w="1052" w:type="dxa"/>
-            <w:tcBorders>
-              <w:top w:val="single" w:sz="8" w:space="0" w:color="000000"/>
-              <w:left w:val="single" w:sz="8" w:space="0" w:color="000000"/>
-              <w:bottom w:val="single" w:sz="8" w:space="0" w:color="000000"/>
-              <w:right w:val="single" w:sz="8" w:space="0" w:color="000000"/>
-            </w:tcBorders>
-          </w:tcPr>
-          <w:p>
-            <w:pPr>
-              <w:pStyle w:val="normal1"/>
-              <w:widowControl w:val="0"/>
-              <w:spacing w:line="240" w:lineRule="auto"/>
-              <w:rPr>
-                <w:rFonts w:ascii="Calibri" w:eastAsia="Calibri" w:hAnsi="Calibri" w:cs="Calibri"/>
-              </w:rPr>
-            </w:pPr>
-          </w:p>
-        </w:tc>
-      </w:tr>
-      <w:tr>
-        <w:tc>
-          <w:tcPr>
-            <w:tcW w:w="3478" w:type="dxa"/>
-            <w:tcBorders>
-              <w:top w:val="single" w:sz="8" w:space="0" w:color="000000"/>
-              <w:left w:val="single" w:sz="8" w:space="0" w:color="000000"/>
-              <w:bottom w:val="single" w:sz="8" w:space="0" w:color="000000"/>
-              <w:right w:val="single" w:sz="8" w:space="0" w:color="000000"/>
-            </w:tcBorders>
-          </w:tcPr>
-          <w:p>
-            <w:pPr>
-              <w:pStyle w:val="normal1"/>
-              <w:widowControl w:val="0"/>
-              <w:spacing w:line="240" w:lineRule="auto"/>
-              <w:rPr>
-                <w:rFonts w:ascii="Calibri" w:eastAsia="Calibri" w:hAnsi="Calibri" w:cs="Calibri"/>
-              </w:rPr>
-            </w:pPr>
+            <w:r>
+              <w:rPr>
+                <w:rFonts w:ascii="Calibri" w:eastAsia="Calibri" w:hAnsi="Calibri" w:cs="Calibri"/>
+              </w:rPr>
+              <w:t>Sign up textbox</w:t>
+            </w:r>
           </w:p>
         </w:tc>
         <w:tc>
@@ -3719,9 +3721,10 @@
         <w:pStyle w:val="Heading4"/>
         <w:spacing w:line="276" w:lineRule="auto"/>
       </w:pPr>
-      <w:bookmarkStart w:id="16" w:name="_55wup77vaxep"/>
-      <w:bookmarkEnd w:id="16"/>
+      <w:bookmarkStart w:id="15" w:name="_55wup77vaxep"/>
+      <w:bookmarkEnd w:id="15"/>
       <w:r>
+        <w:lastRenderedPageBreak/>
         <w:t>Sprint #2 Review</w:t>
       </w:r>
     </w:p>
@@ -3851,6 +3854,73 @@
               <w:spacing w:line="240" w:lineRule="auto"/>
             </w:pPr>
           </w:p>
+          <w:p>
+            <w:pPr>
+              <w:pStyle w:val="normal1"/>
+              <w:widowControl w:val="0"/>
+              <w:spacing w:line="240" w:lineRule="auto"/>
+            </w:pPr>
+            <w:r>
+              <w:t xml:space="preserve">I should probably do more </w:t>
+            </w:r>
+            <w:proofErr w:type="gramStart"/>
+            <w:r>
+              <w:t>things on</w:t>
+            </w:r>
+            <w:proofErr w:type="gramEnd"/>
+            <w:r>
+              <w:t xml:space="preserve"> here because I am very far behind on what I support to be working on. I </w:t>
+            </w:r>
+            <w:proofErr w:type="gramStart"/>
+            <w:r>
+              <w:t>do</w:t>
+            </w:r>
+            <w:proofErr w:type="gramEnd"/>
+            <w:r>
+              <w:t xml:space="preserve"> </w:t>
+            </w:r>
+            <w:proofErr w:type="gramStart"/>
+            <w:r>
+              <w:t>hoping</w:t>
+            </w:r>
+            <w:proofErr w:type="gramEnd"/>
+            <w:r>
+              <w:t xml:space="preserve"> that I can </w:t>
+            </w:r>
+            <w:proofErr w:type="spellStart"/>
+            <w:r>
+              <w:t>fiinihs</w:t>
+            </w:r>
+            <w:proofErr w:type="spellEnd"/>
+            <w:r>
+              <w:t xml:space="preserve"> the sign up and </w:t>
+            </w:r>
+            <w:proofErr w:type="spellStart"/>
+            <w:r>
+              <w:t>logn</w:t>
+            </w:r>
+            <w:proofErr w:type="spellEnd"/>
+            <w:r>
+              <w:t xml:space="preserve"> in page, </w:t>
+            </w:r>
+            <w:proofErr w:type="spellStart"/>
+            <w:proofErr w:type="gramStart"/>
+            <w:r>
+              <w:t>aswell</w:t>
+            </w:r>
+            <w:proofErr w:type="spellEnd"/>
+            <w:proofErr w:type="gramEnd"/>
+            <w:r>
+              <w:t xml:space="preserve"> as fixing the main page. </w:t>
+            </w:r>
+          </w:p>
+          <w:p>
+            <w:pPr>
+              <w:pStyle w:val="normal1"/>
+              <w:widowControl w:val="0"/>
+              <w:spacing w:line="240" w:lineRule="auto"/>
+            </w:pPr>
+          </w:p>
         </w:tc>
       </w:tr>
     </w:tbl>
@@ -3867,67 +3937,6 @@
         </w:rPr>
       </w:pPr>
       <w:r>
-        <w:rPr>
-          <w:noProof/>
-        </w:rPr>
-        <mc:AlternateContent>
-          <mc:Choice Requires="wps">
-            <w:drawing>
-              <wp:inline distT="0" distB="0" distL="0" distR="0" wp14:anchorId="7CEA7453" wp14:editId="497D8A2A">
-                <wp:extent cx="6645910" cy="19050"/>
-                <wp:effectExtent l="0" t="0" r="0" b="0"/>
-                <wp:docPr id="4" name="Shape3"/>
-                <wp:cNvGraphicFramePr/>
-                <a:graphic xmlns:a="http://schemas.openxmlformats.org/drawingml/2006/main">
-                  <a:graphicData uri="http://schemas.microsoft.com/office/word/2010/wordprocessingShape">
-                    <wps:wsp>
-                      <wps:cNvSpPr/>
-                      <wps:spPr>
-                        <a:xfrm>
-                          <a:off x="0" y="0"/>
-                          <a:ext cx="6645960" cy="19080"/>
-                        </a:xfrm>
-                        <a:prstGeom prst="rect">
-                          <a:avLst/>
-                        </a:prstGeom>
-                        <a:solidFill>
-                          <a:srgbClr val="A0A0A0"/>
-                        </a:solidFill>
-                        <a:ln w="0">
-                          <a:noFill/>
-                        </a:ln>
-                      </wps:spPr>
-                      <wps:style>
-                        <a:lnRef idx="0">
-                          <a:scrgbClr r="0" g="0" b="0"/>
-                        </a:lnRef>
-                        <a:fillRef idx="0">
-                          <a:scrgbClr r="0" g="0" b="0"/>
-                        </a:fillRef>
-                        <a:effectRef idx="0">
-                          <a:scrgbClr r="0" g="0" b="0"/>
-                        </a:effectRef>
-                        <a:fontRef idx="minor"/>
-                      </wps:style>
-                      <wps:bodyPr/>
-                    </wps:wsp>
-                  </a:graphicData>
-                </a:graphic>
-              </wp:inline>
-            </w:drawing>
-          </mc:Choice>
-          <mc:Fallback xmlns:pic="http://schemas.openxmlformats.org/drawingml/2006/picture">
-            <w:pict>
-              <v:rect id="shape_0" fillcolor="#a0a0a0" stroked="f" o:allowincell="f" style="position:absolute;margin-left:0pt;margin-top:-1.55pt;width:523.25pt;height:1.45pt;mso-wrap-style:none;v-text-anchor:middle;mso-position-vertical:top">
-                <v:fill o:detectmouseclick="t" type="solid" color2="#5f5f5f"/>
-                <v:stroke color="#3465a4" joinstyle="round" endcap="flat"/>
-                <w10:wrap type="square"/>
-              </v:rect>
-            </w:pict>
-          </mc:Fallback>
-        </mc:AlternateContent>
-      </w:r>
-      <w:r>
         <w:br w:type="page"/>
       </w:r>
     </w:p>
@@ -3936,8 +3945,8 @@
         <w:pStyle w:val="Heading2"/>
         <w:spacing w:before="0"/>
       </w:pPr>
-      <w:bookmarkStart w:id="17" w:name="_nyi0pap57hr1"/>
-      <w:bookmarkEnd w:id="17"/>
+      <w:bookmarkStart w:id="16" w:name="_nyi0pap57hr1"/>
+      <w:bookmarkEnd w:id="16"/>
       <w:r>
         <w:lastRenderedPageBreak/>
         <w:t>Sprint #3</w:t>
@@ -3971,8 +3980,8 @@
               <w:pStyle w:val="Heading4"/>
               <w:spacing w:line="276" w:lineRule="auto"/>
             </w:pPr>
-            <w:bookmarkStart w:id="18" w:name="_dgql39661em3"/>
-            <w:bookmarkEnd w:id="18"/>
+            <w:bookmarkStart w:id="17" w:name="_dgql39661em3"/>
+            <w:bookmarkEnd w:id="17"/>
             <w:r>
               <w:t>Sprint #3 Goals</w:t>
             </w:r>
@@ -4043,8 +4052,8 @@
         <w:pStyle w:val="Heading4"/>
         <w:spacing w:line="276" w:lineRule="auto"/>
       </w:pPr>
-      <w:bookmarkStart w:id="19" w:name="_331oveg6u5qq"/>
-      <w:bookmarkEnd w:id="19"/>
+      <w:bookmarkStart w:id="18" w:name="_331oveg6u5qq"/>
+      <w:bookmarkEnd w:id="18"/>
       <w:r>
         <w:t>Database improvements (if any)</w:t>
       </w:r>
@@ -4324,8 +4333,8 @@
         <w:pStyle w:val="Heading4"/>
         <w:spacing w:line="276" w:lineRule="auto"/>
       </w:pPr>
-      <w:bookmarkStart w:id="20" w:name="_17ypufns5no4"/>
-      <w:bookmarkEnd w:id="20"/>
+      <w:bookmarkStart w:id="19" w:name="_17ypufns5no4"/>
+      <w:bookmarkEnd w:id="19"/>
       <w:proofErr w:type="spellStart"/>
       <w:r>
         <w:t>WebPage</w:t>
@@ -4549,8 +4558,8 @@
         <w:pStyle w:val="Heading4"/>
         <w:spacing w:line="276" w:lineRule="auto"/>
       </w:pPr>
-      <w:bookmarkStart w:id="21" w:name="_ask7gzvg0r0n"/>
-      <w:bookmarkEnd w:id="21"/>
+      <w:bookmarkStart w:id="20" w:name="_ask7gzvg0r0n"/>
+      <w:bookmarkEnd w:id="20"/>
       <w:r>
         <w:t>Sprint #3 Testing</w:t>
       </w:r>
@@ -5350,8 +5359,8 @@
           <w:rFonts w:ascii="Calibri" w:eastAsia="Calibri" w:hAnsi="Calibri" w:cs="Calibri"/>
         </w:rPr>
       </w:pPr>
-      <w:bookmarkStart w:id="22" w:name="_tyjcwt"/>
-      <w:bookmarkEnd w:id="22"/>
+      <w:bookmarkStart w:id="21" w:name="_tyjcwt"/>
+      <w:bookmarkEnd w:id="21"/>
       <w:r>
         <w:rPr>
           <w:rFonts w:ascii="Calibri" w:eastAsia="Calibri" w:hAnsi="Calibri" w:cs="Calibri"/>
@@ -5714,8 +5723,8 @@
                 <w:rFonts w:ascii="Calibri" w:eastAsia="Calibri" w:hAnsi="Calibri" w:cs="Calibri"/>
               </w:rPr>
             </w:pPr>
-            <w:bookmarkStart w:id="23" w:name="_3dy6vkm"/>
-            <w:bookmarkEnd w:id="23"/>
+            <w:bookmarkStart w:id="22" w:name="_3dy6vkm"/>
+            <w:bookmarkEnd w:id="22"/>
             <w:r>
               <w:rPr>
                 <w:rFonts w:ascii="Calibri" w:eastAsia="Calibri" w:hAnsi="Calibri" w:cs="Calibri"/>
@@ -5876,8 +5885,8 @@
         <w:pStyle w:val="Heading1"/>
         <w:spacing w:line="276" w:lineRule="auto"/>
       </w:pPr>
-      <w:bookmarkStart w:id="24" w:name="_366nddmyekzj"/>
-      <w:bookmarkEnd w:id="24"/>
+      <w:bookmarkStart w:id="23" w:name="_366nddmyekzj"/>
+      <w:bookmarkEnd w:id="23"/>
       <w:r>
         <w:br w:type="page"/>
       </w:r>
@@ -5887,8 +5896,8 @@
         <w:pStyle w:val="Heading1"/>
         <w:spacing w:before="0" w:line="276" w:lineRule="auto"/>
       </w:pPr>
-      <w:bookmarkStart w:id="25" w:name="_rvpyyvdssowd"/>
-      <w:bookmarkEnd w:id="25"/>
+      <w:bookmarkStart w:id="24" w:name="_rvpyyvdssowd"/>
+      <w:bookmarkEnd w:id="24"/>
       <w:r>
         <w:lastRenderedPageBreak/>
         <w:t>Marking Schedules</w:t>
@@ -5909,8 +5918,8 @@
           <w:rFonts w:ascii="Arial" w:eastAsia="Arial" w:hAnsi="Arial" w:cs="Arial"/>
         </w:rPr>
       </w:pPr>
-      <w:bookmarkStart w:id="26" w:name="_y6ahq0z1audu"/>
-      <w:bookmarkEnd w:id="26"/>
+      <w:bookmarkStart w:id="25" w:name="_y6ahq0z1audu"/>
+      <w:bookmarkEnd w:id="25"/>
       <w:r>
         <w:rPr>
           <w:rFonts w:ascii="Arial" w:eastAsia="Arial" w:hAnsi="Arial" w:cs="Arial"/>
@@ -7074,8 +7083,8 @@
                 <w:szCs w:val="20"/>
               </w:rPr>
             </w:pPr>
-            <w:bookmarkStart w:id="27" w:name="_30j0zll_Copy_1"/>
-            <w:bookmarkEnd w:id="27"/>
+            <w:bookmarkStart w:id="26" w:name="_30j0zll_Copy_1"/>
+            <w:bookmarkEnd w:id="26"/>
             <w:r>
               <w:rPr>
                 <w:sz w:val="20"/>
@@ -7270,8 +7279,8 @@
           <w:rFonts w:ascii="Arial" w:eastAsia="Arial" w:hAnsi="Arial" w:cs="Arial"/>
         </w:rPr>
       </w:pPr>
-      <w:bookmarkStart w:id="28" w:name="_nc30vsbd7t9"/>
-      <w:bookmarkEnd w:id="28"/>
+      <w:bookmarkStart w:id="27" w:name="_nc30vsbd7t9"/>
+      <w:bookmarkEnd w:id="27"/>
       <w:r>
         <w:br w:type="page"/>
       </w:r>
@@ -7284,8 +7293,8 @@
           <w:rFonts w:ascii="Arial" w:eastAsia="Arial" w:hAnsi="Arial" w:cs="Arial"/>
         </w:rPr>
       </w:pPr>
-      <w:bookmarkStart w:id="29" w:name="_xxcvuf2jd2c6"/>
-      <w:bookmarkEnd w:id="29"/>
+      <w:bookmarkStart w:id="28" w:name="_xxcvuf2jd2c6"/>
+      <w:bookmarkEnd w:id="28"/>
       <w:r>
         <w:rPr>
           <w:rFonts w:ascii="Arial" w:eastAsia="Arial" w:hAnsi="Arial" w:cs="Arial"/>
@@ -8194,8 +8203,8 @@
                 <w:szCs w:val="20"/>
               </w:rPr>
             </w:pPr>
-            <w:bookmarkStart w:id="30" w:name="_30j0zll_Copy_2"/>
-            <w:bookmarkEnd w:id="30"/>
+            <w:bookmarkStart w:id="29" w:name="_30j0zll_Copy_2"/>
+            <w:bookmarkEnd w:id="29"/>
             <w:r>
               <w:rPr>
                 <w:b/>
@@ -8472,8 +8481,8 @@
           <w:rFonts w:ascii="Arial" w:eastAsia="Arial" w:hAnsi="Arial" w:cs="Arial"/>
         </w:rPr>
       </w:pPr>
-      <w:bookmarkStart w:id="31" w:name="_ug7drgpatc88"/>
-      <w:bookmarkEnd w:id="31"/>
+      <w:bookmarkStart w:id="30" w:name="_ug7drgpatc88"/>
+      <w:bookmarkEnd w:id="30"/>
       <w:r>
         <w:br w:type="page"/>
       </w:r>
@@ -8486,8 +8495,8 @@
           <w:rFonts w:ascii="Arial" w:eastAsia="Arial" w:hAnsi="Arial" w:cs="Arial"/>
         </w:rPr>
       </w:pPr>
-      <w:bookmarkStart w:id="32" w:name="_5svrexyrgn1c"/>
-      <w:bookmarkEnd w:id="32"/>
+      <w:bookmarkStart w:id="31" w:name="_5svrexyrgn1c"/>
+      <w:bookmarkEnd w:id="31"/>
       <w:r>
         <w:rPr>
           <w:rFonts w:ascii="Arial" w:eastAsia="Arial" w:hAnsi="Arial" w:cs="Arial"/>
@@ -9407,8 +9416,8 @@
                 <w:szCs w:val="20"/>
               </w:rPr>
             </w:pPr>
-            <w:bookmarkStart w:id="33" w:name="_30j0zll_Copy_3"/>
-            <w:bookmarkEnd w:id="33"/>
+            <w:bookmarkStart w:id="32" w:name="_30j0zll_Copy_3"/>
+            <w:bookmarkEnd w:id="32"/>
             <w:r>
               <w:rPr>
                 <w:sz w:val="20"/>

</xml_diff>

<commit_message>
add the wireframa LKASDNSA
</commit_message>
<xml_diff>
--- a/L3 Web Application Development Log.docx
+++ b/L3 Web Application Development Log.docx
@@ -645,121 +645,62 @@
               <w:widowControl w:val="0"/>
               <w:spacing w:line="240" w:lineRule="auto"/>
             </w:pPr>
-            <w:r>
-              <w:t>Photo pls :D</w:t>
-            </w:r>
-          </w:p>
-          <w:p>
-            <w:pPr>
-              <w:pStyle w:val="normal1"/>
-              <w:widowControl w:val="0"/>
-              <w:spacing w:line="240" w:lineRule="auto"/>
-            </w:pPr>
-          </w:p>
-          <w:p>
-            <w:pPr>
-              <w:pStyle w:val="normal1"/>
-              <w:widowControl w:val="0"/>
-              <w:spacing w:line="240" w:lineRule="auto"/>
-            </w:pPr>
-          </w:p>
-          <w:p>
-            <w:pPr>
-              <w:pStyle w:val="normal1"/>
-              <w:widowControl w:val="0"/>
-              <w:spacing w:line="240" w:lineRule="auto"/>
-            </w:pPr>
-          </w:p>
-          <w:p>
-            <w:pPr>
-              <w:pStyle w:val="normal1"/>
-              <w:widowControl w:val="0"/>
-              <w:spacing w:line="240" w:lineRule="auto"/>
-            </w:pPr>
-          </w:p>
-          <w:p>
-            <w:pPr>
-              <w:pStyle w:val="normal1"/>
-              <w:widowControl w:val="0"/>
-              <w:spacing w:line="240" w:lineRule="auto"/>
-            </w:pPr>
-          </w:p>
-          <w:p>
-            <w:pPr>
-              <w:pStyle w:val="normal1"/>
-              <w:widowControl w:val="0"/>
-              <w:spacing w:line="240" w:lineRule="auto"/>
-            </w:pPr>
-          </w:p>
-          <w:p>
-            <w:pPr>
-              <w:pStyle w:val="normal1"/>
-              <w:widowControl w:val="0"/>
-              <w:spacing w:line="240" w:lineRule="auto"/>
-            </w:pPr>
-          </w:p>
-          <w:p>
-            <w:pPr>
-              <w:pStyle w:val="normal1"/>
-              <w:widowControl w:val="0"/>
-              <w:spacing w:line="240" w:lineRule="auto"/>
-            </w:pPr>
-          </w:p>
-          <w:p>
-            <w:pPr>
-              <w:pStyle w:val="normal1"/>
-              <w:widowControl w:val="0"/>
-              <w:spacing w:line="240" w:lineRule="auto"/>
-            </w:pPr>
-          </w:p>
-          <w:p>
-            <w:pPr>
-              <w:pStyle w:val="normal1"/>
-              <w:widowControl w:val="0"/>
-              <w:spacing w:line="240" w:lineRule="auto"/>
-            </w:pPr>
-          </w:p>
-          <w:p>
-            <w:pPr>
-              <w:pStyle w:val="normal1"/>
-              <w:widowControl w:val="0"/>
-              <w:spacing w:line="240" w:lineRule="auto"/>
-            </w:pPr>
-          </w:p>
-          <w:p>
-            <w:pPr>
-              <w:pStyle w:val="normal1"/>
-              <w:widowControl w:val="0"/>
-              <w:spacing w:line="240" w:lineRule="auto"/>
-            </w:pPr>
-          </w:p>
-          <w:p>
-            <w:pPr>
-              <w:pStyle w:val="normal1"/>
-              <w:widowControl w:val="0"/>
-              <w:spacing w:line="240" w:lineRule="auto"/>
-            </w:pPr>
-          </w:p>
-          <w:p>
-            <w:pPr>
-              <w:pStyle w:val="normal1"/>
-              <w:widowControl w:val="0"/>
-              <w:spacing w:line="240" w:lineRule="auto"/>
-            </w:pPr>
-          </w:p>
-          <w:p>
-            <w:pPr>
-              <w:pStyle w:val="normal1"/>
-              <w:widowControl w:val="0"/>
-              <w:spacing w:line="240" w:lineRule="auto"/>
-            </w:pPr>
-          </w:p>
-          <w:p>
-            <w:pPr>
-              <w:pStyle w:val="normal1"/>
-              <w:widowControl w:val="0"/>
-              <w:spacing w:line="240" w:lineRule="auto"/>
-            </w:pPr>
+          </w:p>
+          <w:p>
+            <w:pPr>
+              <w:pStyle w:val="normal1"/>
+              <w:widowControl w:val="0"/>
+              <w:spacing w:line="240" w:lineRule="auto"/>
+              <w:jc w:val="center"/>
+            </w:pPr>
+            <w:r>
+              <w:rPr>
+                <w:b/>
+                <w:bCs/>
+                <w:noProof/>
+              </w:rPr>
+              <w:drawing>
+                <wp:inline distT="0" distB="0" distL="0" distR="0" wp14:anchorId="5364B92B" wp14:editId="2C153EBB">
+                  <wp:extent cx="7057498" cy="5293124"/>
+                  <wp:effectExtent l="6032" t="0" r="0" b="0"/>
+                  <wp:docPr id="1486568348" name="Picture 1"/>
+                  <wp:cNvGraphicFramePr>
+                    <a:graphicFrameLocks xmlns:a="http://schemas.openxmlformats.org/drawingml/2006/main" noChangeAspect="1"/>
+                  </wp:cNvGraphicFramePr>
+                  <a:graphic xmlns:a="http://schemas.openxmlformats.org/drawingml/2006/main">
+                    <a:graphicData uri="http://schemas.openxmlformats.org/drawingml/2006/picture">
+                      <pic:pic xmlns:pic="http://schemas.openxmlformats.org/drawingml/2006/picture">
+                        <pic:nvPicPr>
+                          <pic:cNvPr id="1486568348" name="Picture 1486568348"/>
+                          <pic:cNvPicPr/>
+                        </pic:nvPicPr>
+                        <pic:blipFill>
+                          <a:blip r:embed="rId8" cstate="print">
+                            <a:extLst>
+                              <a:ext uri="{28A0092B-C50C-407E-A947-70E740481C1C}">
+                                <a14:useLocalDpi xmlns:a14="http://schemas.microsoft.com/office/drawing/2010/main" val="0"/>
+                              </a:ext>
+                            </a:extLst>
+                          </a:blip>
+                          <a:stretch>
+                            <a:fillRect/>
+                          </a:stretch>
+                        </pic:blipFill>
+                        <pic:spPr>
+                          <a:xfrm rot="5400000">
+                            <a:off x="0" y="0"/>
+                            <a:ext cx="7070015" cy="5302512"/>
+                          </a:xfrm>
+                          <a:prstGeom prst="rect">
+                            <a:avLst/>
+                          </a:prstGeom>
+                        </pic:spPr>
+                      </pic:pic>
+                    </a:graphicData>
+                  </a:graphic>
+                </wp:inline>
+              </w:drawing>
+            </w:r>
           </w:p>
           <w:p>
             <w:pPr>
@@ -2242,6 +2183,7 @@
               <w:rPr>
                 <w:rFonts w:ascii="Calibri" w:eastAsia="Calibri" w:hAnsi="Calibri" w:cs="Calibri"/>
               </w:rPr>
+              <w:lastRenderedPageBreak/>
               <w:t>Going on the other page part 2</w:t>
             </w:r>
           </w:p>
@@ -3497,7 +3439,21 @@
               <w:rPr>
                 <w:rFonts w:ascii="Calibri" w:eastAsia="Calibri" w:hAnsi="Calibri" w:cs="Calibri"/>
               </w:rPr>
-              <w:t xml:space="preserve"> anpther page</w:t>
+              <w:t xml:space="preserve"> </w:t>
+            </w:r>
+            <w:proofErr w:type="spellStart"/>
+            <w:r>
+              <w:rPr>
+                <w:rFonts w:ascii="Calibri" w:eastAsia="Calibri" w:hAnsi="Calibri" w:cs="Calibri"/>
+              </w:rPr>
+              <w:t>anpther</w:t>
+            </w:r>
+            <w:proofErr w:type="spellEnd"/>
+            <w:r>
+              <w:rPr>
+                <w:rFonts w:ascii="Calibri" w:eastAsia="Calibri" w:hAnsi="Calibri" w:cs="Calibri"/>
+              </w:rPr>
+              <w:t xml:space="preserve"> page</w:t>
             </w:r>
           </w:p>
         </w:tc>
@@ -6023,7 +5979,7 @@
         </w:rPr>
         <w:tab/>
       </w:r>
-      <w:hyperlink r:id="rId8">
+      <w:hyperlink r:id="rId9">
         <w:r>
           <w:rPr>
             <w:color w:val="0000FF"/>
@@ -7389,7 +7345,7 @@
         </w:rPr>
         <w:tab/>
       </w:r>
-      <w:hyperlink r:id="rId9">
+      <w:hyperlink r:id="rId10">
         <w:r>
           <w:rPr>
             <w:color w:val="0000FF"/>
@@ -8601,7 +8557,7 @@
         </w:rPr>
         <w:tab/>
       </w:r>
-      <w:hyperlink r:id="rId10">
+      <w:hyperlink r:id="rId11">
         <w:r>
           <w:rPr>
             <w:color w:val="0000FF"/>
@@ -9989,12 +9945,12 @@
       </w:pPr>
     </w:p>
     <w:sectPr>
-      <w:headerReference w:type="even" r:id="rId11"/>
-      <w:headerReference w:type="default" r:id="rId12"/>
-      <w:footerReference w:type="even" r:id="rId13"/>
-      <w:footerReference w:type="default" r:id="rId14"/>
-      <w:headerReference w:type="first" r:id="rId15"/>
-      <w:footerReference w:type="first" r:id="rId16"/>
+      <w:headerReference w:type="even" r:id="rId12"/>
+      <w:headerReference w:type="default" r:id="rId13"/>
+      <w:footerReference w:type="even" r:id="rId14"/>
+      <w:footerReference w:type="default" r:id="rId15"/>
+      <w:headerReference w:type="first" r:id="rId16"/>
+      <w:footerReference w:type="first" r:id="rId17"/>
       <w:pgSz w:w="11906" w:h="16838"/>
       <w:pgMar w:top="777" w:right="720" w:bottom="777" w:left="720" w:header="720" w:footer="720" w:gutter="0"/>
       <w:pgNumType w:start="1"/>

</xml_diff>

<commit_message>
30/06/16 - I fix up the login thing becasue it was never working. Check in appy.py for the thing
</commit_message>
<xml_diff>
--- a/L3 Web Application Development Log.docx
+++ b/L3 Web Application Development Log.docx
@@ -361,7 +361,67 @@
                 <w:szCs w:val="22"/>
                 <w:lang w:val="en-US" w:eastAsia="zh-CN" w:bidi="hi-IN"/>
               </w:rPr>
-              <w:t>In this project or website im making is about having pages of different type of games from different gerences to help people find and show games they they might like. The target audience for this wesbite is people who like games! Gamers and like to talk about thier favtio game to people who like the sameilr game as say user.</w:t>
+              <w:t xml:space="preserve">In this project or website </w:t>
+            </w:r>
+            <w:r>
+              <w:rPr>
+                <w:rFonts w:eastAsia="Arial" w:cs="Arial"/>
+                <w:kern w:val="0"/>
+                <w:sz w:val="22"/>
+                <w:szCs w:val="22"/>
+                <w:lang w:val="en-US" w:eastAsia="zh-CN" w:bidi="hi-IN"/>
+              </w:rPr>
+              <w:t>Im</w:t>
+            </w:r>
+            <w:r>
+              <w:rPr>
+                <w:rFonts w:eastAsia="Arial" w:cs="Arial"/>
+                <w:kern w:val="0"/>
+                <w:sz w:val="22"/>
+                <w:szCs w:val="22"/>
+                <w:lang w:val="en-US" w:eastAsia="zh-CN" w:bidi="hi-IN"/>
+              </w:rPr>
+              <w:t xml:space="preserve"> making is about having pages of different type of games from different genres to help people find and show games they they might like. </w:t>
+            </w:r>
+            <w:r>
+              <w:rPr>
+                <w:rFonts w:eastAsia="Arial" w:cs="Arial"/>
+                <w:kern w:val="0"/>
+                <w:sz w:val="22"/>
+                <w:szCs w:val="22"/>
+                <w:lang w:val="en-US" w:eastAsia="zh-CN" w:bidi="hi-IN"/>
+              </w:rPr>
+              <w:t>Website</w:t>
+            </w:r>
+            <w:r>
+              <w:rPr>
+                <w:rFonts w:eastAsia="Arial" w:cs="Arial"/>
+                <w:kern w:val="0"/>
+                <w:sz w:val="22"/>
+                <w:szCs w:val="22"/>
+                <w:lang w:val="en-US" w:eastAsia="zh-CN" w:bidi="hi-IN"/>
+              </w:rPr>
+              <w:t xml:space="preserve"> Gamers and like to talk about </w:t>
+            </w:r>
+            <w:r>
+              <w:rPr>
+                <w:rFonts w:eastAsia="Arial" w:cs="Arial"/>
+                <w:kern w:val="0"/>
+                <w:sz w:val="22"/>
+                <w:szCs w:val="22"/>
+                <w:lang w:val="en-US" w:eastAsia="zh-CN" w:bidi="hi-IN"/>
+              </w:rPr>
+              <w:t>t</w:t>
+            </w:r>
+            <w:r>
+              <w:rPr>
+                <w:rFonts w:eastAsia="Arial" w:cs="Arial"/>
+                <w:kern w:val="0"/>
+                <w:sz w:val="22"/>
+                <w:szCs w:val="22"/>
+                <w:lang w:val="en-US" w:eastAsia="zh-CN" w:bidi="hi-IN"/>
+              </w:rPr>
+              <w:t xml:space="preserve"> favourite game to people who like the similar game as say user.</w:t>
             </w:r>
           </w:p>
           <w:p>
@@ -581,7 +641,7 @@
                 <w:rFonts w:eastAsia="Calibri" w:cs="Calibri" w:ascii="Calibri" w:hAnsi="Calibri"/>
               </w:rPr>
               <w:drawing>
-                <wp:anchor distT="0" distB="0" distL="0" distR="0" simplePos="0" relativeHeight="42" behindDoc="0" locked="0" layoutInCell="1" allowOverlap="1">
+                <wp:anchor distT="0" distB="0" distL="0" distR="0" simplePos="0" relativeHeight="45" behindDoc="0" locked="0" layoutInCell="1" allowOverlap="1">
                   <wp:simplePos x="0" y="0"/>
                   <wp:positionH relativeFrom="column">
                     <wp:align>center</wp:align>
@@ -1433,7 +1493,7 @@
                 <w:szCs w:val="22"/>
                 <w:lang w:val="en-US" w:eastAsia="zh-CN" w:bidi="hi-IN"/>
               </w:rPr>
-              <w:t>My goals for this sprint is to make an about page, login and sign up, and Nagvation Bar</w:t>
+              <w:t>My goals for this sprint is to make an about page, login and sign up, and Navigation Bar.</w:t>
             </w:r>
           </w:p>
           <w:p>
@@ -2331,7 +2391,7 @@
                 <w:szCs w:val="22"/>
                 <w:lang w:val="en-US" w:eastAsia="zh-CN" w:bidi="hi-IN"/>
               </w:rPr>
-              <w:t>MY LAPTOP SUCJS AND I COULDN’T DO ANYTHING!!</w:t>
+              <w:t>MY LAPTOP SUCKS AND I COULDN’T DO ANYTHING!!</w:t>
             </w:r>
           </w:p>
           <w:p>
@@ -2357,7 +2417,27 @@
                 <w:szCs w:val="22"/>
                 <w:lang w:val="en-US" w:eastAsia="zh-CN" w:bidi="hi-IN"/>
               </w:rPr>
-              <w:t>The only thing I did was the navbar and having another page up. Nothing else for other things.</w:t>
+              <w:t xml:space="preserve">The only thing I did was the Navigation </w:t>
+            </w:r>
+            <w:r>
+              <w:rPr>
+                <w:rFonts w:eastAsia="Arial" w:cs="Arial"/>
+                <w:kern w:val="0"/>
+                <w:sz w:val="22"/>
+                <w:szCs w:val="22"/>
+                <w:lang w:val="en-US" w:eastAsia="zh-CN" w:bidi="hi-IN"/>
+              </w:rPr>
+              <w:t>bar</w:t>
+            </w:r>
+            <w:r>
+              <w:rPr>
+                <w:rFonts w:eastAsia="Arial" w:cs="Arial"/>
+                <w:kern w:val="0"/>
+                <w:sz w:val="22"/>
+                <w:szCs w:val="22"/>
+                <w:lang w:val="en-US" w:eastAsia="zh-CN" w:bidi="hi-IN"/>
+              </w:rPr>
+              <w:t xml:space="preserve"> and having another page up. Nothing else for other things.</w:t>
             </w:r>
           </w:p>
           <w:p>
@@ -2408,7 +2488,67 @@
                 <w:szCs w:val="22"/>
                 <w:lang w:val="en-US" w:eastAsia="zh-CN" w:bidi="hi-IN"/>
               </w:rPr>
-              <w:t>I was unable to work on my website because the laptop I was use made it unusable to get work on in this class (and others too), and it being an hassled to trying to figure it out how to use it. I only got the nav bar to work, but it kind of sucks and looks bad. I was also unable to write and docamtion my work (or lack on it) on here because it was slow and I had nothing to show.</w:t>
+              <w:t xml:space="preserve">I was unable to work on my website because the laptop I was use made it unusable to get work on in this class (and others too), and it being a </w:t>
+            </w:r>
+            <w:r>
+              <w:rPr>
+                <w:rFonts w:eastAsia="Arial" w:cs="Arial"/>
+                <w:kern w:val="0"/>
+                <w:sz w:val="22"/>
+                <w:szCs w:val="22"/>
+                <w:lang w:val="en-US" w:eastAsia="zh-CN" w:bidi="hi-IN"/>
+              </w:rPr>
+              <w:t>hassle</w:t>
+            </w:r>
+            <w:r>
+              <w:rPr>
+                <w:rFonts w:eastAsia="Arial" w:cs="Arial"/>
+                <w:kern w:val="0"/>
+                <w:sz w:val="22"/>
+                <w:szCs w:val="22"/>
+                <w:lang w:val="en-US" w:eastAsia="zh-CN" w:bidi="hi-IN"/>
+              </w:rPr>
+              <w:t xml:space="preserve"> to trying to figure it out how to use it. I only got the </w:t>
+            </w:r>
+            <w:r>
+              <w:rPr>
+                <w:rFonts w:eastAsia="Arial" w:cs="Arial"/>
+                <w:kern w:val="0"/>
+                <w:sz w:val="22"/>
+                <w:szCs w:val="22"/>
+                <w:lang w:val="en-US" w:eastAsia="zh-CN" w:bidi="hi-IN"/>
+              </w:rPr>
+              <w:t>n</w:t>
+            </w:r>
+            <w:r>
+              <w:rPr>
+                <w:rFonts w:eastAsia="Arial" w:cs="Arial"/>
+                <w:kern w:val="0"/>
+                <w:sz w:val="22"/>
+                <w:szCs w:val="22"/>
+                <w:lang w:val="en-US" w:eastAsia="zh-CN" w:bidi="hi-IN"/>
+              </w:rPr>
+              <w:t xml:space="preserve">avigation  bar to work, but it kind of sucks and looks bad. I was also unable to write and </w:t>
+            </w:r>
+            <w:r>
+              <w:rPr>
+                <w:rFonts w:eastAsia="Arial" w:cs="Arial"/>
+                <w:kern w:val="0"/>
+                <w:sz w:val="22"/>
+                <w:szCs w:val="22"/>
+                <w:lang w:val="en-US" w:eastAsia="zh-CN" w:bidi="hi-IN"/>
+              </w:rPr>
+              <w:t>document</w:t>
+            </w:r>
+            <w:r>
+              <w:rPr>
+                <w:rFonts w:eastAsia="Arial" w:cs="Arial"/>
+                <w:kern w:val="0"/>
+                <w:sz w:val="22"/>
+                <w:szCs w:val="22"/>
+                <w:lang w:val="en-US" w:eastAsia="zh-CN" w:bidi="hi-IN"/>
+              </w:rPr>
+              <w:t xml:space="preserve"> my work (or lack on it) on here because it was slow and I had nothing to show</w:t>
             </w:r>
           </w:p>
           <w:p>
@@ -2520,7 +2660,7 @@
                 <w:kern w:val="0"/>
                 <w:lang w:val="en-US" w:eastAsia="zh-CN" w:bidi="hi-IN"/>
               </w:rPr>
-              <w:t>Sprint #2  Goals</w:t>
+              <w:t>Sprint #2 Goals</w:t>
             </w:r>
           </w:p>
           <w:p>
@@ -2619,7 +2759,87 @@
                 <w:szCs w:val="22"/>
                 <w:lang w:val="en-US" w:eastAsia="zh-CN" w:bidi="hi-IN"/>
               </w:rPr>
-              <w:t>An funcatily Navbar and text box imput thing for users to type in for stuff.</w:t>
+              <w:t xml:space="preserve">functionally Navigation </w:t>
+            </w:r>
+            <w:r>
+              <w:rPr>
+                <w:rFonts w:eastAsia="Arial" w:cs="Arial"/>
+                <w:kern w:val="0"/>
+                <w:sz w:val="22"/>
+                <w:szCs w:val="22"/>
+                <w:lang w:val="en-US" w:eastAsia="zh-CN" w:bidi="hi-IN"/>
+              </w:rPr>
+              <w:t>Bar</w:t>
+            </w:r>
+            <w:r>
+              <w:rPr>
+                <w:rFonts w:eastAsia="Arial" w:cs="Arial"/>
+                <w:kern w:val="0"/>
+                <w:sz w:val="22"/>
+                <w:szCs w:val="22"/>
+                <w:lang w:val="en-US" w:eastAsia="zh-CN" w:bidi="hi-IN"/>
+              </w:rPr>
+              <w:t xml:space="preserve"> </w:t>
+            </w:r>
+          </w:p>
+          <w:p>
+            <w:pPr>
+              <w:pStyle w:val="normal1"/>
+              <w:widowControl w:val="false"/>
+              <w:numPr>
+                <w:ilvl w:val="0"/>
+                <w:numId w:val="2"/>
+              </w:numPr>
+              <w:suppressAutoHyphens w:val="true"/>
+              <w:spacing w:lineRule="auto" w:line="240" w:before="0" w:after="0"/>
+              <w:jc w:val="start"/>
+              <w:rPr>
+                <w:rFonts w:ascii="Arial" w:hAnsi="Arial" w:eastAsia="Arial" w:cs="Arial"/>
+                <w:kern w:val="0"/>
+                <w:sz w:val="22"/>
+                <w:szCs w:val="22"/>
+                <w:lang w:val="en-US" w:eastAsia="zh-CN" w:bidi="hi-IN"/>
+              </w:rPr>
+            </w:pPr>
+            <w:r>
+              <w:rPr>
+                <w:rFonts w:eastAsia="Arial" w:cs="Arial"/>
+                <w:kern w:val="0"/>
+                <w:sz w:val="22"/>
+                <w:szCs w:val="22"/>
+                <w:lang w:val="en-US" w:eastAsia="zh-CN" w:bidi="hi-IN"/>
+              </w:rPr>
+              <w:t>T</w:t>
+            </w:r>
+            <w:r>
+              <w:rPr>
+                <w:rFonts w:eastAsia="Arial" w:cs="Arial"/>
+                <w:kern w:val="0"/>
+                <w:sz w:val="22"/>
+                <w:szCs w:val="22"/>
+                <w:lang w:val="en-US" w:eastAsia="zh-CN" w:bidi="hi-IN"/>
+              </w:rPr>
+              <w:t xml:space="preserve">ext box </w:t>
+            </w:r>
+            <w:r>
+              <w:rPr>
+                <w:rFonts w:eastAsia="Arial" w:cs="Arial"/>
+                <w:kern w:val="0"/>
+                <w:sz w:val="22"/>
+                <w:szCs w:val="22"/>
+                <w:lang w:val="en-US" w:eastAsia="zh-CN" w:bidi="hi-IN"/>
+              </w:rPr>
+              <w:t>input</w:t>
+            </w:r>
+            <w:r>
+              <w:rPr>
+                <w:rFonts w:eastAsia="Arial" w:cs="Arial"/>
+                <w:kern w:val="0"/>
+                <w:sz w:val="22"/>
+                <w:szCs w:val="22"/>
+                <w:lang w:val="en-US" w:eastAsia="zh-CN" w:bidi="hi-IN"/>
+              </w:rPr>
+              <w:t xml:space="preserve"> thing for users to type in for stuff.</w:t>
             </w:r>
           </w:p>
         </w:tc>
@@ -2723,7 +2943,7 @@
                 <w:rFonts w:eastAsia="Calibri" w:cs="Calibri" w:ascii="Calibri" w:hAnsi="Calibri"/>
               </w:rPr>
               <w:drawing>
-                <wp:anchor distT="0" distB="0" distL="0" distR="0" simplePos="0" relativeHeight="43" behindDoc="0" locked="0" layoutInCell="1" allowOverlap="1">
+                <wp:anchor distT="0" distB="0" distL="0" distR="0" simplePos="0" relativeHeight="46" behindDoc="0" locked="0" layoutInCell="1" allowOverlap="1">
                   <wp:simplePos x="0" y="0"/>
                   <wp:positionH relativeFrom="column">
                     <wp:posOffset>-5080</wp:posOffset>
@@ -2912,6 +3132,52 @@
                 <w:szCs w:val="22"/>
                 <w:lang w:val="en-US" w:eastAsia="zh-CN" w:bidi="hi-IN"/>
               </w:rPr>
+              <w:drawing>
+                <wp:anchor distT="0" distB="0" distL="0" distR="0" simplePos="0" relativeHeight="53" behindDoc="0" locked="0" layoutInCell="0" allowOverlap="1">
+                  <wp:simplePos x="0" y="0"/>
+                  <wp:positionH relativeFrom="column">
+                    <wp:align>center</wp:align>
+                  </wp:positionH>
+                  <wp:positionV relativeFrom="paragraph">
+                    <wp:posOffset>635</wp:posOffset>
+                  </wp:positionV>
+                  <wp:extent cx="6209665" cy="3878580"/>
+                  <wp:effectExtent l="0" t="0" r="0" b="0"/>
+                  <wp:wrapSquare wrapText="largest"/>
+                  <wp:docPr id="5" name="Image4"/>
+                  <wp:cNvGraphicFramePr>
+                    <a:graphicFrameLocks xmlns:a="http://schemas.openxmlformats.org/drawingml/2006/main" noChangeAspect="1"/>
+                  </wp:cNvGraphicFramePr>
+                  <a:graphic xmlns:a="http://schemas.openxmlformats.org/drawingml/2006/main">
+                    <a:graphicData uri="http://schemas.openxmlformats.org/drawingml/2006/picture">
+                      <pic:pic xmlns:pic="http://schemas.openxmlformats.org/drawingml/2006/picture">
+                        <pic:nvPicPr>
+                          <pic:cNvPr id="5" name="Image4"/>
+                          <pic:cNvPicPr>
+                            <a:picLocks noChangeAspect="1" noChangeArrowheads="1"/>
+                          </pic:cNvPicPr>
+                        </pic:nvPicPr>
+                        <pic:blipFill>
+                          <a:blip r:embed="rId6"/>
+                          <a:stretch>
+                            <a:fillRect/>
+                          </a:stretch>
+                        </pic:blipFill>
+                        <pic:spPr bwMode="auto">
+                          <a:xfrm>
+                            <a:off x="0" y="0"/>
+                            <a:ext cx="6209665" cy="3878580"/>
+                          </a:xfrm>
+                          <a:prstGeom prst="rect">
+                            <a:avLst/>
+                          </a:prstGeom>
+                          <a:noFill/>
+                        </pic:spPr>
+                      </pic:pic>
+                    </a:graphicData>
+                  </a:graphic>
+                </wp:anchor>
+              </w:drawing>
             </w:r>
           </w:p>
         </w:tc>
@@ -2965,16 +3231,16 @@
         <w:tblLook w:val="0600" w:firstRow="0" w:noVBand="1" w:lastRow="0" w:firstColumn="0" w:lastColumn="0" w:noHBand="1"/>
       </w:tblPr>
       <w:tblGrid>
-        <w:gridCol w:w="3476"/>
-        <w:gridCol w:w="2824"/>
-        <w:gridCol w:w="2981"/>
-        <w:gridCol w:w="1054"/>
+        <w:gridCol w:w="3475"/>
+        <w:gridCol w:w="2825"/>
+        <w:gridCol w:w="2980"/>
+        <w:gridCol w:w="1055"/>
       </w:tblGrid>
       <w:tr>
         <w:trPr/>
         <w:tc>
           <w:tcPr>
-            <w:tcW w:w="3476" w:type="dxa"/>
+            <w:tcW w:w="3475" w:type="dxa"/>
             <w:tcBorders>
               <w:top w:val="single" w:sz="8" w:space="0" w:color="000000"/>
               <w:start w:val="single" w:sz="8" w:space="0" w:color="000000"/>
@@ -3011,7 +3277,7 @@
         </w:tc>
         <w:tc>
           <w:tcPr>
-            <w:tcW w:w="2824" w:type="dxa"/>
+            <w:tcW w:w="2825" w:type="dxa"/>
             <w:tcBorders>
               <w:top w:val="single" w:sz="8" w:space="0" w:color="000000"/>
               <w:start w:val="single" w:sz="8" w:space="0" w:color="000000"/>
@@ -3044,7 +3310,7 @@
         </w:tc>
         <w:tc>
           <w:tcPr>
-            <w:tcW w:w="2981" w:type="dxa"/>
+            <w:tcW w:w="2980" w:type="dxa"/>
             <w:tcBorders>
               <w:top w:val="single" w:sz="8" w:space="0" w:color="000000"/>
               <w:start w:val="single" w:sz="8" w:space="0" w:color="000000"/>
@@ -3077,7 +3343,7 @@
         </w:tc>
         <w:tc>
           <w:tcPr>
-            <w:tcW w:w="1054" w:type="dxa"/>
+            <w:tcW w:w="1055" w:type="dxa"/>
             <w:tcBorders>
               <w:top w:val="single" w:sz="8" w:space="0" w:color="000000"/>
               <w:start w:val="single" w:sz="8" w:space="0" w:color="000000"/>
@@ -3113,7 +3379,7 @@
         <w:trPr/>
         <w:tc>
           <w:tcPr>
-            <w:tcW w:w="3476" w:type="dxa"/>
+            <w:tcW w:w="3475" w:type="dxa"/>
             <w:tcBorders>
               <w:top w:val="single" w:sz="8" w:space="0" w:color="000000"/>
               <w:start w:val="single" w:sz="8" w:space="0" w:color="000000"/>
@@ -3151,7 +3417,7 @@
         </w:tc>
         <w:tc>
           <w:tcPr>
-            <w:tcW w:w="2824" w:type="dxa"/>
+            <w:tcW w:w="2825" w:type="dxa"/>
             <w:tcBorders>
               <w:top w:val="single" w:sz="8" w:space="0" w:color="000000"/>
               <w:start w:val="single" w:sz="8" w:space="0" w:color="000000"/>
@@ -3189,7 +3455,7 @@
         </w:tc>
         <w:tc>
           <w:tcPr>
-            <w:tcW w:w="2981" w:type="dxa"/>
+            <w:tcW w:w="2980" w:type="dxa"/>
             <w:tcBorders>
               <w:top w:val="single" w:sz="8" w:space="0" w:color="000000"/>
               <w:start w:val="single" w:sz="8" w:space="0" w:color="000000"/>
@@ -3227,7 +3493,7 @@
         </w:tc>
         <w:tc>
           <w:tcPr>
-            <w:tcW w:w="1054" w:type="dxa"/>
+            <w:tcW w:w="1055" w:type="dxa"/>
             <w:tcBorders>
               <w:top w:val="single" w:sz="8" w:space="0" w:color="000000"/>
               <w:start w:val="single" w:sz="8" w:space="0" w:color="000000"/>
@@ -3268,7 +3534,7 @@
         <w:trPr/>
         <w:tc>
           <w:tcPr>
-            <w:tcW w:w="3476" w:type="dxa"/>
+            <w:tcW w:w="3475" w:type="dxa"/>
             <w:tcBorders>
               <w:top w:val="single" w:sz="8" w:space="0" w:color="000000"/>
               <w:start w:val="single" w:sz="8" w:space="0" w:color="000000"/>
@@ -3301,35 +3567,35 @@
         </w:tc>
         <w:tc>
           <w:tcPr>
-            <w:tcW w:w="2824" w:type="dxa"/>
-            <w:tcBorders>
-              <w:top w:val="single" w:sz="8" w:space="0" w:color="000000"/>
-              <w:start w:val="single" w:sz="8" w:space="0" w:color="000000"/>
-              <w:bottom w:val="single" w:sz="8" w:space="0" w:color="000000"/>
-              <w:end w:val="single" w:sz="8" w:space="0" w:color="000000"/>
-            </w:tcBorders>
-          </w:tcPr>
-          <w:p>
-            <w:pPr>
-              <w:pStyle w:val="normal1"/>
-              <w:widowControl w:val="false"/>
-              <w:suppressAutoHyphens w:val="true"/>
-              <w:spacing w:lineRule="auto" w:line="240" w:before="0" w:after="0"/>
-              <w:jc w:val="start"/>
-              <w:rPr>
-                <w:rFonts w:ascii="Calibri" w:hAnsi="Calibri" w:eastAsia="Calibri" w:cs="Calibri"/>
-              </w:rPr>
-            </w:pPr>
-            <w:r>
-              <w:rPr>
-                <w:rFonts w:eastAsia="Calibri" w:cs="Calibri" w:ascii="Calibri" w:hAnsi="Calibri"/>
-              </w:rPr>
-            </w:r>
-          </w:p>
-        </w:tc>
-        <w:tc>
-          <w:tcPr>
-            <w:tcW w:w="2981" w:type="dxa"/>
+            <w:tcW w:w="2825" w:type="dxa"/>
+            <w:tcBorders>
+              <w:top w:val="single" w:sz="8" w:space="0" w:color="000000"/>
+              <w:start w:val="single" w:sz="8" w:space="0" w:color="000000"/>
+              <w:bottom w:val="single" w:sz="8" w:space="0" w:color="000000"/>
+              <w:end w:val="single" w:sz="8" w:space="0" w:color="000000"/>
+            </w:tcBorders>
+          </w:tcPr>
+          <w:p>
+            <w:pPr>
+              <w:pStyle w:val="normal1"/>
+              <w:widowControl w:val="false"/>
+              <w:suppressAutoHyphens w:val="true"/>
+              <w:spacing w:lineRule="auto" w:line="240" w:before="0" w:after="0"/>
+              <w:jc w:val="start"/>
+              <w:rPr>
+                <w:rFonts w:ascii="Calibri" w:hAnsi="Calibri" w:eastAsia="Calibri" w:cs="Calibri"/>
+              </w:rPr>
+            </w:pPr>
+            <w:r>
+              <w:rPr>
+                <w:rFonts w:eastAsia="Calibri" w:cs="Calibri" w:ascii="Calibri" w:hAnsi="Calibri"/>
+              </w:rPr>
+            </w:r>
+          </w:p>
+        </w:tc>
+        <w:tc>
+          <w:tcPr>
+            <w:tcW w:w="2980" w:type="dxa"/>
             <w:tcBorders>
               <w:top w:val="single" w:sz="8" w:space="0" w:color="000000"/>
               <w:start w:val="single" w:sz="8" w:space="0" w:color="000000"/>
@@ -3353,7 +3619,7 @@
                 <w:rFonts w:eastAsia="Calibri" w:cs="Calibri" w:ascii="Calibri" w:hAnsi="Calibri"/>
               </w:rPr>
               <w:drawing>
-                <wp:anchor distT="0" distB="0" distL="0" distR="0" simplePos="0" relativeHeight="48" behindDoc="0" locked="0" layoutInCell="0" allowOverlap="1">
+                <wp:anchor distT="0" distB="0" distL="0" distR="0" simplePos="0" relativeHeight="51" behindDoc="0" locked="0" layoutInCell="1" allowOverlap="1">
                   <wp:simplePos x="0" y="0"/>
                   <wp:positionH relativeFrom="column">
                     <wp:align>center</wp:align>
@@ -3364,7 +3630,7 @@
                   <wp:extent cx="1765935" cy="226060"/>
                   <wp:effectExtent l="0" t="0" r="0" b="0"/>
                   <wp:wrapSquare wrapText="largest"/>
-                  <wp:docPr id="5" name="Image10"/>
+                  <wp:docPr id="6" name="Image10"/>
                   <wp:cNvGraphicFramePr>
                     <a:graphicFrameLocks xmlns:a="http://schemas.openxmlformats.org/drawingml/2006/main" noChangeAspect="1"/>
                   </wp:cNvGraphicFramePr>
@@ -3372,13 +3638,13 @@
                     <a:graphicData uri="http://schemas.openxmlformats.org/drawingml/2006/picture">
                       <pic:pic xmlns:pic="http://schemas.openxmlformats.org/drawingml/2006/picture">
                         <pic:nvPicPr>
-                          <pic:cNvPr id="5" name="Image10"/>
+                          <pic:cNvPr id="6" name="Image10"/>
                           <pic:cNvPicPr>
                             <a:picLocks noChangeAspect="1" noChangeArrowheads="1"/>
                           </pic:cNvPicPr>
                         </pic:nvPicPr>
                         <pic:blipFill>
-                          <a:blip r:embed="rId6"/>
+                          <a:blip r:embed="rId7"/>
                           <a:stretch>
                             <a:fillRect/>
                           </a:stretch>
@@ -3403,7 +3669,7 @@
         </w:tc>
         <w:tc>
           <w:tcPr>
-            <w:tcW w:w="1054" w:type="dxa"/>
+            <w:tcW w:w="1055" w:type="dxa"/>
             <w:tcBorders>
               <w:top w:val="single" w:sz="8" w:space="0" w:color="000000"/>
               <w:start w:val="single" w:sz="8" w:space="0" w:color="000000"/>
@@ -3434,7 +3700,7 @@
         <w:trPr/>
         <w:tc>
           <w:tcPr>
-            <w:tcW w:w="3476" w:type="dxa"/>
+            <w:tcW w:w="3475" w:type="dxa"/>
             <w:tcBorders>
               <w:top w:val="single" w:sz="8" w:space="0" w:color="000000"/>
               <w:start w:val="single" w:sz="8" w:space="0" w:color="000000"/>
@@ -3467,35 +3733,35 @@
         </w:tc>
         <w:tc>
           <w:tcPr>
-            <w:tcW w:w="2824" w:type="dxa"/>
-            <w:tcBorders>
-              <w:top w:val="single" w:sz="8" w:space="0" w:color="000000"/>
-              <w:start w:val="single" w:sz="8" w:space="0" w:color="000000"/>
-              <w:bottom w:val="single" w:sz="8" w:space="0" w:color="000000"/>
-              <w:end w:val="single" w:sz="8" w:space="0" w:color="000000"/>
-            </w:tcBorders>
-          </w:tcPr>
-          <w:p>
-            <w:pPr>
-              <w:pStyle w:val="normal1"/>
-              <w:widowControl w:val="false"/>
-              <w:suppressAutoHyphens w:val="true"/>
-              <w:spacing w:lineRule="auto" w:line="240" w:before="0" w:after="0"/>
-              <w:jc w:val="start"/>
-              <w:rPr>
-                <w:rFonts w:ascii="Calibri" w:hAnsi="Calibri" w:eastAsia="Calibri" w:cs="Calibri"/>
-              </w:rPr>
-            </w:pPr>
-            <w:r>
-              <w:rPr>
-                <w:rFonts w:eastAsia="Calibri" w:cs="Calibri" w:ascii="Calibri" w:hAnsi="Calibri"/>
-              </w:rPr>
-            </w:r>
-          </w:p>
-        </w:tc>
-        <w:tc>
-          <w:tcPr>
-            <w:tcW w:w="2981" w:type="dxa"/>
+            <w:tcW w:w="2825" w:type="dxa"/>
+            <w:tcBorders>
+              <w:top w:val="single" w:sz="8" w:space="0" w:color="000000"/>
+              <w:start w:val="single" w:sz="8" w:space="0" w:color="000000"/>
+              <w:bottom w:val="single" w:sz="8" w:space="0" w:color="000000"/>
+              <w:end w:val="single" w:sz="8" w:space="0" w:color="000000"/>
+            </w:tcBorders>
+          </w:tcPr>
+          <w:p>
+            <w:pPr>
+              <w:pStyle w:val="normal1"/>
+              <w:widowControl w:val="false"/>
+              <w:suppressAutoHyphens w:val="true"/>
+              <w:spacing w:lineRule="auto" w:line="240" w:before="0" w:after="0"/>
+              <w:jc w:val="start"/>
+              <w:rPr>
+                <w:rFonts w:ascii="Calibri" w:hAnsi="Calibri" w:eastAsia="Calibri" w:cs="Calibri"/>
+              </w:rPr>
+            </w:pPr>
+            <w:r>
+              <w:rPr>
+                <w:rFonts w:eastAsia="Calibri" w:cs="Calibri" w:ascii="Calibri" w:hAnsi="Calibri"/>
+              </w:rPr>
+            </w:r>
+          </w:p>
+        </w:tc>
+        <w:tc>
+          <w:tcPr>
+            <w:tcW w:w="2980" w:type="dxa"/>
             <w:tcBorders>
               <w:top w:val="single" w:sz="8" w:space="0" w:color="000000"/>
               <w:start w:val="single" w:sz="8" w:space="0" w:color="000000"/>
@@ -3528,7 +3794,7 @@
         </w:tc>
         <w:tc>
           <w:tcPr>
-            <w:tcW w:w="1054" w:type="dxa"/>
+            <w:tcW w:w="1055" w:type="dxa"/>
             <w:tcBorders>
               <w:top w:val="single" w:sz="8" w:space="0" w:color="000000"/>
               <w:start w:val="single" w:sz="8" w:space="0" w:color="000000"/>
@@ -3564,7 +3830,7 @@
         <w:trPr/>
         <w:tc>
           <w:tcPr>
-            <w:tcW w:w="3476" w:type="dxa"/>
+            <w:tcW w:w="3475" w:type="dxa"/>
             <w:tcBorders>
               <w:top w:val="single" w:sz="8" w:space="0" w:color="000000"/>
               <w:start w:val="single" w:sz="8" w:space="0" w:color="000000"/>
@@ -3597,63 +3863,63 @@
         </w:tc>
         <w:tc>
           <w:tcPr>
-            <w:tcW w:w="2824" w:type="dxa"/>
-            <w:tcBorders>
-              <w:top w:val="single" w:sz="8" w:space="0" w:color="000000"/>
-              <w:start w:val="single" w:sz="8" w:space="0" w:color="000000"/>
-              <w:bottom w:val="single" w:sz="8" w:space="0" w:color="000000"/>
-              <w:end w:val="single" w:sz="8" w:space="0" w:color="000000"/>
-            </w:tcBorders>
-          </w:tcPr>
-          <w:p>
-            <w:pPr>
-              <w:pStyle w:val="normal1"/>
-              <w:widowControl w:val="false"/>
-              <w:suppressAutoHyphens w:val="true"/>
-              <w:spacing w:lineRule="auto" w:line="240" w:before="0" w:after="0"/>
-              <w:jc w:val="start"/>
-              <w:rPr>
-                <w:rFonts w:ascii="Calibri" w:hAnsi="Calibri" w:eastAsia="Calibri" w:cs="Calibri"/>
-              </w:rPr>
-            </w:pPr>
-            <w:r>
-              <w:rPr>
-                <w:rFonts w:eastAsia="Calibri" w:cs="Calibri" w:ascii="Calibri" w:hAnsi="Calibri"/>
-              </w:rPr>
-            </w:r>
-          </w:p>
-        </w:tc>
-        <w:tc>
-          <w:tcPr>
-            <w:tcW w:w="2981" w:type="dxa"/>
-            <w:tcBorders>
-              <w:top w:val="single" w:sz="8" w:space="0" w:color="000000"/>
-              <w:start w:val="single" w:sz="8" w:space="0" w:color="000000"/>
-              <w:bottom w:val="single" w:sz="8" w:space="0" w:color="000000"/>
-              <w:end w:val="single" w:sz="8" w:space="0" w:color="000000"/>
-            </w:tcBorders>
-          </w:tcPr>
-          <w:p>
-            <w:pPr>
-              <w:pStyle w:val="normal1"/>
-              <w:widowControl w:val="false"/>
-              <w:suppressAutoHyphens w:val="true"/>
-              <w:spacing w:lineRule="auto" w:line="240" w:before="0" w:after="0"/>
-              <w:jc w:val="start"/>
-              <w:rPr>
-                <w:rFonts w:ascii="Calibri" w:hAnsi="Calibri" w:eastAsia="Calibri" w:cs="Calibri"/>
-              </w:rPr>
-            </w:pPr>
-            <w:r>
-              <w:rPr>
-                <w:rFonts w:eastAsia="Calibri" w:cs="Calibri" w:ascii="Calibri" w:hAnsi="Calibri"/>
-              </w:rPr>
-            </w:r>
-          </w:p>
-        </w:tc>
-        <w:tc>
-          <w:tcPr>
-            <w:tcW w:w="1054" w:type="dxa"/>
+            <w:tcW w:w="2825" w:type="dxa"/>
+            <w:tcBorders>
+              <w:top w:val="single" w:sz="8" w:space="0" w:color="000000"/>
+              <w:start w:val="single" w:sz="8" w:space="0" w:color="000000"/>
+              <w:bottom w:val="single" w:sz="8" w:space="0" w:color="000000"/>
+              <w:end w:val="single" w:sz="8" w:space="0" w:color="000000"/>
+            </w:tcBorders>
+          </w:tcPr>
+          <w:p>
+            <w:pPr>
+              <w:pStyle w:val="normal1"/>
+              <w:widowControl w:val="false"/>
+              <w:suppressAutoHyphens w:val="true"/>
+              <w:spacing w:lineRule="auto" w:line="240" w:before="0" w:after="0"/>
+              <w:jc w:val="start"/>
+              <w:rPr>
+                <w:rFonts w:ascii="Calibri" w:hAnsi="Calibri" w:eastAsia="Calibri" w:cs="Calibri"/>
+              </w:rPr>
+            </w:pPr>
+            <w:r>
+              <w:rPr>
+                <w:rFonts w:eastAsia="Calibri" w:cs="Calibri" w:ascii="Calibri" w:hAnsi="Calibri"/>
+              </w:rPr>
+            </w:r>
+          </w:p>
+        </w:tc>
+        <w:tc>
+          <w:tcPr>
+            <w:tcW w:w="2980" w:type="dxa"/>
+            <w:tcBorders>
+              <w:top w:val="single" w:sz="8" w:space="0" w:color="000000"/>
+              <w:start w:val="single" w:sz="8" w:space="0" w:color="000000"/>
+              <w:bottom w:val="single" w:sz="8" w:space="0" w:color="000000"/>
+              <w:end w:val="single" w:sz="8" w:space="0" w:color="000000"/>
+            </w:tcBorders>
+          </w:tcPr>
+          <w:p>
+            <w:pPr>
+              <w:pStyle w:val="normal1"/>
+              <w:widowControl w:val="false"/>
+              <w:suppressAutoHyphens w:val="true"/>
+              <w:spacing w:lineRule="auto" w:line="240" w:before="0" w:after="0"/>
+              <w:jc w:val="start"/>
+              <w:rPr>
+                <w:rFonts w:ascii="Calibri" w:hAnsi="Calibri" w:eastAsia="Calibri" w:cs="Calibri"/>
+              </w:rPr>
+            </w:pPr>
+            <w:r>
+              <w:rPr>
+                <w:rFonts w:eastAsia="Calibri" w:cs="Calibri" w:ascii="Calibri" w:hAnsi="Calibri"/>
+              </w:rPr>
+            </w:r>
+          </w:p>
+        </w:tc>
+        <w:tc>
+          <w:tcPr>
+            <w:tcW w:w="1055" w:type="dxa"/>
             <w:tcBorders>
               <w:top w:val="single" w:sz="8" w:space="0" w:color="000000"/>
               <w:start w:val="single" w:sz="8" w:space="0" w:color="000000"/>
@@ -3684,91 +3950,91 @@
         <w:trPr/>
         <w:tc>
           <w:tcPr>
-            <w:tcW w:w="3476" w:type="dxa"/>
-            <w:tcBorders>
-              <w:top w:val="single" w:sz="8" w:space="0" w:color="000000"/>
-              <w:start w:val="single" w:sz="8" w:space="0" w:color="000000"/>
-              <w:bottom w:val="single" w:sz="8" w:space="0" w:color="000000"/>
-              <w:end w:val="single" w:sz="8" w:space="0" w:color="000000"/>
-            </w:tcBorders>
-          </w:tcPr>
-          <w:p>
-            <w:pPr>
-              <w:pStyle w:val="normal1"/>
-              <w:widowControl w:val="false"/>
-              <w:suppressAutoHyphens w:val="true"/>
-              <w:spacing w:lineRule="auto" w:line="240" w:before="0" w:after="0"/>
-              <w:jc w:val="start"/>
-              <w:rPr>
-                <w:rFonts w:ascii="Calibri" w:hAnsi="Calibri" w:eastAsia="Calibri" w:cs="Calibri"/>
-              </w:rPr>
-            </w:pPr>
-            <w:r>
-              <w:rPr>
-                <w:rFonts w:eastAsia="Calibri" w:cs="Calibri" w:ascii="Calibri" w:hAnsi="Calibri"/>
-              </w:rPr>
-            </w:r>
-          </w:p>
-        </w:tc>
-        <w:tc>
-          <w:tcPr>
-            <w:tcW w:w="2824" w:type="dxa"/>
-            <w:tcBorders>
-              <w:top w:val="single" w:sz="8" w:space="0" w:color="000000"/>
-              <w:start w:val="single" w:sz="8" w:space="0" w:color="000000"/>
-              <w:bottom w:val="single" w:sz="8" w:space="0" w:color="000000"/>
-              <w:end w:val="single" w:sz="8" w:space="0" w:color="000000"/>
-            </w:tcBorders>
-          </w:tcPr>
-          <w:p>
-            <w:pPr>
-              <w:pStyle w:val="normal1"/>
-              <w:widowControl w:val="false"/>
-              <w:suppressAutoHyphens w:val="true"/>
-              <w:spacing w:lineRule="auto" w:line="240" w:before="0" w:after="0"/>
-              <w:jc w:val="start"/>
-              <w:rPr>
-                <w:rFonts w:ascii="Calibri" w:hAnsi="Calibri" w:eastAsia="Calibri" w:cs="Calibri"/>
-              </w:rPr>
-            </w:pPr>
-            <w:r>
-              <w:rPr>
-                <w:rFonts w:eastAsia="Calibri" w:cs="Calibri" w:ascii="Calibri" w:hAnsi="Calibri"/>
-              </w:rPr>
-            </w:r>
-          </w:p>
-        </w:tc>
-        <w:tc>
-          <w:tcPr>
-            <w:tcW w:w="2981" w:type="dxa"/>
-            <w:tcBorders>
-              <w:top w:val="single" w:sz="8" w:space="0" w:color="000000"/>
-              <w:start w:val="single" w:sz="8" w:space="0" w:color="000000"/>
-              <w:bottom w:val="single" w:sz="8" w:space="0" w:color="000000"/>
-              <w:end w:val="single" w:sz="8" w:space="0" w:color="000000"/>
-            </w:tcBorders>
-          </w:tcPr>
-          <w:p>
-            <w:pPr>
-              <w:pStyle w:val="normal1"/>
-              <w:widowControl w:val="false"/>
-              <w:suppressAutoHyphens w:val="true"/>
-              <w:spacing w:lineRule="auto" w:line="240" w:before="0" w:after="0"/>
-              <w:jc w:val="start"/>
-              <w:rPr>
-                <w:rFonts w:ascii="Calibri" w:hAnsi="Calibri" w:eastAsia="Calibri" w:cs="Calibri"/>
-              </w:rPr>
-            </w:pPr>
-            <w:r>
-              <w:rPr>
-                <w:rFonts w:eastAsia="Calibri" w:cs="Calibri" w:ascii="Calibri" w:hAnsi="Calibri"/>
-              </w:rPr>
-            </w:r>
-          </w:p>
-        </w:tc>
-        <w:tc>
-          <w:tcPr>
-            <w:tcW w:w="1054" w:type="dxa"/>
+            <w:tcW w:w="3475" w:type="dxa"/>
+            <w:tcBorders>
+              <w:top w:val="single" w:sz="8" w:space="0" w:color="000000"/>
+              <w:start w:val="single" w:sz="8" w:space="0" w:color="000000"/>
+              <w:bottom w:val="single" w:sz="8" w:space="0" w:color="000000"/>
+              <w:end w:val="single" w:sz="8" w:space="0" w:color="000000"/>
+            </w:tcBorders>
+          </w:tcPr>
+          <w:p>
+            <w:pPr>
+              <w:pStyle w:val="normal1"/>
+              <w:widowControl w:val="false"/>
+              <w:suppressAutoHyphens w:val="true"/>
+              <w:spacing w:lineRule="auto" w:line="240" w:before="0" w:after="0"/>
+              <w:jc w:val="start"/>
+              <w:rPr>
+                <w:rFonts w:ascii="Calibri" w:hAnsi="Calibri" w:eastAsia="Calibri" w:cs="Calibri"/>
+              </w:rPr>
+            </w:pPr>
+            <w:r>
+              <w:rPr>
+                <w:rFonts w:eastAsia="Calibri" w:cs="Calibri" w:ascii="Calibri" w:hAnsi="Calibri"/>
+              </w:rPr>
+            </w:r>
+          </w:p>
+        </w:tc>
+        <w:tc>
+          <w:tcPr>
+            <w:tcW w:w="2825" w:type="dxa"/>
+            <w:tcBorders>
+              <w:top w:val="single" w:sz="8" w:space="0" w:color="000000"/>
+              <w:start w:val="single" w:sz="8" w:space="0" w:color="000000"/>
+              <w:bottom w:val="single" w:sz="8" w:space="0" w:color="000000"/>
+              <w:end w:val="single" w:sz="8" w:space="0" w:color="000000"/>
+            </w:tcBorders>
+          </w:tcPr>
+          <w:p>
+            <w:pPr>
+              <w:pStyle w:val="normal1"/>
+              <w:widowControl w:val="false"/>
+              <w:suppressAutoHyphens w:val="true"/>
+              <w:spacing w:lineRule="auto" w:line="240" w:before="0" w:after="0"/>
+              <w:jc w:val="start"/>
+              <w:rPr>
+                <w:rFonts w:ascii="Calibri" w:hAnsi="Calibri" w:eastAsia="Calibri" w:cs="Calibri"/>
+              </w:rPr>
+            </w:pPr>
+            <w:r>
+              <w:rPr>
+                <w:rFonts w:eastAsia="Calibri" w:cs="Calibri" w:ascii="Calibri" w:hAnsi="Calibri"/>
+              </w:rPr>
+            </w:r>
+          </w:p>
+        </w:tc>
+        <w:tc>
+          <w:tcPr>
+            <w:tcW w:w="2980" w:type="dxa"/>
+            <w:tcBorders>
+              <w:top w:val="single" w:sz="8" w:space="0" w:color="000000"/>
+              <w:start w:val="single" w:sz="8" w:space="0" w:color="000000"/>
+              <w:bottom w:val="single" w:sz="8" w:space="0" w:color="000000"/>
+              <w:end w:val="single" w:sz="8" w:space="0" w:color="000000"/>
+            </w:tcBorders>
+          </w:tcPr>
+          <w:p>
+            <w:pPr>
+              <w:pStyle w:val="normal1"/>
+              <w:widowControl w:val="false"/>
+              <w:suppressAutoHyphens w:val="true"/>
+              <w:spacing w:lineRule="auto" w:line="240" w:before="0" w:after="0"/>
+              <w:jc w:val="start"/>
+              <w:rPr>
+                <w:rFonts w:ascii="Calibri" w:hAnsi="Calibri" w:eastAsia="Calibri" w:cs="Calibri"/>
+              </w:rPr>
+            </w:pPr>
+            <w:r>
+              <w:rPr>
+                <w:rFonts w:eastAsia="Calibri" w:cs="Calibri" w:ascii="Calibri" w:hAnsi="Calibri"/>
+              </w:rPr>
+            </w:r>
+          </w:p>
+        </w:tc>
+        <w:tc>
+          <w:tcPr>
+            <w:tcW w:w="1055" w:type="dxa"/>
             <w:tcBorders>
               <w:top w:val="single" w:sz="8" w:space="0" w:color="000000"/>
               <w:start w:val="single" w:sz="8" w:space="0" w:color="000000"/>
@@ -5405,8 +5671,8 @@
         <w:tblLook w:val="0600" w:firstRow="0" w:noVBand="1" w:lastRow="0" w:firstColumn="0" w:lastColumn="0" w:noHBand="1"/>
       </w:tblPr>
       <w:tblGrid>
-        <w:gridCol w:w="3476"/>
-        <w:gridCol w:w="2824"/>
+        <w:gridCol w:w="3475"/>
+        <w:gridCol w:w="2825"/>
         <w:gridCol w:w="3402"/>
         <w:gridCol w:w="633"/>
       </w:tblGrid>
@@ -5414,7 +5680,7 @@
         <w:trPr/>
         <w:tc>
           <w:tcPr>
-            <w:tcW w:w="3476" w:type="dxa"/>
+            <w:tcW w:w="3475" w:type="dxa"/>
             <w:tcBorders>
               <w:top w:val="single" w:sz="8" w:space="0" w:color="000000"/>
               <w:start w:val="single" w:sz="8" w:space="0" w:color="000000"/>
@@ -5451,7 +5717,7 @@
         </w:tc>
         <w:tc>
           <w:tcPr>
-            <w:tcW w:w="2824" w:type="dxa"/>
+            <w:tcW w:w="2825" w:type="dxa"/>
             <w:tcBorders>
               <w:top w:val="single" w:sz="8" w:space="0" w:color="000000"/>
               <w:start w:val="single" w:sz="8" w:space="0" w:color="000000"/>
@@ -5553,7 +5819,7 @@
         <w:trPr/>
         <w:tc>
           <w:tcPr>
-            <w:tcW w:w="3476" w:type="dxa"/>
+            <w:tcW w:w="3475" w:type="dxa"/>
             <w:tcBorders>
               <w:top w:val="single" w:sz="8" w:space="0" w:color="000000"/>
               <w:start w:val="single" w:sz="8" w:space="0" w:color="000000"/>
@@ -5591,7 +5857,7 @@
         </w:tc>
         <w:tc>
           <w:tcPr>
-            <w:tcW w:w="2824" w:type="dxa"/>
+            <w:tcW w:w="2825" w:type="dxa"/>
             <w:tcBorders>
               <w:top w:val="single" w:sz="8" w:space="0" w:color="000000"/>
               <w:start w:val="single" w:sz="8" w:space="0" w:color="000000"/>
@@ -5708,7 +5974,7 @@
         <w:trPr/>
         <w:tc>
           <w:tcPr>
-            <w:tcW w:w="3476" w:type="dxa"/>
+            <w:tcW w:w="3475" w:type="dxa"/>
             <w:tcBorders>
               <w:top w:val="single" w:sz="8" w:space="0" w:color="000000"/>
               <w:start w:val="single" w:sz="8" w:space="0" w:color="000000"/>
@@ -5737,7 +6003,7 @@
         </w:tc>
         <w:tc>
           <w:tcPr>
-            <w:tcW w:w="2824" w:type="dxa"/>
+            <w:tcW w:w="2825" w:type="dxa"/>
             <w:tcBorders>
               <w:top w:val="single" w:sz="8" w:space="0" w:color="000000"/>
               <w:start w:val="single" w:sz="8" w:space="0" w:color="000000"/>
@@ -5789,7 +6055,7 @@
                 <w:rFonts w:eastAsia="Calibri" w:cs="Calibri" w:ascii="Calibri" w:hAnsi="Calibri"/>
               </w:rPr>
               <w:drawing>
-                <wp:anchor distT="0" distB="0" distL="0" distR="0" simplePos="0" relativeHeight="49" behindDoc="0" locked="0" layoutInCell="0" allowOverlap="1">
+                <wp:anchor distT="0" distB="0" distL="0" distR="0" simplePos="0" relativeHeight="52" behindDoc="0" locked="0" layoutInCell="1" allowOverlap="1">
                   <wp:simplePos x="0" y="0"/>
                   <wp:positionH relativeFrom="column">
                     <wp:align>center</wp:align>
@@ -5800,7 +6066,7 @@
                   <wp:extent cx="2033270" cy="272415"/>
                   <wp:effectExtent l="0" t="0" r="0" b="0"/>
                   <wp:wrapSquare wrapText="largest"/>
-                  <wp:docPr id="6" name="Image11"/>
+                  <wp:docPr id="7" name="Image11"/>
                   <wp:cNvGraphicFramePr>
                     <a:graphicFrameLocks xmlns:a="http://schemas.openxmlformats.org/drawingml/2006/main" noChangeAspect="1"/>
                   </wp:cNvGraphicFramePr>
@@ -5808,13 +6074,13 @@
                     <a:graphicData uri="http://schemas.openxmlformats.org/drawingml/2006/picture">
                       <pic:pic xmlns:pic="http://schemas.openxmlformats.org/drawingml/2006/picture">
                         <pic:nvPicPr>
-                          <pic:cNvPr id="6" name="Image11"/>
+                          <pic:cNvPr id="7" name="Image11"/>
                           <pic:cNvPicPr>
                             <a:picLocks noChangeAspect="1" noChangeArrowheads="1"/>
                           </pic:cNvPicPr>
                         </pic:nvPicPr>
                         <pic:blipFill>
-                          <a:blip r:embed="rId7"/>
+                          <a:blip r:embed="rId8"/>
                           <a:stretch>
                             <a:fillRect/>
                           </a:stretch>
@@ -5870,7 +6136,7 @@
         <w:trPr/>
         <w:tc>
           <w:tcPr>
-            <w:tcW w:w="3476" w:type="dxa"/>
+            <w:tcW w:w="3475" w:type="dxa"/>
             <w:tcBorders>
               <w:start w:val="single" w:sz="8" w:space="0" w:color="000000"/>
               <w:bottom w:val="single" w:sz="8" w:space="0" w:color="000000"/>
@@ -5898,7 +6164,7 @@
         </w:tc>
         <w:tc>
           <w:tcPr>
-            <w:tcW w:w="2824" w:type="dxa"/>
+            <w:tcW w:w="2825" w:type="dxa"/>
             <w:tcBorders>
               <w:start w:val="single" w:sz="8" w:space="0" w:color="000000"/>
               <w:bottom w:val="single" w:sz="8" w:space="0" w:color="000000"/>
@@ -5948,7 +6214,7 @@
                 <w:rFonts w:eastAsia="Calibri" w:cs="Calibri" w:ascii="Calibri" w:hAnsi="Calibri"/>
               </w:rPr>
               <w:drawing>
-                <wp:anchor distT="0" distB="0" distL="0" distR="0" simplePos="0" relativeHeight="45" behindDoc="0" locked="0" layoutInCell="0" allowOverlap="1">
+                <wp:anchor distT="0" distB="0" distL="0" distR="0" simplePos="0" relativeHeight="48" behindDoc="0" locked="0" layoutInCell="1" allowOverlap="1">
                   <wp:simplePos x="0" y="0"/>
                   <wp:positionH relativeFrom="column">
                     <wp:align>center</wp:align>
@@ -5959,7 +6225,7 @@
                   <wp:extent cx="2033270" cy="791210"/>
                   <wp:effectExtent l="0" t="0" r="0" b="0"/>
                   <wp:wrapSquare wrapText="largest"/>
-                  <wp:docPr id="7" name="Image7"/>
+                  <wp:docPr id="8" name="Image7"/>
                   <wp:cNvGraphicFramePr>
                     <a:graphicFrameLocks xmlns:a="http://schemas.openxmlformats.org/drawingml/2006/main" noChangeAspect="1"/>
                   </wp:cNvGraphicFramePr>
@@ -5967,13 +6233,13 @@
                     <a:graphicData uri="http://schemas.openxmlformats.org/drawingml/2006/picture">
                       <pic:pic xmlns:pic="http://schemas.openxmlformats.org/drawingml/2006/picture">
                         <pic:nvPicPr>
-                          <pic:cNvPr id="7" name="Image7"/>
+                          <pic:cNvPr id="8" name="Image7"/>
                           <pic:cNvPicPr>
                             <a:picLocks noChangeAspect="1" noChangeArrowheads="1"/>
                           </pic:cNvPicPr>
                         </pic:nvPicPr>
                         <pic:blipFill>
-                          <a:blip r:embed="rId8"/>
+                          <a:blip r:embed="rId9"/>
                           <a:stretch>
                             <a:fillRect/>
                           </a:stretch>
@@ -6031,7 +6297,7 @@
         </w:trPr>
         <w:tc>
           <w:tcPr>
-            <w:tcW w:w="3476" w:type="dxa"/>
+            <w:tcW w:w="3475" w:type="dxa"/>
             <w:tcBorders>
               <w:top w:val="single" w:sz="8" w:space="0" w:color="000000"/>
               <w:start w:val="single" w:sz="8" w:space="0" w:color="000000"/>
@@ -6060,7 +6326,7 @@
         </w:tc>
         <w:tc>
           <w:tcPr>
-            <w:tcW w:w="2824" w:type="dxa"/>
+            <w:tcW w:w="2825" w:type="dxa"/>
             <w:tcBorders>
               <w:top w:val="single" w:sz="8" w:space="0" w:color="000000"/>
               <w:start w:val="single" w:sz="8" w:space="0" w:color="000000"/>
@@ -6112,7 +6378,7 @@
                 <w:rFonts w:eastAsia="Calibri" w:cs="Calibri" w:ascii="Calibri" w:hAnsi="Calibri"/>
               </w:rPr>
               <w:drawing>
-                <wp:anchor distT="0" distB="0" distL="0" distR="0" simplePos="0" relativeHeight="47" behindDoc="0" locked="0" layoutInCell="0" allowOverlap="1">
+                <wp:anchor distT="0" distB="0" distL="0" distR="0" simplePos="0" relativeHeight="50" behindDoc="0" locked="0" layoutInCell="1" allowOverlap="1">
                   <wp:simplePos x="0" y="0"/>
                   <wp:positionH relativeFrom="column">
                     <wp:posOffset>26670</wp:posOffset>
@@ -6123,7 +6389,7 @@
                   <wp:extent cx="2033270" cy="1061720"/>
                   <wp:effectExtent l="0" t="0" r="0" b="0"/>
                   <wp:wrapSquare wrapText="largest"/>
-                  <wp:docPr id="8" name="Image9"/>
+                  <wp:docPr id="9" name="Image9"/>
                   <wp:cNvGraphicFramePr>
                     <a:graphicFrameLocks xmlns:a="http://schemas.openxmlformats.org/drawingml/2006/main" noChangeAspect="1"/>
                   </wp:cNvGraphicFramePr>
@@ -6131,13 +6397,13 @@
                     <a:graphicData uri="http://schemas.openxmlformats.org/drawingml/2006/picture">
                       <pic:pic xmlns:pic="http://schemas.openxmlformats.org/drawingml/2006/picture">
                         <pic:nvPicPr>
-                          <pic:cNvPr id="8" name="Image9"/>
+                          <pic:cNvPr id="9" name="Image9"/>
                           <pic:cNvPicPr>
                             <a:picLocks noChangeAspect="1" noChangeArrowheads="1"/>
                           </pic:cNvPicPr>
                         </pic:nvPicPr>
                         <pic:blipFill>
-                          <a:blip r:embed="rId9"/>
+                          <a:blip r:embed="rId10"/>
                           <a:stretch>
                             <a:fillRect/>
                           </a:stretch>
@@ -6193,7 +6459,7 @@
         <w:trPr/>
         <w:tc>
           <w:tcPr>
-            <w:tcW w:w="3476" w:type="dxa"/>
+            <w:tcW w:w="3475" w:type="dxa"/>
             <w:tcBorders>
               <w:top w:val="single" w:sz="8" w:space="0" w:color="000000"/>
               <w:start w:val="single" w:sz="8" w:space="0" w:color="000000"/>
@@ -6222,7 +6488,7 @@
         </w:tc>
         <w:tc>
           <w:tcPr>
-            <w:tcW w:w="2824" w:type="dxa"/>
+            <w:tcW w:w="2825" w:type="dxa"/>
             <w:tcBorders>
               <w:top w:val="single" w:sz="8" w:space="0" w:color="000000"/>
               <w:start w:val="single" w:sz="8" w:space="0" w:color="000000"/>
@@ -6274,7 +6540,7 @@
                 <w:rFonts w:eastAsia="Calibri" w:cs="Calibri" w:ascii="Calibri" w:hAnsi="Calibri"/>
               </w:rPr>
               <w:drawing>
-                <wp:anchor distT="0" distB="0" distL="0" distR="0" simplePos="0" relativeHeight="46" behindDoc="0" locked="0" layoutInCell="0" allowOverlap="1">
+                <wp:anchor distT="0" distB="0" distL="0" distR="0" simplePos="0" relativeHeight="49" behindDoc="0" locked="0" layoutInCell="1" allowOverlap="1">
                   <wp:simplePos x="0" y="0"/>
                   <wp:positionH relativeFrom="column">
                     <wp:align>center</wp:align>
@@ -6285,7 +6551,7 @@
                   <wp:extent cx="2033270" cy="552450"/>
                   <wp:effectExtent l="0" t="0" r="0" b="0"/>
                   <wp:wrapSquare wrapText="largest"/>
-                  <wp:docPr id="9" name="Image8"/>
+                  <wp:docPr id="10" name="Image8"/>
                   <wp:cNvGraphicFramePr>
                     <a:graphicFrameLocks xmlns:a="http://schemas.openxmlformats.org/drawingml/2006/main" noChangeAspect="1"/>
                   </wp:cNvGraphicFramePr>
@@ -6293,13 +6559,13 @@
                     <a:graphicData uri="http://schemas.openxmlformats.org/drawingml/2006/picture">
                       <pic:pic xmlns:pic="http://schemas.openxmlformats.org/drawingml/2006/picture">
                         <pic:nvPicPr>
-                          <pic:cNvPr id="9" name="Image8"/>
+                          <pic:cNvPr id="10" name="Image8"/>
                           <pic:cNvPicPr>
                             <a:picLocks noChangeAspect="1" noChangeArrowheads="1"/>
                           </pic:cNvPicPr>
                         </pic:nvPicPr>
                         <pic:blipFill>
-                          <a:blip r:embed="rId10"/>
+                          <a:blip r:embed="rId11"/>
                           <a:stretch>
                             <a:fillRect/>
                           </a:stretch>
@@ -6356,7 +6622,7 @@
         <w:trPr/>
         <w:tc>
           <w:tcPr>
-            <w:tcW w:w="3476" w:type="dxa"/>
+            <w:tcW w:w="3475" w:type="dxa"/>
             <w:tcBorders>
               <w:top w:val="single" w:sz="8" w:space="0" w:color="000000"/>
               <w:start w:val="single" w:sz="8" w:space="0" w:color="000000"/>
@@ -6385,7 +6651,7 @@
         </w:tc>
         <w:tc>
           <w:tcPr>
-            <w:tcW w:w="2824" w:type="dxa"/>
+            <w:tcW w:w="2825" w:type="dxa"/>
             <w:tcBorders>
               <w:top w:val="single" w:sz="8" w:space="0" w:color="000000"/>
               <w:start w:val="single" w:sz="8" w:space="0" w:color="000000"/>
@@ -6435,7 +6701,7 @@
             </w:pPr>
             <w:r>
               <w:drawing>
-                <wp:anchor distT="0" distB="0" distL="0" distR="0" simplePos="0" relativeHeight="44" behindDoc="0" locked="0" layoutInCell="0" allowOverlap="1">
+                <wp:anchor distT="0" distB="0" distL="0" distR="0" simplePos="0" relativeHeight="47" behindDoc="0" locked="0" layoutInCell="1" allowOverlap="1">
                   <wp:simplePos x="0" y="0"/>
                   <wp:positionH relativeFrom="column">
                     <wp:align>center</wp:align>
@@ -6446,7 +6712,7 @@
                   <wp:extent cx="2033270" cy="576580"/>
                   <wp:effectExtent l="0" t="0" r="0" b="0"/>
                   <wp:wrapSquare wrapText="largest"/>
-                  <wp:docPr id="10" name="Image1 Copy 1"/>
+                  <wp:docPr id="11" name="Image1 Copy 1"/>
                   <wp:cNvGraphicFramePr>
                     <a:graphicFrameLocks xmlns:a="http://schemas.openxmlformats.org/drawingml/2006/main" noChangeAspect="1"/>
                   </wp:cNvGraphicFramePr>
@@ -6454,13 +6720,13 @@
                     <a:graphicData uri="http://schemas.openxmlformats.org/drawingml/2006/picture">
                       <pic:pic xmlns:pic="http://schemas.openxmlformats.org/drawingml/2006/picture">
                         <pic:nvPicPr>
-                          <pic:cNvPr id="10" name="Image1 Copy 1"/>
+                          <pic:cNvPr id="11" name="Image1 Copy 1"/>
                           <pic:cNvPicPr>
                             <a:picLocks noChangeAspect="1" noChangeArrowheads="1"/>
                           </pic:cNvPicPr>
                         </pic:nvPicPr>
                         <pic:blipFill>
-                          <a:blip r:embed="rId11"/>
+                          <a:blip r:embed="rId12"/>
                           <a:stretch>
                             <a:fillRect/>
                           </a:stretch>
@@ -6523,35 +6789,35 @@
         <w:trPr/>
         <w:tc>
           <w:tcPr>
-            <w:tcW w:w="3476" w:type="dxa"/>
-            <w:tcBorders>
-              <w:top w:val="single" w:sz="8" w:space="0" w:color="000000"/>
-              <w:start w:val="single" w:sz="8" w:space="0" w:color="000000"/>
-              <w:bottom w:val="single" w:sz="8" w:space="0" w:color="000000"/>
-              <w:end w:val="single" w:sz="8" w:space="0" w:color="000000"/>
-            </w:tcBorders>
-          </w:tcPr>
-          <w:p>
-            <w:pPr>
-              <w:pStyle w:val="normal1"/>
-              <w:widowControl w:val="false"/>
-              <w:suppressAutoHyphens w:val="true"/>
-              <w:spacing w:lineRule="auto" w:line="240" w:before="0" w:after="0"/>
-              <w:jc w:val="start"/>
-              <w:rPr>
-                <w:rFonts w:ascii="Calibri" w:hAnsi="Calibri" w:eastAsia="Calibri" w:cs="Calibri"/>
-              </w:rPr>
-            </w:pPr>
-            <w:r>
-              <w:rPr>
-                <w:rFonts w:eastAsia="Calibri" w:cs="Calibri" w:ascii="Calibri" w:hAnsi="Calibri"/>
-              </w:rPr>
-            </w:r>
-          </w:p>
-        </w:tc>
-        <w:tc>
-          <w:tcPr>
-            <w:tcW w:w="2824" w:type="dxa"/>
+            <w:tcW w:w="3475" w:type="dxa"/>
+            <w:tcBorders>
+              <w:top w:val="single" w:sz="8" w:space="0" w:color="000000"/>
+              <w:start w:val="single" w:sz="8" w:space="0" w:color="000000"/>
+              <w:bottom w:val="single" w:sz="8" w:space="0" w:color="000000"/>
+              <w:end w:val="single" w:sz="8" w:space="0" w:color="000000"/>
+            </w:tcBorders>
+          </w:tcPr>
+          <w:p>
+            <w:pPr>
+              <w:pStyle w:val="normal1"/>
+              <w:widowControl w:val="false"/>
+              <w:suppressAutoHyphens w:val="true"/>
+              <w:spacing w:lineRule="auto" w:line="240" w:before="0" w:after="0"/>
+              <w:jc w:val="start"/>
+              <w:rPr>
+                <w:rFonts w:ascii="Calibri" w:hAnsi="Calibri" w:eastAsia="Calibri" w:cs="Calibri"/>
+              </w:rPr>
+            </w:pPr>
+            <w:r>
+              <w:rPr>
+                <w:rFonts w:eastAsia="Calibri" w:cs="Calibri" w:ascii="Calibri" w:hAnsi="Calibri"/>
+              </w:rPr>
+            </w:r>
+          </w:p>
+        </w:tc>
+        <w:tc>
+          <w:tcPr>
+            <w:tcW w:w="2825" w:type="dxa"/>
             <w:tcBorders>
               <w:top w:val="single" w:sz="8" w:space="0" w:color="000000"/>
               <w:start w:val="single" w:sz="8" w:space="0" w:color="000000"/>
@@ -6638,35 +6904,35 @@
         <w:trPr/>
         <w:tc>
           <w:tcPr>
-            <w:tcW w:w="3476" w:type="dxa"/>
-            <w:tcBorders>
-              <w:top w:val="single" w:sz="8" w:space="0" w:color="000000"/>
-              <w:start w:val="single" w:sz="8" w:space="0" w:color="000000"/>
-              <w:bottom w:val="single" w:sz="8" w:space="0" w:color="000000"/>
-              <w:end w:val="single" w:sz="8" w:space="0" w:color="000000"/>
-            </w:tcBorders>
-          </w:tcPr>
-          <w:p>
-            <w:pPr>
-              <w:pStyle w:val="normal1"/>
-              <w:widowControl w:val="false"/>
-              <w:suppressAutoHyphens w:val="true"/>
-              <w:spacing w:lineRule="auto" w:line="240" w:before="0" w:after="0"/>
-              <w:jc w:val="start"/>
-              <w:rPr>
-                <w:rFonts w:ascii="Calibri" w:hAnsi="Calibri" w:eastAsia="Calibri" w:cs="Calibri"/>
-              </w:rPr>
-            </w:pPr>
-            <w:r>
-              <w:rPr>
-                <w:rFonts w:eastAsia="Calibri" w:cs="Calibri" w:ascii="Calibri" w:hAnsi="Calibri"/>
-              </w:rPr>
-            </w:r>
-          </w:p>
-        </w:tc>
-        <w:tc>
-          <w:tcPr>
-            <w:tcW w:w="2824" w:type="dxa"/>
+            <w:tcW w:w="3475" w:type="dxa"/>
+            <w:tcBorders>
+              <w:top w:val="single" w:sz="8" w:space="0" w:color="000000"/>
+              <w:start w:val="single" w:sz="8" w:space="0" w:color="000000"/>
+              <w:bottom w:val="single" w:sz="8" w:space="0" w:color="000000"/>
+              <w:end w:val="single" w:sz="8" w:space="0" w:color="000000"/>
+            </w:tcBorders>
+          </w:tcPr>
+          <w:p>
+            <w:pPr>
+              <w:pStyle w:val="normal1"/>
+              <w:widowControl w:val="false"/>
+              <w:suppressAutoHyphens w:val="true"/>
+              <w:spacing w:lineRule="auto" w:line="240" w:before="0" w:after="0"/>
+              <w:jc w:val="start"/>
+              <w:rPr>
+                <w:rFonts w:ascii="Calibri" w:hAnsi="Calibri" w:eastAsia="Calibri" w:cs="Calibri"/>
+              </w:rPr>
+            </w:pPr>
+            <w:r>
+              <w:rPr>
+                <w:rFonts w:eastAsia="Calibri" w:cs="Calibri" w:ascii="Calibri" w:hAnsi="Calibri"/>
+              </w:rPr>
+            </w:r>
+          </w:p>
+        </w:tc>
+        <w:tc>
+          <w:tcPr>
+            <w:tcW w:w="2825" w:type="dxa"/>
             <w:tcBorders>
               <w:top w:val="single" w:sz="8" w:space="0" w:color="000000"/>
               <w:start w:val="single" w:sz="8" w:space="0" w:color="000000"/>
@@ -7677,7 +7943,7 @@
         </w:rPr>
         <w:tab/>
       </w:r>
-      <w:hyperlink r:id="rId12">
+      <w:hyperlink r:id="rId13">
         <w:r>
           <w:rPr>
             <w:rStyle w:val="Style3"/>
@@ -7723,8 +7989,8 @@
       </w:tblPr>
       <w:tblGrid>
         <w:gridCol w:w="4425"/>
-        <w:gridCol w:w="4946"/>
-        <w:gridCol w:w="544"/>
+        <w:gridCol w:w="4945"/>
+        <w:gridCol w:w="545"/>
       </w:tblGrid>
       <w:tr>
         <w:trPr/>
@@ -7767,7 +8033,7 @@
         </w:tc>
         <w:tc>
           <w:tcPr>
-            <w:tcW w:w="4946" w:type="dxa"/>
+            <w:tcW w:w="4945" w:type="dxa"/>
             <w:tcBorders>
               <w:top w:val="single" w:sz="8" w:space="0" w:color="000000"/>
               <w:start w:val="single" w:sz="8" w:space="0" w:color="000000"/>
@@ -7804,7 +8070,7 @@
         </w:tc>
         <w:tc>
           <w:tcPr>
-            <w:tcW w:w="544" w:type="dxa"/>
+            <w:tcW w:w="545" w:type="dxa"/>
             <w:tcBorders>
               <w:top w:val="single" w:sz="8" w:space="0" w:color="000000"/>
               <w:start w:val="single" w:sz="8" w:space="0" w:color="000000"/>
@@ -7876,7 +8142,7 @@
         </w:tc>
         <w:tc>
           <w:tcPr>
-            <w:tcW w:w="4946" w:type="dxa"/>
+            <w:tcW w:w="4945" w:type="dxa"/>
             <w:tcBorders>
               <w:top w:val="single" w:sz="8" w:space="0" w:color="000000"/>
               <w:start w:val="single" w:sz="8" w:space="0" w:color="000000"/>
@@ -7910,7 +8176,7 @@
         </w:tc>
         <w:tc>
           <w:tcPr>
-            <w:tcW w:w="544" w:type="dxa"/>
+            <w:tcW w:w="545" w:type="dxa"/>
             <w:tcBorders>
               <w:top w:val="single" w:sz="8" w:space="0" w:color="000000"/>
               <w:start w:val="single" w:sz="8" w:space="0" w:color="000000"/>
@@ -7977,7 +8243,7 @@
         </w:tc>
         <w:tc>
           <w:tcPr>
-            <w:tcW w:w="4946" w:type="dxa"/>
+            <w:tcW w:w="4945" w:type="dxa"/>
             <w:tcBorders>
               <w:top w:val="single" w:sz="8" w:space="0" w:color="000000"/>
               <w:start w:val="single" w:sz="8" w:space="0" w:color="000000"/>
@@ -8076,7 +8342,7 @@
         </w:tc>
         <w:tc>
           <w:tcPr>
-            <w:tcW w:w="544" w:type="dxa"/>
+            <w:tcW w:w="545" w:type="dxa"/>
             <w:tcBorders>
               <w:top w:val="single" w:sz="8" w:space="0" w:color="000000"/>
               <w:start w:val="single" w:sz="8" w:space="0" w:color="000000"/>
@@ -8143,7 +8409,7 @@
         </w:tc>
         <w:tc>
           <w:tcPr>
-            <w:tcW w:w="4946" w:type="dxa"/>
+            <w:tcW w:w="4945" w:type="dxa"/>
             <w:tcBorders>
               <w:top w:val="single" w:sz="8" w:space="0" w:color="000000"/>
               <w:start w:val="single" w:sz="8" w:space="0" w:color="000000"/>
@@ -8177,7 +8443,7 @@
         </w:tc>
         <w:tc>
           <w:tcPr>
-            <w:tcW w:w="544" w:type="dxa"/>
+            <w:tcW w:w="545" w:type="dxa"/>
             <w:tcBorders>
               <w:top w:val="single" w:sz="8" w:space="0" w:color="000000"/>
               <w:start w:val="single" w:sz="8" w:space="0" w:color="000000"/>
@@ -8244,7 +8510,7 @@
         </w:tc>
         <w:tc>
           <w:tcPr>
-            <w:tcW w:w="4946" w:type="dxa"/>
+            <w:tcW w:w="4945" w:type="dxa"/>
             <w:tcBorders>
               <w:top w:val="single" w:sz="8" w:space="0" w:color="000000"/>
               <w:start w:val="single" w:sz="8" w:space="0" w:color="000000"/>
@@ -8278,7 +8544,7 @@
         </w:tc>
         <w:tc>
           <w:tcPr>
-            <w:tcW w:w="544" w:type="dxa"/>
+            <w:tcW w:w="545" w:type="dxa"/>
             <w:tcBorders>
               <w:top w:val="single" w:sz="8" w:space="0" w:color="000000"/>
               <w:start w:val="single" w:sz="8" w:space="0" w:color="000000"/>
@@ -8348,7 +8614,7 @@
         </w:tc>
         <w:tc>
           <w:tcPr>
-            <w:tcW w:w="4946" w:type="dxa"/>
+            <w:tcW w:w="4945" w:type="dxa"/>
             <w:tcBorders>
               <w:top w:val="single" w:sz="8" w:space="0" w:color="000000"/>
               <w:start w:val="single" w:sz="8" w:space="0" w:color="000000"/>
@@ -8379,7 +8645,7 @@
         </w:tc>
         <w:tc>
           <w:tcPr>
-            <w:tcW w:w="544" w:type="dxa"/>
+            <w:tcW w:w="545" w:type="dxa"/>
             <w:tcBorders>
               <w:top w:val="single" w:sz="8" w:space="0" w:color="000000"/>
               <w:start w:val="single" w:sz="8" w:space="0" w:color="000000"/>
@@ -8447,7 +8713,7 @@
         </w:tc>
         <w:tc>
           <w:tcPr>
-            <w:tcW w:w="4946" w:type="dxa"/>
+            <w:tcW w:w="4945" w:type="dxa"/>
             <w:tcBorders>
               <w:top w:val="single" w:sz="8" w:space="0" w:color="000000"/>
               <w:start w:val="single" w:sz="8" w:space="0" w:color="000000"/>
@@ -8504,7 +8770,7 @@
         </w:tc>
         <w:tc>
           <w:tcPr>
-            <w:tcW w:w="544" w:type="dxa"/>
+            <w:tcW w:w="545" w:type="dxa"/>
             <w:tcBorders>
               <w:top w:val="single" w:sz="8" w:space="0" w:color="000000"/>
               <w:start w:val="single" w:sz="8" w:space="0" w:color="000000"/>
@@ -8571,7 +8837,7 @@
         </w:tc>
         <w:tc>
           <w:tcPr>
-            <w:tcW w:w="4946" w:type="dxa"/>
+            <w:tcW w:w="4945" w:type="dxa"/>
             <w:tcBorders>
               <w:top w:val="single" w:sz="8" w:space="0" w:color="000000"/>
               <w:start w:val="single" w:sz="8" w:space="0" w:color="000000"/>
@@ -8628,7 +8894,7 @@
         </w:tc>
         <w:tc>
           <w:tcPr>
-            <w:tcW w:w="544" w:type="dxa"/>
+            <w:tcW w:w="545" w:type="dxa"/>
             <w:tcBorders>
               <w:top w:val="single" w:sz="8" w:space="0" w:color="000000"/>
               <w:start w:val="single" w:sz="8" w:space="0" w:color="000000"/>
@@ -8698,7 +8964,7 @@
         </w:tc>
         <w:tc>
           <w:tcPr>
-            <w:tcW w:w="4946" w:type="dxa"/>
+            <w:tcW w:w="4945" w:type="dxa"/>
             <w:tcBorders>
               <w:top w:val="single" w:sz="8" w:space="0" w:color="000000"/>
               <w:start w:val="single" w:sz="8" w:space="0" w:color="000000"/>
@@ -8729,7 +8995,7 @@
         </w:tc>
         <w:tc>
           <w:tcPr>
-            <w:tcW w:w="544" w:type="dxa"/>
+            <w:tcW w:w="545" w:type="dxa"/>
             <w:tcBorders>
               <w:top w:val="single" w:sz="8" w:space="0" w:color="000000"/>
               <w:start w:val="single" w:sz="8" w:space="0" w:color="000000"/>
@@ -8797,7 +9063,7 @@
         </w:tc>
         <w:tc>
           <w:tcPr>
-            <w:tcW w:w="4946" w:type="dxa"/>
+            <w:tcW w:w="4945" w:type="dxa"/>
             <w:tcBorders>
               <w:top w:val="single" w:sz="8" w:space="0" w:color="000000"/>
               <w:start w:val="single" w:sz="8" w:space="0" w:color="000000"/>
@@ -8831,7 +9097,7 @@
         </w:tc>
         <w:tc>
           <w:tcPr>
-            <w:tcW w:w="544" w:type="dxa"/>
+            <w:tcW w:w="545" w:type="dxa"/>
             <w:tcBorders>
               <w:top w:val="single" w:sz="8" w:space="0" w:color="000000"/>
               <w:start w:val="single" w:sz="8" w:space="0" w:color="000000"/>
@@ -8901,7 +9167,7 @@
         </w:tc>
         <w:tc>
           <w:tcPr>
-            <w:tcW w:w="4946" w:type="dxa"/>
+            <w:tcW w:w="4945" w:type="dxa"/>
             <w:tcBorders>
               <w:top w:val="single" w:sz="8" w:space="0" w:color="000000"/>
               <w:start w:val="single" w:sz="8" w:space="0" w:color="000000"/>
@@ -8935,7 +9201,7 @@
         </w:tc>
         <w:tc>
           <w:tcPr>
-            <w:tcW w:w="544" w:type="dxa"/>
+            <w:tcW w:w="545" w:type="dxa"/>
             <w:tcBorders>
               <w:top w:val="single" w:sz="8" w:space="0" w:color="000000"/>
               <w:start w:val="single" w:sz="8" w:space="0" w:color="000000"/>
@@ -9003,7 +9269,7 @@
         </w:tc>
         <w:tc>
           <w:tcPr>
-            <w:tcW w:w="4946" w:type="dxa"/>
+            <w:tcW w:w="4945" w:type="dxa"/>
             <w:tcBorders>
               <w:top w:val="single" w:sz="8" w:space="0" w:color="000000"/>
               <w:start w:val="single" w:sz="8" w:space="0" w:color="000000"/>
@@ -9037,7 +9303,7 @@
         </w:tc>
         <w:tc>
           <w:tcPr>
-            <w:tcW w:w="544" w:type="dxa"/>
+            <w:tcW w:w="545" w:type="dxa"/>
             <w:tcBorders>
               <w:top w:val="single" w:sz="8" w:space="0" w:color="000000"/>
               <w:start w:val="single" w:sz="8" w:space="0" w:color="000000"/>
@@ -9171,7 +9437,7 @@
         </w:rPr>
         <w:tab/>
       </w:r>
-      <w:hyperlink r:id="rId13">
+      <w:hyperlink r:id="rId14">
         <w:r>
           <w:rPr>
             <w:rStyle w:val="Style3"/>
@@ -9223,15 +9489,15 @@
         <w:tblLook w:val="0600" w:firstRow="0" w:noVBand="1" w:lastRow="0" w:firstColumn="0" w:lastColumn="0" w:noHBand="1"/>
       </w:tblPr>
       <w:tblGrid>
-        <w:gridCol w:w="4496"/>
+        <w:gridCol w:w="4495"/>
         <w:gridCol w:w="4965"/>
-        <w:gridCol w:w="559"/>
+        <w:gridCol w:w="560"/>
       </w:tblGrid>
       <w:tr>
         <w:trPr/>
         <w:tc>
           <w:tcPr>
-            <w:tcW w:w="4496" w:type="dxa"/>
+            <w:tcW w:w="4495" w:type="dxa"/>
             <w:tcBorders>
               <w:top w:val="single" w:sz="8" w:space="0" w:color="000000"/>
               <w:start w:val="single" w:sz="8" w:space="0" w:color="000000"/>
@@ -9305,7 +9571,7 @@
         </w:tc>
         <w:tc>
           <w:tcPr>
-            <w:tcW w:w="559" w:type="dxa"/>
+            <w:tcW w:w="560" w:type="dxa"/>
             <w:tcBorders>
               <w:top w:val="single" w:sz="8" w:space="0" w:color="000000"/>
               <w:start w:val="single" w:sz="8" w:space="0" w:color="000000"/>
@@ -9339,7 +9605,7 @@
         <w:trPr/>
         <w:tc>
           <w:tcPr>
-            <w:tcW w:w="4496" w:type="dxa"/>
+            <w:tcW w:w="4495" w:type="dxa"/>
             <w:tcBorders>
               <w:top w:val="single" w:sz="8" w:space="0" w:color="000000"/>
               <w:start w:val="single" w:sz="8" w:space="0" w:color="000000"/>
@@ -9407,7 +9673,7 @@
         </w:tc>
         <w:tc>
           <w:tcPr>
-            <w:tcW w:w="559" w:type="dxa"/>
+            <w:tcW w:w="560" w:type="dxa"/>
             <w:tcBorders>
               <w:top w:val="single" w:sz="8" w:space="0" w:color="000000"/>
               <w:start w:val="single" w:sz="8" w:space="0" w:color="000000"/>
@@ -9440,7 +9706,7 @@
         <w:trPr/>
         <w:tc>
           <w:tcPr>
-            <w:tcW w:w="4496" w:type="dxa"/>
+            <w:tcW w:w="4495" w:type="dxa"/>
             <w:tcBorders>
               <w:top w:val="single" w:sz="8" w:space="0" w:color="000000"/>
               <w:start w:val="single" w:sz="8" w:space="0" w:color="000000"/>
@@ -9508,7 +9774,7 @@
         </w:tc>
         <w:tc>
           <w:tcPr>
-            <w:tcW w:w="559" w:type="dxa"/>
+            <w:tcW w:w="560" w:type="dxa"/>
             <w:tcBorders>
               <w:top w:val="single" w:sz="8" w:space="0" w:color="000000"/>
               <w:start w:val="single" w:sz="8" w:space="0" w:color="000000"/>
@@ -9541,7 +9807,7 @@
         <w:trPr/>
         <w:tc>
           <w:tcPr>
-            <w:tcW w:w="4496" w:type="dxa"/>
+            <w:tcW w:w="4495" w:type="dxa"/>
             <w:tcBorders>
               <w:top w:val="single" w:sz="8" w:space="0" w:color="000000"/>
               <w:start w:val="single" w:sz="8" w:space="0" w:color="000000"/>
@@ -9609,7 +9875,7 @@
         </w:tc>
         <w:tc>
           <w:tcPr>
-            <w:tcW w:w="559" w:type="dxa"/>
+            <w:tcW w:w="560" w:type="dxa"/>
             <w:tcBorders>
               <w:top w:val="single" w:sz="8" w:space="0" w:color="000000"/>
               <w:start w:val="single" w:sz="8" w:space="0" w:color="000000"/>
@@ -9642,7 +9908,7 @@
         <w:trPr/>
         <w:tc>
           <w:tcPr>
-            <w:tcW w:w="4496" w:type="dxa"/>
+            <w:tcW w:w="4495" w:type="dxa"/>
             <w:tcBorders>
               <w:top w:val="single" w:sz="8" w:space="0" w:color="000000"/>
               <w:start w:val="single" w:sz="8" w:space="0" w:color="000000"/>
@@ -9710,7 +9976,7 @@
         </w:tc>
         <w:tc>
           <w:tcPr>
-            <w:tcW w:w="559" w:type="dxa"/>
+            <w:tcW w:w="560" w:type="dxa"/>
             <w:tcBorders>
               <w:top w:val="single" w:sz="8" w:space="0" w:color="000000"/>
               <w:start w:val="single" w:sz="8" w:space="0" w:color="000000"/>
@@ -9743,7 +10009,7 @@
         <w:trPr/>
         <w:tc>
           <w:tcPr>
-            <w:tcW w:w="4496" w:type="dxa"/>
+            <w:tcW w:w="4495" w:type="dxa"/>
             <w:tcBorders>
               <w:top w:val="single" w:sz="8" w:space="0" w:color="000000"/>
               <w:start w:val="single" w:sz="8" w:space="0" w:color="000000"/>
@@ -9811,7 +10077,7 @@
         </w:tc>
         <w:tc>
           <w:tcPr>
-            <w:tcW w:w="559" w:type="dxa"/>
+            <w:tcW w:w="560" w:type="dxa"/>
             <w:tcBorders>
               <w:top w:val="single" w:sz="8" w:space="0" w:color="000000"/>
               <w:start w:val="single" w:sz="8" w:space="0" w:color="000000"/>
@@ -9845,7 +10111,7 @@
         <w:trPr/>
         <w:tc>
           <w:tcPr>
-            <w:tcW w:w="4496" w:type="dxa"/>
+            <w:tcW w:w="4495" w:type="dxa"/>
             <w:tcBorders>
               <w:top w:val="single" w:sz="8" w:space="0" w:color="000000"/>
               <w:start w:val="single" w:sz="8" w:space="0" w:color="000000"/>
@@ -9913,7 +10179,7 @@
         </w:tc>
         <w:tc>
           <w:tcPr>
-            <w:tcW w:w="559" w:type="dxa"/>
+            <w:tcW w:w="560" w:type="dxa"/>
             <w:tcBorders>
               <w:top w:val="single" w:sz="8" w:space="0" w:color="000000"/>
               <w:start w:val="single" w:sz="8" w:space="0" w:color="000000"/>
@@ -9946,7 +10212,7 @@
         <w:trPr/>
         <w:tc>
           <w:tcPr>
-            <w:tcW w:w="4496" w:type="dxa"/>
+            <w:tcW w:w="4495" w:type="dxa"/>
             <w:tcBorders>
               <w:top w:val="single" w:sz="8" w:space="0" w:color="000000"/>
               <w:start w:val="single" w:sz="8" w:space="0" w:color="000000"/>
@@ -10014,7 +10280,7 @@
         </w:tc>
         <w:tc>
           <w:tcPr>
-            <w:tcW w:w="559" w:type="dxa"/>
+            <w:tcW w:w="560" w:type="dxa"/>
             <w:tcBorders>
               <w:top w:val="single" w:sz="8" w:space="0" w:color="000000"/>
               <w:start w:val="single" w:sz="8" w:space="0" w:color="000000"/>
@@ -10047,7 +10313,7 @@
         <w:trPr/>
         <w:tc>
           <w:tcPr>
-            <w:tcW w:w="4496" w:type="dxa"/>
+            <w:tcW w:w="4495" w:type="dxa"/>
             <w:tcBorders>
               <w:top w:val="single" w:sz="8" w:space="0" w:color="000000"/>
               <w:start w:val="single" w:sz="8" w:space="0" w:color="000000"/>
@@ -10117,7 +10383,7 @@
         </w:tc>
         <w:tc>
           <w:tcPr>
-            <w:tcW w:w="559" w:type="dxa"/>
+            <w:tcW w:w="560" w:type="dxa"/>
             <w:tcBorders>
               <w:top w:val="single" w:sz="8" w:space="0" w:color="000000"/>
               <w:start w:val="single" w:sz="8" w:space="0" w:color="000000"/>
@@ -10151,7 +10417,7 @@
         <w:trPr/>
         <w:tc>
           <w:tcPr>
-            <w:tcW w:w="4496" w:type="dxa"/>
+            <w:tcW w:w="4495" w:type="dxa"/>
             <w:tcBorders>
               <w:top w:val="single" w:sz="8" w:space="0" w:color="000000"/>
               <w:start w:val="single" w:sz="8" w:space="0" w:color="000000"/>
@@ -10219,7 +10485,7 @@
         </w:tc>
         <w:tc>
           <w:tcPr>
-            <w:tcW w:w="559" w:type="dxa"/>
+            <w:tcW w:w="560" w:type="dxa"/>
             <w:tcBorders>
               <w:top w:val="single" w:sz="8" w:space="0" w:color="000000"/>
               <w:start w:val="single" w:sz="8" w:space="0" w:color="000000"/>
@@ -10257,7 +10523,7 @@
         <w:trPr/>
         <w:tc>
           <w:tcPr>
-            <w:tcW w:w="4496" w:type="dxa"/>
+            <w:tcW w:w="4495" w:type="dxa"/>
             <w:tcBorders>
               <w:top w:val="single" w:sz="8" w:space="0" w:color="000000"/>
               <w:start w:val="single" w:sz="8" w:space="0" w:color="000000"/>
@@ -10325,7 +10591,7 @@
         </w:tc>
         <w:tc>
           <w:tcPr>
-            <w:tcW w:w="559" w:type="dxa"/>
+            <w:tcW w:w="560" w:type="dxa"/>
             <w:tcBorders>
               <w:top w:val="single" w:sz="8" w:space="0" w:color="000000"/>
               <w:start w:val="single" w:sz="8" w:space="0" w:color="000000"/>
@@ -10474,7 +10740,7 @@
         </w:rPr>
         <w:tab/>
       </w:r>
-      <w:hyperlink r:id="rId14">
+      <w:hyperlink r:id="rId15">
         <w:r>
           <w:rPr>
             <w:rStyle w:val="Style3"/>
@@ -10526,15 +10792,15 @@
         <w:tblLook w:val="0600" w:firstRow="0" w:noVBand="1" w:lastRow="0" w:firstColumn="0" w:lastColumn="0" w:noHBand="1"/>
       </w:tblPr>
       <w:tblGrid>
-        <w:gridCol w:w="4496"/>
-        <w:gridCol w:w="5044"/>
+        <w:gridCol w:w="4495"/>
+        <w:gridCol w:w="5045"/>
         <w:gridCol w:w="480"/>
       </w:tblGrid>
       <w:tr>
         <w:trPr/>
         <w:tc>
           <w:tcPr>
-            <w:tcW w:w="4496" w:type="dxa"/>
+            <w:tcW w:w="4495" w:type="dxa"/>
             <w:tcBorders>
               <w:top w:val="single" w:sz="8" w:space="0" w:color="000000"/>
               <w:start w:val="single" w:sz="8" w:space="0" w:color="000000"/>
@@ -10571,7 +10837,7 @@
         </w:tc>
         <w:tc>
           <w:tcPr>
-            <w:tcW w:w="5044" w:type="dxa"/>
+            <w:tcW w:w="5045" w:type="dxa"/>
             <w:tcBorders>
               <w:top w:val="single" w:sz="8" w:space="0" w:color="000000"/>
               <w:start w:val="single" w:sz="8" w:space="0" w:color="000000"/>
@@ -10642,7 +10908,7 @@
         <w:trPr/>
         <w:tc>
           <w:tcPr>
-            <w:tcW w:w="4496" w:type="dxa"/>
+            <w:tcW w:w="4495" w:type="dxa"/>
             <w:tcBorders>
               <w:top w:val="single" w:sz="8" w:space="0" w:color="000000"/>
               <w:start w:val="single" w:sz="8" w:space="0" w:color="000000"/>
@@ -10676,7 +10942,7 @@
         </w:tc>
         <w:tc>
           <w:tcPr>
-            <w:tcW w:w="5044" w:type="dxa"/>
+            <w:tcW w:w="5045" w:type="dxa"/>
             <w:tcBorders>
               <w:top w:val="single" w:sz="8" w:space="0" w:color="000000"/>
               <w:start w:val="single" w:sz="8" w:space="0" w:color="000000"/>
@@ -10743,7 +11009,7 @@
         <w:trPr/>
         <w:tc>
           <w:tcPr>
-            <w:tcW w:w="4496" w:type="dxa"/>
+            <w:tcW w:w="4495" w:type="dxa"/>
             <w:tcBorders>
               <w:top w:val="single" w:sz="8" w:space="0" w:color="000000"/>
               <w:start w:val="single" w:sz="8" w:space="0" w:color="000000"/>
@@ -10777,7 +11043,7 @@
         </w:tc>
         <w:tc>
           <w:tcPr>
-            <w:tcW w:w="5044" w:type="dxa"/>
+            <w:tcW w:w="5045" w:type="dxa"/>
             <w:tcBorders>
               <w:top w:val="single" w:sz="8" w:space="0" w:color="000000"/>
               <w:start w:val="single" w:sz="8" w:space="0" w:color="000000"/>
@@ -10920,7 +11186,7 @@
         <w:trPr/>
         <w:tc>
           <w:tcPr>
-            <w:tcW w:w="4496" w:type="dxa"/>
+            <w:tcW w:w="4495" w:type="dxa"/>
             <w:tcBorders>
               <w:top w:val="single" w:sz="8" w:space="0" w:color="000000"/>
               <w:start w:val="single" w:sz="8" w:space="0" w:color="000000"/>
@@ -10954,7 +11220,7 @@
         </w:tc>
         <w:tc>
           <w:tcPr>
-            <w:tcW w:w="5044" w:type="dxa"/>
+            <w:tcW w:w="5045" w:type="dxa"/>
             <w:tcBorders>
               <w:top w:val="single" w:sz="8" w:space="0" w:color="000000"/>
               <w:start w:val="single" w:sz="8" w:space="0" w:color="000000"/>
@@ -11021,7 +11287,7 @@
         <w:trPr/>
         <w:tc>
           <w:tcPr>
-            <w:tcW w:w="4496" w:type="dxa"/>
+            <w:tcW w:w="4495" w:type="dxa"/>
             <w:tcBorders>
               <w:top w:val="single" w:sz="8" w:space="0" w:color="000000"/>
               <w:start w:val="single" w:sz="8" w:space="0" w:color="000000"/>
@@ -11055,7 +11321,7 @@
         </w:tc>
         <w:tc>
           <w:tcPr>
-            <w:tcW w:w="5044" w:type="dxa"/>
+            <w:tcW w:w="5045" w:type="dxa"/>
             <w:tcBorders>
               <w:top w:val="single" w:sz="8" w:space="0" w:color="000000"/>
               <w:start w:val="single" w:sz="8" w:space="0" w:color="000000"/>
@@ -11122,7 +11388,7 @@
         <w:trPr/>
         <w:tc>
           <w:tcPr>
-            <w:tcW w:w="4496" w:type="dxa"/>
+            <w:tcW w:w="4495" w:type="dxa"/>
             <w:tcBorders>
               <w:top w:val="single" w:sz="8" w:space="0" w:color="000000"/>
               <w:start w:val="single" w:sz="8" w:space="0" w:color="000000"/>
@@ -11159,7 +11425,7 @@
         </w:tc>
         <w:tc>
           <w:tcPr>
-            <w:tcW w:w="5044" w:type="dxa"/>
+            <w:tcW w:w="5045" w:type="dxa"/>
             <w:tcBorders>
               <w:top w:val="single" w:sz="8" w:space="0" w:color="000000"/>
               <w:start w:val="single" w:sz="8" w:space="0" w:color="000000"/>
@@ -11224,7 +11490,7 @@
         <w:trPr/>
         <w:tc>
           <w:tcPr>
-            <w:tcW w:w="4496" w:type="dxa"/>
+            <w:tcW w:w="4495" w:type="dxa"/>
             <w:tcBorders>
               <w:top w:val="single" w:sz="8" w:space="0" w:color="000000"/>
               <w:start w:val="single" w:sz="8" w:space="0" w:color="000000"/>
@@ -11258,7 +11524,7 @@
         </w:tc>
         <w:tc>
           <w:tcPr>
-            <w:tcW w:w="5044" w:type="dxa"/>
+            <w:tcW w:w="5045" w:type="dxa"/>
             <w:tcBorders>
               <w:top w:val="single" w:sz="8" w:space="0" w:color="000000"/>
               <w:start w:val="single" w:sz="8" w:space="0" w:color="000000"/>
@@ -11325,7 +11591,7 @@
         <w:trPr/>
         <w:tc>
           <w:tcPr>
-            <w:tcW w:w="4496" w:type="dxa"/>
+            <w:tcW w:w="4495" w:type="dxa"/>
             <w:tcBorders>
               <w:top w:val="single" w:sz="8" w:space="0" w:color="000000"/>
               <w:start w:val="single" w:sz="8" w:space="0" w:color="000000"/>
@@ -11361,7 +11627,7 @@
         </w:tc>
         <w:tc>
           <w:tcPr>
-            <w:tcW w:w="5044" w:type="dxa"/>
+            <w:tcW w:w="5045" w:type="dxa"/>
             <w:tcBorders>
               <w:top w:val="single" w:sz="8" w:space="0" w:color="000000"/>
               <w:start w:val="single" w:sz="8" w:space="0" w:color="000000"/>
@@ -11428,7 +11694,7 @@
         <w:trPr/>
         <w:tc>
           <w:tcPr>
-            <w:tcW w:w="4496" w:type="dxa"/>
+            <w:tcW w:w="4495" w:type="dxa"/>
             <w:tcBorders>
               <w:top w:val="single" w:sz="8" w:space="0" w:color="000000"/>
               <w:start w:val="single" w:sz="8" w:space="0" w:color="000000"/>
@@ -11462,7 +11728,7 @@
         </w:tc>
         <w:tc>
           <w:tcPr>
-            <w:tcW w:w="5044" w:type="dxa"/>
+            <w:tcW w:w="5045" w:type="dxa"/>
             <w:tcBorders>
               <w:top w:val="single" w:sz="8" w:space="0" w:color="000000"/>
               <w:start w:val="single" w:sz="8" w:space="0" w:color="000000"/>
@@ -11529,7 +11795,7 @@
         <w:trPr/>
         <w:tc>
           <w:tcPr>
-            <w:tcW w:w="4496" w:type="dxa"/>
+            <w:tcW w:w="4495" w:type="dxa"/>
             <w:tcBorders>
               <w:top w:val="single" w:sz="8" w:space="0" w:color="000000"/>
               <w:start w:val="single" w:sz="8" w:space="0" w:color="000000"/>
@@ -11566,7 +11832,7 @@
         </w:tc>
         <w:tc>
           <w:tcPr>
-            <w:tcW w:w="5044" w:type="dxa"/>
+            <w:tcW w:w="5045" w:type="dxa"/>
             <w:tcBorders>
               <w:top w:val="single" w:sz="8" w:space="0" w:color="000000"/>
               <w:start w:val="single" w:sz="8" w:space="0" w:color="000000"/>
@@ -11631,7 +11897,7 @@
         <w:trPr/>
         <w:tc>
           <w:tcPr>
-            <w:tcW w:w="4496" w:type="dxa"/>
+            <w:tcW w:w="4495" w:type="dxa"/>
             <w:tcBorders>
               <w:top w:val="single" w:sz="8" w:space="0" w:color="000000"/>
               <w:start w:val="single" w:sz="8" w:space="0" w:color="000000"/>
@@ -11665,7 +11931,7 @@
         </w:tc>
         <w:tc>
           <w:tcPr>
-            <w:tcW w:w="5044" w:type="dxa"/>
+            <w:tcW w:w="5045" w:type="dxa"/>
             <w:tcBorders>
               <w:top w:val="single" w:sz="8" w:space="0" w:color="000000"/>
               <w:start w:val="single" w:sz="8" w:space="0" w:color="000000"/>
@@ -11733,7 +11999,7 @@
         <w:trPr/>
         <w:tc>
           <w:tcPr>
-            <w:tcW w:w="4496" w:type="dxa"/>
+            <w:tcW w:w="4495" w:type="dxa"/>
             <w:tcBorders>
               <w:top w:val="single" w:sz="8" w:space="0" w:color="000000"/>
               <w:start w:val="single" w:sz="8" w:space="0" w:color="000000"/>
@@ -11767,7 +12033,7 @@
         </w:tc>
         <w:tc>
           <w:tcPr>
-            <w:tcW w:w="5044" w:type="dxa"/>
+            <w:tcW w:w="5045" w:type="dxa"/>
             <w:tcBorders>
               <w:top w:val="single" w:sz="8" w:space="0" w:color="000000"/>
               <w:start w:val="single" w:sz="8" w:space="0" w:color="000000"/>
@@ -11835,7 +12101,7 @@
         <w:trPr/>
         <w:tc>
           <w:tcPr>
-            <w:tcW w:w="4496" w:type="dxa"/>
+            <w:tcW w:w="4495" w:type="dxa"/>
             <w:tcBorders>
               <w:top w:val="single" w:sz="8" w:space="0" w:color="000000"/>
               <w:start w:val="single" w:sz="8" w:space="0" w:color="000000"/>
@@ -11869,7 +12135,7 @@
         </w:tc>
         <w:tc>
           <w:tcPr>
-            <w:tcW w:w="5044" w:type="dxa"/>
+            <w:tcW w:w="5045" w:type="dxa"/>
             <w:tcBorders>
               <w:top w:val="single" w:sz="8" w:space="0" w:color="000000"/>
               <w:start w:val="single" w:sz="8" w:space="0" w:color="000000"/>
@@ -11959,12 +12225,12 @@
       </w:r>
     </w:p>
     <w:sectPr>
-      <w:headerReference w:type="even" r:id="rId15"/>
-      <w:headerReference w:type="default" r:id="rId16"/>
-      <w:headerReference w:type="first" r:id="rId17"/>
-      <w:footerReference w:type="even" r:id="rId18"/>
-      <w:footerReference w:type="default" r:id="rId19"/>
-      <w:footerReference w:type="first" r:id="rId20"/>
+      <w:headerReference w:type="even" r:id="rId16"/>
+      <w:headerReference w:type="default" r:id="rId17"/>
+      <w:headerReference w:type="first" r:id="rId18"/>
+      <w:footerReference w:type="even" r:id="rId19"/>
+      <w:footerReference w:type="default" r:id="rId20"/>
+      <w:footerReference w:type="first" r:id="rId21"/>
       <w:type w:val="nextPage"/>
       <w:pgSz w:w="11906" w:h="16838"/>
       <w:pgMar w:left="720" w:right="720" w:gutter="0" w:header="720" w:top="777" w:footer="720" w:bottom="777"/>
@@ -12005,7 +12271,7 @@
         <wp:inline distT="0" distB="0" distL="0" distR="0">
           <wp:extent cx="877570" cy="307340"/>
           <wp:effectExtent l="0" t="0" r="0" b="0"/>
-          <wp:docPr id="15" name="image2.png"/>
+          <wp:docPr id="16" name="image2.png"/>
           <wp:cNvGraphicFramePr>
             <a:graphicFrameLocks xmlns:a="http://schemas.openxmlformats.org/drawingml/2006/main" noChangeAspect="1"/>
           </wp:cNvGraphicFramePr>
@@ -12013,7 +12279,7 @@
             <a:graphicData uri="http://schemas.openxmlformats.org/drawingml/2006/picture">
               <pic:pic xmlns:pic="http://schemas.openxmlformats.org/drawingml/2006/picture">
                 <pic:nvPicPr>
-                  <pic:cNvPr id="15" name="image2.png"/>
+                  <pic:cNvPr id="16" name="image2.png"/>
                   <pic:cNvPicPr>
                     <a:picLocks noChangeAspect="1" noChangeArrowheads="1"/>
                   </pic:cNvPicPr>
@@ -12113,7 +12379,7 @@
         <wp:inline distT="0" distB="0" distL="0" distR="0">
           <wp:extent cx="877570" cy="307340"/>
           <wp:effectExtent l="0" t="0" r="0" b="0"/>
-          <wp:docPr id="16" name="image2.png"/>
+          <wp:docPr id="17" name="image2.png"/>
           <wp:cNvGraphicFramePr>
             <a:graphicFrameLocks xmlns:a="http://schemas.openxmlformats.org/drawingml/2006/main" noChangeAspect="1"/>
           </wp:cNvGraphicFramePr>
@@ -12121,7 +12387,7 @@
             <a:graphicData uri="http://schemas.openxmlformats.org/drawingml/2006/picture">
               <pic:pic xmlns:pic="http://schemas.openxmlformats.org/drawingml/2006/picture">
                 <pic:nvPicPr>
-                  <pic:cNvPr id="16" name="image2.png"/>
+                  <pic:cNvPr id="17" name="image2.png"/>
                   <pic:cNvPicPr>
                     <a:picLocks noChangeAspect="1" noChangeArrowheads="1"/>
                   </pic:cNvPicPr>
@@ -12234,7 +12500,7 @@
         <wp:inline distT="0" distB="0" distL="0" distR="0">
           <wp:extent cx="1190625" cy="190500"/>
           <wp:effectExtent l="0" t="0" r="0" b="0"/>
-          <wp:docPr id="11" name="image1.png"/>
+          <wp:docPr id="12" name="image1.png"/>
           <wp:cNvGraphicFramePr>
             <a:graphicFrameLocks xmlns:a="http://schemas.openxmlformats.org/drawingml/2006/main" noChangeAspect="1"/>
           </wp:cNvGraphicFramePr>
@@ -12242,7 +12508,7 @@
             <a:graphicData uri="http://schemas.openxmlformats.org/drawingml/2006/picture">
               <pic:pic xmlns:pic="http://schemas.openxmlformats.org/drawingml/2006/picture">
                 <pic:nvPicPr>
-                  <pic:cNvPr id="11" name="image1.png"/>
+                  <pic:cNvPr id="12" name="image1.png"/>
                   <pic:cNvPicPr>
                     <a:picLocks noChangeAspect="1" noChangeArrowheads="1"/>
                   </pic:cNvPicPr>
@@ -12270,7 +12536,7 @@
         </wp:inline>
       </w:drawing>
       <w:drawing>
-        <wp:anchor distT="0" distB="0" distL="0" distR="0" simplePos="0" relativeHeight="28" behindDoc="1" locked="0" layoutInCell="1" allowOverlap="1">
+        <wp:anchor distT="0" distB="0" distL="0" distR="0" simplePos="0" relativeHeight="15" behindDoc="1" locked="0" layoutInCell="1" allowOverlap="1">
           <wp:simplePos x="0" y="0"/>
           <wp:positionH relativeFrom="column">
             <wp:posOffset>6045200</wp:posOffset>
@@ -12281,7 +12547,7 @@
           <wp:extent cx="595630" cy="622935"/>
           <wp:effectExtent l="0" t="0" r="0" b="0"/>
           <wp:wrapNone/>
-          <wp:docPr id="12" name="image4.png"/>
+          <wp:docPr id="13" name="image4.png"/>
           <wp:cNvGraphicFramePr>
             <a:graphicFrameLocks xmlns:a="http://schemas.openxmlformats.org/drawingml/2006/main" noChangeAspect="1"/>
           </wp:cNvGraphicFramePr>
@@ -12289,14 +12555,14 @@
             <a:graphicData uri="http://schemas.openxmlformats.org/drawingml/2006/picture">
               <pic:pic xmlns:pic="http://schemas.openxmlformats.org/drawingml/2006/picture">
                 <pic:nvPicPr>
-                  <pic:cNvPr id="12" name="image4.png"/>
+                  <pic:cNvPr id="13" name="image4.png"/>
                   <pic:cNvPicPr>
                     <a:picLocks noChangeAspect="1" noChangeArrowheads="1"/>
                   </pic:cNvPicPr>
                 </pic:nvPicPr>
                 <pic:blipFill>
                   <a:blip r:embed="rId2"/>
-                  <a:srcRect l="0" t="0" r="60800" b="0"/>
+                  <a:srcRect l="0" t="0" r="60809" b="0"/>
                   <a:stretch>
                     <a:fillRect/>
                   </a:stretch>
@@ -12343,7 +12609,7 @@
         <wp:inline distT="0" distB="0" distL="0" distR="0">
           <wp:extent cx="1190625" cy="190500"/>
           <wp:effectExtent l="0" t="0" r="0" b="0"/>
-          <wp:docPr id="13" name="image1.png"/>
+          <wp:docPr id="14" name="image1.png"/>
           <wp:cNvGraphicFramePr>
             <a:graphicFrameLocks xmlns:a="http://schemas.openxmlformats.org/drawingml/2006/main" noChangeAspect="1"/>
           </wp:cNvGraphicFramePr>
@@ -12351,7 +12617,7 @@
             <a:graphicData uri="http://schemas.openxmlformats.org/drawingml/2006/picture">
               <pic:pic xmlns:pic="http://schemas.openxmlformats.org/drawingml/2006/picture">
                 <pic:nvPicPr>
-                  <pic:cNvPr id="13" name="image1.png"/>
+                  <pic:cNvPr id="14" name="image1.png"/>
                   <pic:cNvPicPr>
                     <a:picLocks noChangeAspect="1" noChangeArrowheads="1"/>
                   </pic:cNvPicPr>
@@ -12379,7 +12645,7 @@
         </wp:inline>
       </w:drawing>
       <w:drawing>
-        <wp:anchor distT="0" distB="0" distL="0" distR="0" simplePos="0" relativeHeight="28" behindDoc="1" locked="0" layoutInCell="1" allowOverlap="1">
+        <wp:anchor distT="0" distB="0" distL="0" distR="0" simplePos="0" relativeHeight="15" behindDoc="1" locked="0" layoutInCell="1" allowOverlap="1">
           <wp:simplePos x="0" y="0"/>
           <wp:positionH relativeFrom="column">
             <wp:posOffset>6045200</wp:posOffset>
@@ -12390,7 +12656,7 @@
           <wp:extent cx="595630" cy="622935"/>
           <wp:effectExtent l="0" t="0" r="0" b="0"/>
           <wp:wrapNone/>
-          <wp:docPr id="14" name="image4.png"/>
+          <wp:docPr id="15" name="image4.png"/>
           <wp:cNvGraphicFramePr>
             <a:graphicFrameLocks xmlns:a="http://schemas.openxmlformats.org/drawingml/2006/main" noChangeAspect="1"/>
           </wp:cNvGraphicFramePr>
@@ -12398,14 +12664,14 @@
             <a:graphicData uri="http://schemas.openxmlformats.org/drawingml/2006/picture">
               <pic:pic xmlns:pic="http://schemas.openxmlformats.org/drawingml/2006/picture">
                 <pic:nvPicPr>
-                  <pic:cNvPr id="14" name="image4.png"/>
+                  <pic:cNvPr id="15" name="image4.png"/>
                   <pic:cNvPicPr>
                     <a:picLocks noChangeAspect="1" noChangeArrowheads="1"/>
                   </pic:cNvPicPr>
                 </pic:nvPicPr>
                 <pic:blipFill>
                   <a:blip r:embed="rId2"/>
-                  <a:srcRect l="0" t="0" r="60800" b="0"/>
+                  <a:srcRect l="0" t="0" r="60809" b="0"/>
                   <a:stretch>
                     <a:fillRect/>
                   </a:stretch>

</xml_diff>